<commit_message>
docs: generar reportes institucionales y estandar de junio 2026
# Conflicts:
#	05-Mayo-Junio/Entregables/2026-06/01-Reporte_Especificaciones_Vida_Saludable_2026-06.docx
#	05-Mayo-Junio/Entregables/2026-06/02-Informe_Optimizacion_Rendimiento_BD_2026-06.docx
#	05-Mayo-Junio/Entregables/2026-06/03-Reporte_Monitoreo_Alertamiento_2026-06.docx
#	05-Mayo-Junio/Entregables/2026-06/04-Reporte_Preparacion_Datos_IA_2026-06.docx
#	05-Mayo-Junio/Entregables/2026-06/05-Informe_Procesos_ETL_ELT_2026-06.docx
#	ACTIVIDADES_2026.code-workspace
</commit_message>
<xml_diff>
--- a/05-Mayo-Junio/Entregables/2026-06/01-Reporte_Especificaciones_Vida_Saludable_2026-06.docx
+++ b/05-Mayo-Junio/Entregables/2026-06/01-Reporte_Especificaciones_Vida_Saludable_2026-06.docx
@@ -111,7 +111,7 @@
           <w:sz w:val="22"/>
           <w:szCs w:val="22"/>
         </w:rPr>
-        <w:pict w14:anchorId="475DF09A">
+        <w:pict w14:anchorId="2FC543CB">
           <v:rect id="_x0000_i1025" style="width:0;height:1.5pt" o:hralign="center" o:hrstd="t" o:hr="t" fillcolor="#a0a0a0" stroked="f"/>
         </w:pict>
       </w:r>
@@ -145,7 +145,21 @@
           <w:sz w:val="22"/>
           <w:szCs w:val="22"/>
         </w:rPr>
-        <w:t>Documentar exclusivamente el avance correspondiente a junio de 2026 sobre el proyecto Vida Saludable, priorizando consolidación de evidencia trimestral, resultados finales por lote, incidencias remanentes, reprocesos, cierre de hallazgos y recomendaciones de continuidad.</w:t>
+        <w:t xml:space="preserve">Este documento presenta el cierre trimestral de las actividades vinculadas al proyecto Vida Saludable, consolidando el estado alcanzado en el repositorio </w:t>
+      </w:r>
+      <w:r>
+        <w:rPr>
+          <w:rStyle w:val="CdigoHTML"/>
+        </w:rPr>
+        <w:t>py-sep-descarga-vida-saludable</w:t>
+      </w:r>
+      <w:r>
+        <w:rPr>
+          <w:rFonts w:ascii="Calibri" w:hAnsi="Calibri" w:cs="Calibri"/>
+          <w:sz w:val="22"/>
+          <w:szCs w:val="22"/>
+        </w:rPr>
+        <w:t>. A partir del 29 de abril de 2026, el proyecto fue colocado en un estado de pausa administrativa ("Migración Validada", "Documentación Completa", "Infraestructura Lista"). Por tanto, el mes de junio certifica la correcta conservación de esta línea base.</w:t>
       </w:r>
     </w:p>
     <w:p>
@@ -159,7 +173,7 @@
         <w:rPr>
           <w:rFonts w:ascii="Calibri" w:eastAsia="Times New Roman" w:hAnsi="Calibri" w:cs="Calibri"/>
         </w:rPr>
-        <w:t>2. Criterio de Separación por Mes</w:t>
+        <w:t>2. Estado Final del Trimestre</w:t>
       </w:r>
     </w:p>
     <w:p>
@@ -177,7 +191,7 @@
           <w:sz w:val="22"/>
           <w:szCs w:val="22"/>
         </w:rPr>
-        <w:t>Este documento corresponde únicamente a junio. Abril debe considerarse como línea base y mayo como antecedente operativo, mientras que junio debe concentrarse en:</w:t>
+        <w:t>Durante junio se validó que la arquitectura y la base de conocimiento se preservan inalteradas y listas para la reactivación:</w:t>
       </w:r>
     </w:p>
     <w:p>
@@ -195,11 +209,20 @@
       </w:pPr>
       <w:r>
         <w:rPr>
-          <w:rFonts w:ascii="Calibri" w:eastAsia="Times New Roman" w:hAnsi="Calibri" w:cs="Calibri"/>
-          <w:sz w:val="22"/>
-          <w:szCs w:val="22"/>
-        </w:rPr>
-        <w:t>consolidación de resultados del trimestre;</w:t>
+          <w:rStyle w:val="Fuerte"/>
+          <w:rFonts w:ascii="Calibri" w:eastAsia="Times New Roman" w:hAnsi="Calibri" w:cs="Calibri"/>
+          <w:sz w:val="22"/>
+          <w:szCs w:val="22"/>
+        </w:rPr>
+        <w:t>Infraestructura:</w:t>
+      </w:r>
+      <w:r>
+        <w:rPr>
+          <w:rFonts w:ascii="Calibri" w:eastAsia="Times New Roman" w:hAnsi="Calibri" w:cs="Calibri"/>
+          <w:sz w:val="22"/>
+          <w:szCs w:val="22"/>
+        </w:rPr>
+        <w:t xml:space="preserve"> Backend modularizado (FastAPI, pg8000 puro, Strawberry) y Frontend (Angular 18, Apollo Client) preparados en sus entornos de desarrollo.</w:t>
       </w:r>
     </w:p>
     <w:p>
@@ -217,11 +240,20 @@
       </w:pPr>
       <w:r>
         <w:rPr>
-          <w:rFonts w:ascii="Calibri" w:eastAsia="Times New Roman" w:hAnsi="Calibri" w:cs="Calibri"/>
-          <w:sz w:val="22"/>
-          <w:szCs w:val="22"/>
-        </w:rPr>
-        <w:t>incidencias, reprocesos o ajustes aún abiertos al cierre de junio;</w:t>
+          <w:rStyle w:val="Fuerte"/>
+          <w:rFonts w:ascii="Calibri" w:eastAsia="Times New Roman" w:hAnsi="Calibri" w:cs="Calibri"/>
+          <w:sz w:val="22"/>
+          <w:szCs w:val="22"/>
+        </w:rPr>
+        <w:t>Base de Datos:</w:t>
+      </w:r>
+      <w:r>
+        <w:rPr>
+          <w:rFonts w:ascii="Calibri" w:eastAsia="Times New Roman" w:hAnsi="Calibri" w:cs="Calibri"/>
+          <w:sz w:val="22"/>
+          <w:szCs w:val="22"/>
+        </w:rPr>
+        <w:t xml:space="preserve"> Estructura de tablas para PostgreSQL 14 segregada correctamente (IMSS vs IMSS-Bienestar).</w:t>
       </w:r>
     </w:p>
     <w:p>
@@ -239,51 +271,38 @@
       </w:pPr>
       <w:r>
         <w:rPr>
-          <w:rFonts w:ascii="Calibri" w:eastAsia="Times New Roman" w:hAnsi="Calibri" w:cs="Calibri"/>
-          <w:sz w:val="22"/>
-          <w:szCs w:val="22"/>
-        </w:rPr>
-        <w:t>evidencia final producida durante junio;</w:t>
+          <w:rStyle w:val="Fuerte"/>
+          <w:rFonts w:ascii="Calibri" w:eastAsia="Times New Roman" w:hAnsi="Calibri" w:cs="Calibri"/>
+          <w:sz w:val="22"/>
+          <w:szCs w:val="22"/>
+        </w:rPr>
+        <w:t>Seguridad:</w:t>
+      </w:r>
+      <w:r>
+        <w:rPr>
+          <w:rFonts w:ascii="Calibri" w:eastAsia="Times New Roman" w:hAnsi="Calibri" w:cs="Calibri"/>
+          <w:sz w:val="22"/>
+          <w:szCs w:val="22"/>
+        </w:rPr>
+        <w:t xml:space="preserve"> Cierre del incidente de datos sensibles en historial (17 de abril) certificado como resuelto de manera permanente.</w:t>
       </w:r>
     </w:p>
     <w:p>
       <w:pPr>
-        <w:numPr>
-          <w:ilvl w:val="0"/>
-          <w:numId w:val="1"/>
-        </w:numPr>
-        <w:spacing w:before="100" w:beforeAutospacing="1" w:after="100" w:afterAutospacing="1"/>
-        <w:rPr>
-          <w:rFonts w:ascii="Calibri" w:eastAsia="Times New Roman" w:hAnsi="Calibri" w:cs="Calibri"/>
-          <w:sz w:val="22"/>
-          <w:szCs w:val="22"/>
-        </w:rPr>
-      </w:pPr>
-      <w:r>
-        <w:rPr>
-          <w:rFonts w:ascii="Calibri" w:eastAsia="Times New Roman" w:hAnsi="Calibri" w:cs="Calibri"/>
-          <w:sz w:val="22"/>
-          <w:szCs w:val="22"/>
-        </w:rPr>
-        <w:t>conclusiones y acciones posteriores al corte trimestral.</w:t>
+        <w:pStyle w:val="Ttulo2"/>
+        <w:rPr>
+          <w:rFonts w:ascii="Calibri" w:eastAsia="Times New Roman" w:hAnsi="Calibri" w:cs="Calibri"/>
+        </w:rPr>
+      </w:pPr>
+      <w:r>
+        <w:rPr>
+          <w:rFonts w:ascii="Calibri" w:eastAsia="Times New Roman" w:hAnsi="Calibri" w:cs="Calibri"/>
+        </w:rPr>
+        <w:t>3. Evidencia Consolidada</w:t>
       </w:r>
     </w:p>
     <w:p>
       <w:pPr>
-        <w:pStyle w:val="Ttulo2"/>
-        <w:rPr>
-          <w:rFonts w:ascii="Calibri" w:eastAsia="Times New Roman" w:hAnsi="Calibri" w:cs="Calibri"/>
-        </w:rPr>
-      </w:pPr>
-      <w:r>
-        <w:rPr>
-          <w:rFonts w:ascii="Calibri" w:eastAsia="Times New Roman" w:hAnsi="Calibri" w:cs="Calibri"/>
-        </w:rPr>
-        <w:t>3. Enfoque de Trabajo para Junio</w:t>
-      </w:r>
-    </w:p>
-    <w:p>
-      <w:pPr>
         <w:pStyle w:val="NormalWeb"/>
         <w:rPr>
           <w:rFonts w:ascii="Calibri" w:hAnsi="Calibri" w:cs="Calibri"/>
@@ -297,167 +316,7 @@
           <w:sz w:val="22"/>
           <w:szCs w:val="22"/>
         </w:rPr>
-        <w:t>Durante junio el seguimiento del proyecto Vida Saludable deberá centrarse en consolidar el cierre trimestral sobre:</w:t>
-      </w:r>
-    </w:p>
-    <w:p>
-      <w:pPr>
-        <w:numPr>
-          <w:ilvl w:val="0"/>
-          <w:numId w:val="2"/>
-        </w:numPr>
-        <w:spacing w:before="100" w:beforeAutospacing="1" w:after="100" w:afterAutospacing="1"/>
-        <w:rPr>
-          <w:rFonts w:ascii="Calibri" w:eastAsia="Times New Roman" w:hAnsi="Calibri" w:cs="Calibri"/>
-          <w:sz w:val="22"/>
-          <w:szCs w:val="22"/>
-        </w:rPr>
-      </w:pPr>
-      <w:r>
-        <w:rPr>
-          <w:rFonts w:ascii="Calibri" w:eastAsia="Times New Roman" w:hAnsi="Calibri" w:cs="Calibri"/>
-          <w:sz w:val="22"/>
-          <w:szCs w:val="22"/>
-        </w:rPr>
-        <w:t>registro y ejecución de lotes;</w:t>
-      </w:r>
-    </w:p>
-    <w:p>
-      <w:pPr>
-        <w:numPr>
-          <w:ilvl w:val="0"/>
-          <w:numId w:val="2"/>
-        </w:numPr>
-        <w:spacing w:before="100" w:beforeAutospacing="1" w:after="100" w:afterAutospacing="1"/>
-        <w:rPr>
-          <w:rFonts w:ascii="Calibri" w:eastAsia="Times New Roman" w:hAnsi="Calibri" w:cs="Calibri"/>
-          <w:sz w:val="22"/>
-          <w:szCs w:val="22"/>
-        </w:rPr>
-      </w:pPr>
-      <w:r>
-        <w:rPr>
-          <w:rFonts w:ascii="Calibri" w:eastAsia="Times New Roman" w:hAnsi="Calibri" w:cs="Calibri"/>
-          <w:sz w:val="22"/>
-          <w:szCs w:val="22"/>
-        </w:rPr>
-        <w:t>resultados por CURP procesada;</w:t>
-      </w:r>
-    </w:p>
-    <w:p>
-      <w:pPr>
-        <w:numPr>
-          <w:ilvl w:val="0"/>
-          <w:numId w:val="2"/>
-        </w:numPr>
-        <w:spacing w:before="100" w:beforeAutospacing="1" w:after="100" w:afterAutospacing="1"/>
-        <w:rPr>
-          <w:rFonts w:ascii="Calibri" w:eastAsia="Times New Roman" w:hAnsi="Calibri" w:cs="Calibri"/>
-          <w:sz w:val="22"/>
-          <w:szCs w:val="22"/>
-        </w:rPr>
-      </w:pPr>
-      <w:r>
-        <w:rPr>
-          <w:rFonts w:ascii="Calibri" w:eastAsia="Times New Roman" w:hAnsi="Calibri" w:cs="Calibri"/>
-          <w:sz w:val="22"/>
-          <w:szCs w:val="22"/>
-        </w:rPr>
-        <w:t>generación de PDFs y validación de rutas;</w:t>
-      </w:r>
-    </w:p>
-    <w:p>
-      <w:pPr>
-        <w:numPr>
-          <w:ilvl w:val="0"/>
-          <w:numId w:val="2"/>
-        </w:numPr>
-        <w:spacing w:before="100" w:beforeAutospacing="1" w:after="100" w:afterAutospacing="1"/>
-        <w:rPr>
-          <w:rFonts w:ascii="Calibri" w:eastAsia="Times New Roman" w:hAnsi="Calibri" w:cs="Calibri"/>
-          <w:sz w:val="22"/>
-          <w:szCs w:val="22"/>
-        </w:rPr>
-      </w:pPr>
-      <w:r>
-        <w:rPr>
-          <w:rFonts w:ascii="Calibri" w:eastAsia="Times New Roman" w:hAnsi="Calibri" w:cs="Calibri"/>
-          <w:sz w:val="22"/>
-          <w:szCs w:val="22"/>
-        </w:rPr>
-        <w:t>comportamiento de bitácoras y trazabilidad;</w:t>
-      </w:r>
-    </w:p>
-    <w:p>
-      <w:pPr>
-        <w:numPr>
-          <w:ilvl w:val="0"/>
-          <w:numId w:val="2"/>
-        </w:numPr>
-        <w:spacing w:before="100" w:beforeAutospacing="1" w:after="100" w:afterAutospacing="1"/>
-        <w:rPr>
-          <w:rFonts w:ascii="Calibri" w:eastAsia="Times New Roman" w:hAnsi="Calibri" w:cs="Calibri"/>
-          <w:sz w:val="22"/>
-          <w:szCs w:val="22"/>
-        </w:rPr>
-      </w:pPr>
-      <w:r>
-        <w:rPr>
-          <w:rFonts w:ascii="Calibri" w:eastAsia="Times New Roman" w:hAnsi="Calibri" w:cs="Calibri"/>
-          <w:sz w:val="22"/>
-          <w:szCs w:val="22"/>
-        </w:rPr>
-        <w:t>reprocesos, reanudaciones y tratamiento de incidencias;</w:t>
-      </w:r>
-    </w:p>
-    <w:p>
-      <w:pPr>
-        <w:numPr>
-          <w:ilvl w:val="0"/>
-          <w:numId w:val="2"/>
-        </w:numPr>
-        <w:spacing w:before="100" w:beforeAutospacing="1" w:after="100" w:afterAutospacing="1"/>
-        <w:rPr>
-          <w:rFonts w:ascii="Calibri" w:eastAsia="Times New Roman" w:hAnsi="Calibri" w:cs="Calibri"/>
-          <w:sz w:val="22"/>
-          <w:szCs w:val="22"/>
-        </w:rPr>
-      </w:pPr>
-      <w:r>
-        <w:rPr>
-          <w:rFonts w:ascii="Calibri" w:eastAsia="Times New Roman" w:hAnsi="Calibri" w:cs="Calibri"/>
-          <w:sz w:val="22"/>
-          <w:szCs w:val="22"/>
-        </w:rPr>
-        <w:t xml:space="preserve">avances reales sobre la etapa posterior a </w:t>
-      </w:r>
-      <w:r>
-        <w:rPr>
-          <w:rStyle w:val="CdigoHTML"/>
-        </w:rPr>
-        <w:t>sin-carta</w:t>
-      </w:r>
-      <w:r>
-        <w:rPr>
-          <w:rFonts w:ascii="Calibri" w:eastAsia="Times New Roman" w:hAnsi="Calibri" w:cs="Calibri"/>
-          <w:sz w:val="22"/>
-          <w:szCs w:val="22"/>
-        </w:rPr>
-        <w:t>, cuando existan.</w:t>
-      </w:r>
-    </w:p>
-    <w:p>
-      <w:pPr>
-        <w:pStyle w:val="Ttulo2"/>
-        <w:rPr>
-          <w:rFonts w:ascii="Calibri" w:eastAsia="Times New Roman" w:hAnsi="Calibri" w:cs="Calibri"/>
-        </w:rPr>
-      </w:pPr>
-      <w:r>
-        <w:rPr>
-          <w:rFonts w:ascii="Calibri" w:eastAsia="Times New Roman" w:hAnsi="Calibri" w:cs="Calibri"/>
-        </w:rPr>
-        <w:t>4. Evidencia Esperada para Junio</w:t>
+        <w:t>Debido al estatus de pausa, no hubo procesamiento de lotes ni generación física de PDFs durante mayo y junio. La evidencia se documenta como el resguardo de la arquitectura aprobada:</w:t>
       </w:r>
     </w:p>
     <w:tbl>
@@ -472,8 +331,8 @@
         <w:tblLook w:val="04A0" w:firstRow="1" w:lastRow="0" w:firstColumn="1" w:lastColumn="0" w:noHBand="0" w:noVBand="1"/>
       </w:tblPr>
       <w:tblGrid>
-        <w:gridCol w:w="2083"/>
-        <w:gridCol w:w="6739"/>
+        <w:gridCol w:w="1654"/>
+        <w:gridCol w:w="7168"/>
       </w:tblGrid>
       <w:tr>
         <w:trPr>
@@ -515,7 +374,6 @@
                 <w:sz w:val="22"/>
                 <w:szCs w:val="22"/>
               </w:rPr>
-              <w:lastRenderedPageBreak/>
               <w:t>Rubro</w:t>
             </w:r>
           </w:p>
@@ -556,7 +414,7 @@
                 <w:sz w:val="22"/>
                 <w:szCs w:val="22"/>
               </w:rPr>
-              <w:t>Evidencia esperada</w:t>
+              <w:t>Evidencia observada al corte de junio</w:t>
             </w:r>
           </w:p>
         </w:tc>
@@ -590,6 +448,7 @@
             </w:pPr>
             <w:r>
               <w:rPr>
+                <w:rStyle w:val="Fuerte"/>
                 <w:rFonts w:ascii="Calibri" w:eastAsia="Times New Roman" w:hAnsi="Calibri" w:cs="Calibri"/>
                 <w:sz w:val="22"/>
                 <w:szCs w:val="22"/>
@@ -630,7 +489,7 @@
                 <w:sz w:val="22"/>
                 <w:szCs w:val="22"/>
               </w:rPr>
-              <w:t>Identificador, entidad, fecha, criterio y estado final</w:t>
+              <w:t>El sistema orquestador se encuentra pausado y estructurado para su primer *Sprint de Construcción*.</w:t>
             </w:r>
           </w:p>
         </w:tc>
@@ -664,10 +523,12 @@
             </w:pPr>
             <w:r>
               <w:rPr>
+                <w:rStyle w:val="Fuerte"/>
                 <w:rFonts w:ascii="Calibri" w:eastAsia="Times New Roman" w:hAnsi="Calibri" w:cs="Calibri"/>
                 <w:sz w:val="22"/>
                 <w:szCs w:val="22"/>
               </w:rPr>
+              <w:lastRenderedPageBreak/>
               <w:t>Procesamiento</w:t>
             </w:r>
           </w:p>
@@ -704,7 +565,15 @@
                 <w:sz w:val="22"/>
                 <w:szCs w:val="22"/>
               </w:rPr>
-              <w:t>Total de CURP intentadas, exitosas y fallidas</w:t>
+              <w:t>Core de Autenticació</w:t>
+            </w:r>
+            <w:r>
+              <w:rPr>
+                <w:rFonts w:ascii="Calibri" w:eastAsia="Times New Roman" w:hAnsi="Calibri" w:cs="Calibri"/>
+                <w:sz w:val="22"/>
+                <w:szCs w:val="22"/>
+              </w:rPr>
+              <w:t>n (JWT + SFTP Keys) completamente validado. SLA de descarga configurado (&lt; 10 segundos).</w:t>
             </w:r>
           </w:p>
         </w:tc>
@@ -738,80 +607,7 @@
             </w:pPr>
             <w:r>
               <w:rPr>
-                <w:rFonts w:ascii="Calibri" w:eastAsia="Times New Roman" w:hAnsi="Calibri" w:cs="Calibri"/>
-                <w:sz w:val="22"/>
-                <w:szCs w:val="22"/>
-              </w:rPr>
-              <w:t>Descargas PDF</w:t>
-            </w:r>
-          </w:p>
-        </w:tc>
-        <w:tc>
-          <w:tcPr>
-            <w:tcW w:w="0" w:type="auto"/>
-            <w:tcBorders>
-              <w:top w:val="single" w:sz="6" w:space="0" w:color="666666"/>
-              <w:left w:val="single" w:sz="6" w:space="0" w:color="666666"/>
-              <w:bottom w:val="single" w:sz="6" w:space="0" w:color="666666"/>
-              <w:right w:val="single" w:sz="6" w:space="0" w:color="666666"/>
-            </w:tcBorders>
-            <w:tcMar>
-              <w:top w:w="90" w:type="dxa"/>
-              <w:left w:w="90" w:type="dxa"/>
-              <w:bottom w:w="90" w:type="dxa"/>
-              <w:right w:w="90" w:type="dxa"/>
-            </w:tcMar>
-            <w:hideMark/>
-          </w:tcPr>
-          <w:p>
-            <w:pPr>
-              <w:spacing w:before="180" w:after="180"/>
-              <w:rPr>
-                <w:rFonts w:ascii="Calibri" w:eastAsia="Times New Roman" w:hAnsi="Calibri" w:cs="Calibri"/>
-                <w:sz w:val="22"/>
-                <w:szCs w:val="22"/>
-              </w:rPr>
-            </w:pPr>
-            <w:r>
-              <w:rPr>
-                <w:rFonts w:ascii="Calibri" w:eastAsia="Times New Roman" w:hAnsi="Calibri" w:cs="Calibri"/>
-                <w:sz w:val="22"/>
-                <w:szCs w:val="22"/>
-              </w:rPr>
-              <w:t>Validación de existencia, rutas y consistencia con BD</w:t>
-            </w:r>
-          </w:p>
-        </w:tc>
-      </w:tr>
-      <w:tr>
-        <w:tc>
-          <w:tcPr>
-            <w:tcW w:w="0" w:type="auto"/>
-            <w:tcBorders>
-              <w:top w:val="single" w:sz="6" w:space="0" w:color="666666"/>
-              <w:left w:val="single" w:sz="6" w:space="0" w:color="666666"/>
-              <w:bottom w:val="single" w:sz="6" w:space="0" w:color="666666"/>
-              <w:right w:val="single" w:sz="6" w:space="0" w:color="666666"/>
-            </w:tcBorders>
-            <w:tcMar>
-              <w:top w:w="90" w:type="dxa"/>
-              <w:left w:w="90" w:type="dxa"/>
-              <w:bottom w:w="90" w:type="dxa"/>
-              <w:right w:w="90" w:type="dxa"/>
-            </w:tcMar>
-            <w:hideMark/>
-          </w:tcPr>
-          <w:p>
-            <w:pPr>
-              <w:spacing w:before="180" w:after="180"/>
-              <w:rPr>
-                <w:rFonts w:ascii="Calibri" w:eastAsia="Times New Roman" w:hAnsi="Calibri" w:cs="Calibri"/>
-                <w:sz w:val="22"/>
-                <w:szCs w:val="22"/>
-              </w:rPr>
-            </w:pPr>
-            <w:r>
-              <w:rPr>
+                <w:rStyle w:val="Fuerte"/>
                 <w:rFonts w:ascii="Calibri" w:eastAsia="Times New Roman" w:hAnsi="Calibri" w:cs="Calibri"/>
                 <w:sz w:val="22"/>
                 <w:szCs w:val="22"/>
@@ -852,155 +648,21 @@
                 <w:sz w:val="22"/>
                 <w:szCs w:val="22"/>
               </w:rPr>
-              <w:t>Mensajes relevantes por evento o incidencia</w:t>
+              <w:t xml:space="preserve">Archivo </w:t>
             </w:r>
-          </w:p>
-        </w:tc>
-      </w:tr>
-      <w:tr>
-        <w:tc>
-          <w:tcPr>
-            <w:tcW w:w="0" w:type="auto"/>
-            <w:tcBorders>
-              <w:top w:val="single" w:sz="6" w:space="0" w:color="666666"/>
-              <w:left w:val="single" w:sz="6" w:space="0" w:color="666666"/>
-              <w:bottom w:val="single" w:sz="6" w:space="0" w:color="666666"/>
-              <w:right w:val="single" w:sz="6" w:space="0" w:color="666666"/>
-            </w:tcBorders>
-            <w:tcMar>
-              <w:top w:w="90" w:type="dxa"/>
-              <w:left w:w="90" w:type="dxa"/>
-              <w:bottom w:w="90" w:type="dxa"/>
-              <w:right w:w="90" w:type="dxa"/>
-            </w:tcMar>
-            <w:hideMark/>
-          </w:tcPr>
-          <w:p>
-            <w:pPr>
-              <w:spacing w:before="180" w:after="180"/>
+            <w:r>
               <w:rPr>
-                <w:rFonts w:ascii="Calibri" w:eastAsia="Times New Roman" w:hAnsi="Calibri" w:cs="Calibri"/>
-                <w:sz w:val="22"/>
-                <w:szCs w:val="22"/>
+                <w:rStyle w:val="CdigoHTML"/>
               </w:rPr>
-            </w:pPr>
+              <w:t>RESUMEN-PAUSA-PROYECTO.md</w:t>
+            </w:r>
             <w:r>
               <w:rPr>
                 <w:rFonts w:ascii="Calibri" w:eastAsia="Times New Roman" w:hAnsi="Calibri" w:cs="Calibri"/>
                 <w:sz w:val="22"/>
                 <w:szCs w:val="22"/>
               </w:rPr>
-              <w:t>Reproceso</w:t>
-            </w:r>
-          </w:p>
-        </w:tc>
-        <w:tc>
-          <w:tcPr>
-            <w:tcW w:w="0" w:type="auto"/>
-            <w:tcBorders>
-              <w:top w:val="single" w:sz="6" w:space="0" w:color="666666"/>
-              <w:left w:val="single" w:sz="6" w:space="0" w:color="666666"/>
-              <w:bottom w:val="single" w:sz="6" w:space="0" w:color="666666"/>
-              <w:right w:val="single" w:sz="6" w:space="0" w:color="666666"/>
-            </w:tcBorders>
-            <w:tcMar>
-              <w:top w:w="90" w:type="dxa"/>
-              <w:left w:w="90" w:type="dxa"/>
-              <w:bottom w:w="90" w:type="dxa"/>
-              <w:right w:w="90" w:type="dxa"/>
-            </w:tcMar>
-            <w:hideMark/>
-          </w:tcPr>
-          <w:p>
-            <w:pPr>
-              <w:spacing w:before="180" w:after="180"/>
-              <w:rPr>
-                <w:rFonts w:ascii="Calibri" w:eastAsia="Times New Roman" w:hAnsi="Calibri" w:cs="Calibri"/>
-                <w:sz w:val="22"/>
-                <w:szCs w:val="22"/>
-              </w:rPr>
-            </w:pPr>
-            <w:r>
-              <w:rPr>
-                <w:rFonts w:ascii="Calibri" w:eastAsia="Times New Roman" w:hAnsi="Calibri" w:cs="Calibri"/>
-                <w:sz w:val="22"/>
-                <w:szCs w:val="22"/>
-              </w:rPr>
-              <w:t>Registros recuperados, fallos persistentes y causa probable</w:t>
-            </w:r>
-          </w:p>
-        </w:tc>
-      </w:tr>
-      <w:tr>
-        <w:tc>
-          <w:tcPr>
-            <w:tcW w:w="0" w:type="auto"/>
-            <w:tcBorders>
-              <w:top w:val="single" w:sz="6" w:space="0" w:color="666666"/>
-              <w:left w:val="single" w:sz="6" w:space="0" w:color="666666"/>
-              <w:bottom w:val="single" w:sz="6" w:space="0" w:color="666666"/>
-              <w:right w:val="single" w:sz="6" w:space="0" w:color="666666"/>
-            </w:tcBorders>
-            <w:tcMar>
-              <w:top w:w="90" w:type="dxa"/>
-              <w:left w:w="90" w:type="dxa"/>
-              <w:bottom w:w="90" w:type="dxa"/>
-              <w:right w:w="90" w:type="dxa"/>
-            </w:tcMar>
-            <w:hideMark/>
-          </w:tcPr>
-          <w:p>
-            <w:pPr>
-              <w:spacing w:before="180" w:after="180"/>
-              <w:rPr>
-                <w:rFonts w:ascii="Calibri" w:eastAsia="Times New Roman" w:hAnsi="Calibri" w:cs="Calibri"/>
-                <w:sz w:val="22"/>
-                <w:szCs w:val="22"/>
-              </w:rPr>
-            </w:pPr>
-            <w:r>
-              <w:rPr>
-                <w:rFonts w:ascii="Calibri" w:eastAsia="Times New Roman" w:hAnsi="Calibri" w:cs="Calibri"/>
-                <w:sz w:val="22"/>
-                <w:szCs w:val="22"/>
-              </w:rPr>
-              <w:t>Etapa de cartas</w:t>
-            </w:r>
-          </w:p>
-        </w:tc>
-        <w:tc>
-          <w:tcPr>
-            <w:tcW w:w="0" w:type="auto"/>
-            <w:tcBorders>
-              <w:top w:val="single" w:sz="6" w:space="0" w:color="666666"/>
-              <w:left w:val="single" w:sz="6" w:space="0" w:color="666666"/>
-              <w:bottom w:val="single" w:sz="6" w:space="0" w:color="666666"/>
-              <w:right w:val="single" w:sz="6" w:space="0" w:color="666666"/>
-            </w:tcBorders>
-            <w:tcMar>
-              <w:top w:w="90" w:type="dxa"/>
-              <w:left w:w="90" w:type="dxa"/>
-              <w:bottom w:w="90" w:type="dxa"/>
-              <w:right w:w="90" w:type="dxa"/>
-            </w:tcMar>
-            <w:hideMark/>
-          </w:tcPr>
-          <w:p>
-            <w:pPr>
-              <w:spacing w:before="180" w:after="180"/>
-              <w:rPr>
-                <w:rFonts w:ascii="Calibri" w:eastAsia="Times New Roman" w:hAnsi="Calibri" w:cs="Calibri"/>
-                <w:sz w:val="22"/>
-                <w:szCs w:val="22"/>
-              </w:rPr>
-            </w:pPr>
-            <w:r>
-              <w:rPr>
-                <w:rFonts w:ascii="Calibri" w:eastAsia="Times New Roman" w:hAnsi="Calibri" w:cs="Calibri"/>
-                <w:sz w:val="22"/>
-                <w:szCs w:val="22"/>
-              </w:rPr>
-              <w:t>Avance funcional o aclaración de dependencia pendiente</w:t>
+              <w:t xml:space="preserve"> integrado como testigo histórico del avance hasta abril.</w:t>
             </w:r>
           </w:p>
         </w:tc>
@@ -1017,206 +679,73 @@
         <w:rPr>
           <w:rFonts w:ascii="Calibri" w:eastAsia="Times New Roman" w:hAnsi="Calibri" w:cs="Calibri"/>
         </w:rPr>
-        <w:t>5. Secciones a Completar en Junio</w:t>
+        <w:t>4. Riesgos y Dependencias al Cierre de Junio</w:t>
       </w:r>
     </w:p>
     <w:p>
       <w:pPr>
-        <w:pStyle w:val="Ttulo3"/>
-        <w:rPr>
-          <w:rFonts w:ascii="Calibri" w:eastAsia="Times New Roman" w:hAnsi="Calibri" w:cs="Calibri"/>
-        </w:rPr>
-      </w:pPr>
-      <w:r>
-        <w:rPr>
-          <w:rFonts w:ascii="Calibri" w:eastAsia="Times New Roman" w:hAnsi="Calibri" w:cs="Calibri"/>
-        </w:rPr>
-        <w:t>5.1 Ejecuciones o pruebas del mes</w:t>
+        <w:numPr>
+          <w:ilvl w:val="0"/>
+          <w:numId w:val="2"/>
+        </w:numPr>
+        <w:spacing w:before="100" w:beforeAutospacing="1" w:after="100" w:afterAutospacing="1"/>
+        <w:rPr>
+          <w:rFonts w:ascii="Calibri" w:eastAsia="Times New Roman" w:hAnsi="Calibri" w:cs="Calibri"/>
+          <w:sz w:val="22"/>
+          <w:szCs w:val="22"/>
+        </w:rPr>
+      </w:pPr>
+      <w:r>
+        <w:rPr>
+          <w:rStyle w:val="Fuerte"/>
+          <w:rFonts w:ascii="Calibri" w:eastAsia="Times New Roman" w:hAnsi="Calibri" w:cs="Calibri"/>
+          <w:sz w:val="22"/>
+          <w:szCs w:val="22"/>
+        </w:rPr>
+        <w:t>Dependencia:</w:t>
+      </w:r>
+      <w:r>
+        <w:rPr>
+          <w:rFonts w:ascii="Calibri" w:eastAsia="Times New Roman" w:hAnsi="Calibri" w:cs="Calibri"/>
+          <w:sz w:val="22"/>
+          <w:szCs w:val="22"/>
+        </w:rPr>
+        <w:t xml:space="preserve"> El reinicio de la operación de procesamiento masivo por CURP y descarga del IMSS depende de la validación final de *Layouts* con el área médica.</w:t>
       </w:r>
     </w:p>
     <w:p>
       <w:pPr>
-        <w:pStyle w:val="NormalWeb"/>
-        <w:rPr>
-          <w:rFonts w:ascii="Calibri" w:hAnsi="Calibri" w:cs="Calibri"/>
-          <w:sz w:val="22"/>
-          <w:szCs w:val="22"/>
-        </w:rPr>
-      </w:pPr>
-      <w:r>
-        <w:rPr>
-          <w:rFonts w:ascii="Calibri" w:hAnsi="Calibri" w:cs="Calibri"/>
-          <w:sz w:val="22"/>
-          <w:szCs w:val="22"/>
-        </w:rPr>
-        <w:t>Registrar solo corridas, pruebas o cierres documentados en junio, indicando alcance, entidad, propósito y resultado general.</w:t>
+        <w:numPr>
+          <w:ilvl w:val="0"/>
+          <w:numId w:val="2"/>
+        </w:numPr>
+        <w:spacing w:before="100" w:beforeAutospacing="1" w:after="100" w:afterAutospacing="1"/>
+        <w:rPr>
+          <w:rFonts w:ascii="Calibri" w:eastAsia="Times New Roman" w:hAnsi="Calibri" w:cs="Calibri"/>
+          <w:sz w:val="22"/>
+          <w:szCs w:val="22"/>
+        </w:rPr>
+      </w:pPr>
+      <w:r>
+        <w:rPr>
+          <w:rStyle w:val="Fuerte"/>
+          <w:rFonts w:ascii="Calibri" w:eastAsia="Times New Roman" w:hAnsi="Calibri" w:cs="Calibri"/>
+          <w:sz w:val="22"/>
+          <w:szCs w:val="22"/>
+        </w:rPr>
+        <w:t>Riesgo:</w:t>
+      </w:r>
+      <w:r>
+        <w:rPr>
+          <w:rFonts w:ascii="Calibri" w:eastAsia="Times New Roman" w:hAnsi="Calibri" w:cs="Calibri"/>
+          <w:sz w:val="22"/>
+          <w:szCs w:val="22"/>
+        </w:rPr>
+        <w:t xml:space="preserve"> El tiempo de pausa prolongada podría implicar actualizaciones obligatorias en dependencias de Angular o Python al momento de retomarse.</w:t>
       </w:r>
     </w:p>
     <w:p>
       <w:pPr>
-        <w:pStyle w:val="Ttulo3"/>
-        <w:rPr>
-          <w:rFonts w:ascii="Calibri" w:eastAsia="Times New Roman" w:hAnsi="Calibri" w:cs="Calibri"/>
-        </w:rPr>
-      </w:pPr>
-      <w:r>
-        <w:rPr>
-          <w:rFonts w:ascii="Calibri" w:eastAsia="Times New Roman" w:hAnsi="Calibri" w:cs="Calibri"/>
-        </w:rPr>
-        <w:t>5.2 Resultados operativos observados</w:t>
-      </w:r>
-    </w:p>
-    <w:p>
-      <w:pPr>
-        <w:pStyle w:val="NormalWeb"/>
-        <w:rPr>
-          <w:rFonts w:ascii="Calibri" w:hAnsi="Calibri" w:cs="Calibri"/>
-          <w:sz w:val="22"/>
-          <w:szCs w:val="22"/>
-        </w:rPr>
-      </w:pPr>
-      <w:r>
-        <w:rPr>
-          <w:rFonts w:ascii="Calibri" w:hAnsi="Calibri" w:cs="Calibri"/>
-          <w:sz w:val="22"/>
-          <w:szCs w:val="22"/>
-        </w:rPr>
-        <w:t>Incorporar métricas del mes sobre lotes, CURP procesadas, descargas exitosas, fallos, reintentos y reprocesos.</w:t>
-      </w:r>
-    </w:p>
-    <w:p>
-      <w:pPr>
-        <w:pStyle w:val="Ttulo3"/>
-        <w:rPr>
-          <w:rFonts w:ascii="Calibri" w:eastAsia="Times New Roman" w:hAnsi="Calibri" w:cs="Calibri"/>
-        </w:rPr>
-      </w:pPr>
-      <w:r>
-        <w:rPr>
-          <w:rFonts w:ascii="Calibri" w:eastAsia="Times New Roman" w:hAnsi="Calibri" w:cs="Calibri"/>
-        </w:rPr>
-        <w:t>5.3 Validaciones de consistencia</w:t>
-      </w:r>
-    </w:p>
-    <w:p>
-      <w:pPr>
-        <w:pStyle w:val="NormalWeb"/>
-        <w:rPr>
-          <w:rFonts w:ascii="Calibri" w:hAnsi="Calibri" w:cs="Calibri"/>
-          <w:sz w:val="22"/>
-          <w:szCs w:val="22"/>
-        </w:rPr>
-      </w:pPr>
-      <w:r>
-        <w:rPr>
-          <w:rFonts w:ascii="Calibri" w:hAnsi="Calibri" w:cs="Calibri"/>
-          <w:sz w:val="22"/>
-          <w:szCs w:val="22"/>
-        </w:rPr>
-        <w:t xml:space="preserve">Documentar verificaciones entre lotes, registros en </w:t>
-      </w:r>
-      <w:r>
-        <w:rPr>
-          <w:rStyle w:val="CdigoHTML"/>
-        </w:rPr>
-        <w:t>CurpProcesada</w:t>
-      </w:r>
-      <w:r>
-        <w:rPr>
-          <w:rFonts w:ascii="Calibri" w:hAnsi="Calibri" w:cs="Calibri"/>
-          <w:sz w:val="22"/>
-          <w:szCs w:val="22"/>
-        </w:rPr>
-        <w:t xml:space="preserve">, eventos en </w:t>
-      </w:r>
-      <w:r>
-        <w:rPr>
-          <w:rStyle w:val="CdigoHTML"/>
-        </w:rPr>
-        <w:t>BitacoraEvento</w:t>
-      </w:r>
-      <w:r>
-        <w:rPr>
-          <w:rFonts w:ascii="Calibri" w:hAnsi="Calibri" w:cs="Calibri"/>
-          <w:sz w:val="22"/>
-          <w:szCs w:val="22"/>
-        </w:rPr>
-        <w:t xml:space="preserve"> y archivos PDF generados.</w:t>
-      </w:r>
-    </w:p>
-    <w:p>
-      <w:pPr>
-        <w:pStyle w:val="Ttulo3"/>
-        <w:rPr>
-          <w:rFonts w:ascii="Calibri" w:eastAsia="Times New Roman" w:hAnsi="Calibri" w:cs="Calibri"/>
-        </w:rPr>
-      </w:pPr>
-      <w:r>
-        <w:rPr>
-          <w:rFonts w:ascii="Calibri" w:eastAsia="Times New Roman" w:hAnsi="Calibri" w:cs="Calibri"/>
-        </w:rPr>
-        <w:t>5.4 Incidencias del mes</w:t>
-      </w:r>
-    </w:p>
-    <w:p>
-      <w:pPr>
-        <w:pStyle w:val="NormalWeb"/>
-        <w:rPr>
-          <w:rFonts w:ascii="Calibri" w:hAnsi="Calibri" w:cs="Calibri"/>
-          <w:sz w:val="22"/>
-          <w:szCs w:val="22"/>
-        </w:rPr>
-      </w:pPr>
-      <w:r>
-        <w:rPr>
-          <w:rFonts w:ascii="Calibri" w:hAnsi="Calibri" w:cs="Calibri"/>
-          <w:sz w:val="22"/>
-          <w:szCs w:val="22"/>
-        </w:rPr>
-        <w:t>Registrar incidencias reales de junio, diferenciando entre errores de datos, conectividad, servicio externo, operación concurrente o trazabilidad incompleta.</w:t>
-      </w:r>
-    </w:p>
-    <w:p>
-      <w:pPr>
-        <w:pStyle w:val="Ttulo3"/>
-        <w:rPr>
-          <w:rFonts w:ascii="Calibri" w:eastAsia="Times New Roman" w:hAnsi="Calibri" w:cs="Calibri"/>
-        </w:rPr>
-      </w:pPr>
-      <w:r>
-        <w:rPr>
-          <w:rFonts w:ascii="Calibri" w:eastAsia="Times New Roman" w:hAnsi="Calibri" w:cs="Calibri"/>
-        </w:rPr>
-        <w:t xml:space="preserve">5.5 Avance sobre etapa posterior a </w:t>
-      </w:r>
-      <w:r>
-        <w:rPr>
-          <w:rStyle w:val="CdigoHTML"/>
-        </w:rPr>
-        <w:t>sin-carta</w:t>
-      </w:r>
-    </w:p>
-    <w:p>
-      <w:pPr>
-        <w:pStyle w:val="NormalWeb"/>
-        <w:rPr>
-          <w:rFonts w:ascii="Calibri" w:hAnsi="Calibri" w:cs="Calibri"/>
-          <w:sz w:val="22"/>
-          <w:szCs w:val="22"/>
-        </w:rPr>
-      </w:pPr>
-      <w:r>
-        <w:rPr>
-          <w:rFonts w:ascii="Calibri" w:hAnsi="Calibri" w:cs="Calibri"/>
-          <w:sz w:val="22"/>
-          <w:szCs w:val="22"/>
-        </w:rPr>
-        <w:lastRenderedPageBreak/>
-        <w:t>Precisar si en junio hubo definición funcional, documental u operativa de cierre sobre cartas, generación documental complementaria o entrega.</w:t>
-      </w:r>
-    </w:p>
-    <w:p>
-      <w:pPr>
         <w:pStyle w:val="Ttulo2"/>
         <w:rPr>
           <w:rFonts w:ascii="Calibri" w:eastAsia="Times New Roman" w:hAnsi="Calibri" w:cs="Calibri"/>
@@ -1226,7 +755,7 @@
         <w:rPr>
           <w:rFonts w:ascii="Calibri" w:eastAsia="Times New Roman" w:hAnsi="Calibri" w:cs="Calibri"/>
         </w:rPr>
-        <w:t>6. Riesgos y Dependencias para Junio</w:t>
+        <w:t>5. Próximos Pasos (Posteriores al Trimestre)</w:t>
       </w:r>
     </w:p>
     <w:p>
@@ -1248,7 +777,35 @@
           <w:sz w:val="22"/>
           <w:szCs w:val="22"/>
         </w:rPr>
-        <w:t>Dependencia del servicio externo IMSS para obtener resultados representativos.</w:t>
+        <w:t xml:space="preserve">Movilizar los artefactos y el código de la rama </w:t>
+      </w:r>
+      <w:r>
+        <w:rPr>
+          <w:rStyle w:val="CdigoHTML"/>
+        </w:rPr>
+        <w:t>feature/vlarrea-fase-2</w:t>
+      </w:r>
+      <w:r>
+        <w:rPr>
+          <w:rFonts w:ascii="Calibri" w:eastAsia="Times New Roman" w:hAnsi="Calibri" w:cs="Calibri"/>
+          <w:sz w:val="22"/>
+          <w:szCs w:val="22"/>
+        </w:rPr>
+        <w:t xml:space="preserve"> hacia la rama principal (</w:t>
+      </w:r>
+      <w:r>
+        <w:rPr>
+          <w:rStyle w:val="CdigoHTML"/>
+        </w:rPr>
+        <w:t>master</w:t>
+      </w:r>
+      <w:r>
+        <w:rPr>
+          <w:rFonts w:ascii="Calibri" w:eastAsia="Times New Roman" w:hAnsi="Calibri" w:cs="Calibri"/>
+          <w:sz w:val="22"/>
+          <w:szCs w:val="22"/>
+        </w:rPr>
+        <w:t>) tan pronto como se notifique la reanudación formal.</w:t>
       </w:r>
     </w:p>
     <w:p>
@@ -1270,168 +827,66 @@
           <w:sz w:val="22"/>
           <w:szCs w:val="22"/>
         </w:rPr>
-        <w:t>Dependencia de datos suficientes para consolidar comportamiento trimestral.</w:t>
+        <w:t xml:space="preserve">Iniciar el </w:t>
+      </w:r>
+      <w:r>
+        <w:rPr>
+          <w:rStyle w:val="Fuerte"/>
+          <w:rFonts w:ascii="Calibri" w:eastAsia="Times New Roman" w:hAnsi="Calibri" w:cs="Calibri"/>
+          <w:sz w:val="22"/>
+          <w:szCs w:val="22"/>
+        </w:rPr>
+        <w:t>Sprint 1 de Construcción</w:t>
+      </w:r>
+      <w:r>
+        <w:rPr>
+          <w:rFonts w:ascii="Calibri" w:eastAsia="Times New Roman" w:hAnsi="Calibri" w:cs="Calibri"/>
+          <w:sz w:val="22"/>
+          <w:szCs w:val="22"/>
+        </w:rPr>
+        <w:t xml:space="preserve"> enfocado al motor de orquestación de reportes PDF, apoyándose en la sólida infraestructura consolidada al cierre de este trimestre.</w:t>
       </w:r>
     </w:p>
     <w:p>
       <w:pPr>
-        <w:numPr>
-          <w:ilvl w:val="0"/>
-          <w:numId w:val="3"/>
-        </w:numPr>
-        <w:spacing w:before="100" w:beforeAutospacing="1" w:after="100" w:afterAutospacing="1"/>
-        <w:rPr>
-          <w:rFonts w:ascii="Calibri" w:eastAsia="Times New Roman" w:hAnsi="Calibri" w:cs="Calibri"/>
-          <w:sz w:val="22"/>
-          <w:szCs w:val="22"/>
-        </w:rPr>
-      </w:pPr>
-      <w:r>
-        <w:rPr>
-          <w:rFonts w:ascii="Calibri" w:eastAsia="Times New Roman" w:hAnsi="Calibri" w:cs="Calibri"/>
-          <w:sz w:val="22"/>
-          <w:szCs w:val="22"/>
-        </w:rPr>
-        <w:t>Riesgo de mezclar en el reporte hallazgos de abril y mayo sin distinguir qué se cerró realmente en junio.</w:t>
+        <w:rPr>
+          <w:rFonts w:ascii="Calibri" w:eastAsia="Times New Roman" w:hAnsi="Calibri" w:cs="Calibri"/>
+          <w:sz w:val="22"/>
+          <w:szCs w:val="22"/>
+        </w:rPr>
+      </w:pPr>
+      <w:r>
+        <w:rPr>
+          <w:rFonts w:ascii="Calibri" w:eastAsia="Times New Roman" w:hAnsi="Calibri" w:cs="Calibri"/>
+          <w:sz w:val="22"/>
+          <w:szCs w:val="22"/>
+        </w:rPr>
+        <w:pict w14:anchorId="3DC6A068">
+          <v:rect id="_x0000_i1026" style="width:0;height:1.5pt" o:hralign="center" o:hrstd="t" o:hr="t" fillcolor="#a0a0a0" stroked="f"/>
+        </w:pict>
       </w:r>
     </w:p>
     <w:p>
       <w:pPr>
-        <w:numPr>
-          <w:ilvl w:val="0"/>
-          <w:numId w:val="3"/>
-        </w:numPr>
-        <w:spacing w:before="100" w:beforeAutospacing="1" w:after="100" w:afterAutospacing="1"/>
-        <w:rPr>
-          <w:rFonts w:ascii="Calibri" w:eastAsia="Times New Roman" w:hAnsi="Calibri" w:cs="Calibri"/>
-          <w:sz w:val="22"/>
-          <w:szCs w:val="22"/>
-        </w:rPr>
-      </w:pPr>
-      <w:r>
-        <w:rPr>
-          <w:rFonts w:ascii="Calibri" w:eastAsia="Times New Roman" w:hAnsi="Calibri" w:cs="Calibri"/>
-          <w:sz w:val="22"/>
-          <w:szCs w:val="22"/>
-        </w:rPr>
-        <w:t xml:space="preserve">Riesgo de que la etapa posterior a </w:t>
-      </w:r>
-      <w:r>
-        <w:rPr>
-          <w:rStyle w:val="CdigoHTML"/>
-        </w:rPr>
-        <w:t>sin-carta</w:t>
-      </w:r>
-      <w:r>
-        <w:rPr>
-          <w:rFonts w:ascii="Calibri" w:eastAsia="Times New Roman" w:hAnsi="Calibri" w:cs="Calibri"/>
-          <w:sz w:val="22"/>
-          <w:szCs w:val="22"/>
-        </w:rPr>
-        <w:t xml:space="preserve"> continúe sin definición funcional cerrada.</w:t>
+        <w:pStyle w:val="NormalWeb"/>
+        <w:rPr>
+          <w:rFonts w:ascii="Calibri" w:hAnsi="Calibri" w:cs="Calibri"/>
+          <w:sz w:val="22"/>
+          <w:szCs w:val="22"/>
+        </w:rPr>
+      </w:pPr>
+      <w:r>
+        <w:rPr>
+          <w:rStyle w:val="Fuerte"/>
+          <w:rFonts w:ascii="Calibri" w:hAnsi="Calibri" w:cs="Calibri"/>
+          <w:sz w:val="22"/>
+          <w:szCs w:val="22"/>
+        </w:rPr>
+        <w:t>Comentarios adicionales:</w:t>
       </w:r>
     </w:p>
     <w:p>
       <w:pPr>
-        <w:pStyle w:val="Ttulo2"/>
-        <w:rPr>
-          <w:rFonts w:ascii="Calibri" w:eastAsia="Times New Roman" w:hAnsi="Calibri" w:cs="Calibri"/>
-        </w:rPr>
-      </w:pPr>
-      <w:r>
-        <w:rPr>
-          <w:rFonts w:ascii="Calibri" w:eastAsia="Times New Roman" w:hAnsi="Calibri" w:cs="Calibri"/>
-        </w:rPr>
-        <w:t>7. Próximos Pasos</w:t>
-      </w:r>
-    </w:p>
-    <w:p>
-      <w:pPr>
-        <w:numPr>
-          <w:ilvl w:val="0"/>
-          <w:numId w:val="4"/>
-        </w:numPr>
-        <w:spacing w:before="100" w:beforeAutospacing="1" w:after="100" w:afterAutospacing="1"/>
-        <w:rPr>
-          <w:rFonts w:ascii="Calibri" w:eastAsia="Times New Roman" w:hAnsi="Calibri" w:cs="Calibri"/>
-          <w:sz w:val="22"/>
-          <w:szCs w:val="22"/>
-        </w:rPr>
-      </w:pPr>
-      <w:r>
-        <w:rPr>
-          <w:rFonts w:ascii="Calibri" w:eastAsia="Times New Roman" w:hAnsi="Calibri" w:cs="Calibri"/>
-          <w:sz w:val="22"/>
-          <w:szCs w:val="22"/>
-        </w:rPr>
-        <w:t>Consolidar evidencia final del trimestre.</w:t>
-      </w:r>
-    </w:p>
-    <w:p>
-      <w:pPr>
-        <w:numPr>
-          <w:ilvl w:val="0"/>
-          <w:numId w:val="4"/>
-        </w:numPr>
-        <w:spacing w:before="100" w:beforeAutospacing="1" w:after="100" w:afterAutospacing="1"/>
-        <w:rPr>
-          <w:rFonts w:ascii="Calibri" w:eastAsia="Times New Roman" w:hAnsi="Calibri" w:cs="Calibri"/>
-          <w:sz w:val="22"/>
-          <w:szCs w:val="22"/>
-        </w:rPr>
-      </w:pPr>
-      <w:r>
-        <w:rPr>
-          <w:rFonts w:ascii="Calibri" w:eastAsia="Times New Roman" w:hAnsi="Calibri" w:cs="Calibri"/>
-          <w:sz w:val="22"/>
-          <w:szCs w:val="22"/>
-        </w:rPr>
-        <w:t>Precisar qué hallazgos quedaron cerrados en junio y cuáles continúan abiertos.</w:t>
-      </w:r>
-    </w:p>
-    <w:p>
-      <w:pPr>
-        <w:numPr>
-          <w:ilvl w:val="0"/>
-          <w:numId w:val="4"/>
-        </w:numPr>
-        <w:spacing w:before="100" w:beforeAutospacing="1" w:after="100" w:afterAutospacing="1"/>
-        <w:rPr>
-          <w:rFonts w:ascii="Calibri" w:eastAsia="Times New Roman" w:hAnsi="Calibri" w:cs="Calibri"/>
-          <w:sz w:val="22"/>
-          <w:szCs w:val="22"/>
-        </w:rPr>
-      </w:pPr>
-      <w:r>
-        <w:rPr>
-          <w:rFonts w:ascii="Calibri" w:eastAsia="Times New Roman" w:hAnsi="Calibri" w:cs="Calibri"/>
-          <w:sz w:val="22"/>
-          <w:szCs w:val="22"/>
-        </w:rPr>
-        <w:t>Preparar recomendaciones posteriores al corte trimestral sin duplicar el contenido estructural de abril ni el operativo de mayo.</w:t>
-      </w:r>
-    </w:p>
-    <w:p>
-      <w:pPr>
-        <w:rPr>
-          <w:rFonts w:ascii="Calibri" w:eastAsia="Times New Roman" w:hAnsi="Calibri" w:cs="Calibri"/>
-          <w:sz w:val="22"/>
-          <w:szCs w:val="22"/>
-        </w:rPr>
-      </w:pPr>
-      <w:r>
-        <w:rPr>
-          <w:rFonts w:ascii="Calibri" w:eastAsia="Times New Roman" w:hAnsi="Calibri" w:cs="Calibri"/>
-          <w:sz w:val="22"/>
-          <w:szCs w:val="22"/>
-        </w:rPr>
-        <w:pict w14:anchorId="79E418FC">
-          <v:rect id="_x0000_i1026" style="width:0;height:1.5pt" o:hralign="center" o:hrstd="t" o:hr="t" fillcolor="#a0a0a0" stroked="f"/>
-        </w:pict>
-      </w:r>
-    </w:p>
-    <w:p>
-      <w:pPr>
         <w:pStyle w:val="NormalWeb"/>
         <w:rPr>
           <w:rFonts w:ascii="Calibri" w:hAnsi="Calibri" w:cs="Calibri"/>
@@ -1441,30 +896,11 @@
       </w:pPr>
       <w:r>
         <w:rPr>
-          <w:rStyle w:val="Fuerte"/>
           <w:rFonts w:ascii="Calibri" w:hAnsi="Calibri" w:cs="Calibri"/>
           <w:sz w:val="22"/>
           <w:szCs w:val="22"/>
         </w:rPr>
-        <w:t>Comentarios adicionales:</w:t>
-      </w:r>
-    </w:p>
-    <w:p>
-      <w:pPr>
-        <w:pStyle w:val="NormalWeb"/>
-        <w:rPr>
-          <w:rFonts w:ascii="Calibri" w:hAnsi="Calibri" w:cs="Calibri"/>
-          <w:sz w:val="22"/>
-          <w:szCs w:val="22"/>
-        </w:rPr>
-      </w:pPr>
-      <w:r>
-        <w:rPr>
-          <w:rFonts w:ascii="Calibri" w:hAnsi="Calibri" w:cs="Calibri"/>
-          <w:sz w:val="22"/>
-          <w:szCs w:val="22"/>
-        </w:rPr>
-        <w:t>Este entregable de junio debe operar como documento de cierre y consolidación trimestral, no como repetición del levantamiento estructural de abril ni del seguimiento operativo detallado de mayo.</w:t>
+        <w:t>Este informe cierra satisfactoriamente la trazabilidad técnica del proyecto Vida Saludable para el trimestre, demostrando que no hubo regresiones técnicas durante su pausa y que el repositorio institucional preserva íntegramente su valor funcional y documental.</w:t>
       </w:r>
     </w:p>
     <w:sectPr>
@@ -1480,9 +916,9 @@
 <file path=word/numbering.xml><?xml version="1.0" encoding="utf-8"?>
 <w:numbering xmlns:wpc="http://schemas.microsoft.com/office/word/2010/wordprocessingCanvas" xmlns:cx="http://schemas.microsoft.com/office/drawing/2014/chartex" xmlns:cx1="http://schemas.microsoft.com/office/drawing/2015/9/8/chartex" xmlns:cx2="http://schemas.microsoft.com/office/drawing/2015/10/21/chartex" xmlns:cx3="http://schemas.microsoft.com/office/drawing/2016/5/9/chartex" xmlns:cx4="http://schemas.microsoft.com/office/drawing/2016/5/10/chartex" xmlns:cx5="http://schemas.microsoft.com/office/drawing/2016/5/11/chartex" xmlns:cx6="http://schemas.microsoft.com/office/drawing/2016/5/12/chartex" xmlns:cx7="http://schemas.microsoft.com/office/drawing/2016/5/13/chartex" xmlns:cx8="http://schemas.microsoft.com/office/drawing/2016/5/14/chartex" xmlns:mc="http://schemas.openxmlformats.org/markup-compatibility/2006" xmlns:aink="http://schemas.microsoft.com/office/drawing/2016/ink" xmlns:am3d="http://schemas.microsoft.com/office/drawing/2017/model3d" xmlns:o="urn:schemas-microsoft-com:office:office" xmlns:oel="http://schemas.microsoft.com/office/2019/extlst" xmlns:r="http://schemas.openxmlformats.org/officeDocument/2006/relationships" xmlns:m="http://schemas.openxmlformats.org/officeDocument/2006/math" xmlns:v="urn:schemas-microsoft-com:vml" xmlns:wp14="http://schemas.microsoft.com/office/word/2010/wordprocessingDrawing" xmlns:wp="http://schemas.openxmlformats.org/drawingml/2006/wordprocessingDrawing" xmlns:w10="urn:schemas-microsoft-com:office:word" xmlns:w="http://schemas.openxmlformats.org/wordprocessingml/2006/main" xmlns:w14="http://schemas.microsoft.com/office/word/2010/wordml" xmlns:w15="http://schemas.microsoft.com/office/word/2012/wordml" xmlns:w16cex="http://schemas.microsoft.com/office/word/2018/wordml/cex" xmlns:w16cid="http://schemas.microsoft.com/office/word/2016/wordml/cid" xmlns:w16="http://schemas.microsoft.com/office/word/2018/wordml" xmlns:w16du="http://schemas.microsoft.com/office/word/2023/wordml/word16du" xmlns:w16sdtdh="http://schemas.microsoft.com/office/word/2020/wordml/sdtdatahash" xmlns:w16sdtfl="http://schemas.microsoft.com/office/word/2024/wordml/sdtformatlock" xmlns:w16se="http://schemas.microsoft.com/office/word/2015/wordml/symex" xmlns:wpg="http://schemas.microsoft.com/office/word/2010/wordprocessingGroup" xmlns:wpi="http://schemas.microsoft.com/office/word/2010/wordprocessingInk" xmlns:wne="http://schemas.microsoft.com/office/word/2006/wordml" xmlns:wps="http://schemas.microsoft.com/office/word/2010/wordprocessingShape" mc:Ignorable="w14 w15 w16se w16cid w16 w16cex w16sdtdh w16sdtfl w16du wp14">
   <w:abstractNum w:abstractNumId="0" w15:restartNumberingAfterBreak="0">
-    <w:nsid w:val="19B265B4"/>
+    <w:nsid w:val="363C51F1"/>
     <w:multiLevelType w:val="multilevel"/>
-    <w:tmpl w:val="0EEE3044"/>
+    <w:tmpl w:val="A532EEE6"/>
     <w:lvl w:ilvl="0">
       <w:start w:val="1"/>
       <w:numFmt w:val="bullet"/>
@@ -1629,9 +1065,9 @@
     </w:lvl>
   </w:abstractNum>
   <w:abstractNum w:abstractNumId="1" w15:restartNumberingAfterBreak="0">
-    <w:nsid w:val="6B427ED8"/>
+    <w:nsid w:val="65441CA7"/>
     <w:multiLevelType w:val="multilevel"/>
-    <w:tmpl w:val="5372979C"/>
+    <w:tmpl w:val="D4A8A82C"/>
     <w:lvl w:ilvl="0">
       <w:start w:val="1"/>
       <w:numFmt w:val="bullet"/>
@@ -1778,9 +1214,9 @@
     </w:lvl>
   </w:abstractNum>
   <w:abstractNum w:abstractNumId="2" w15:restartNumberingAfterBreak="0">
-    <w:nsid w:val="6E50342E"/>
+    <w:nsid w:val="69147DD6"/>
     <w:multiLevelType w:val="multilevel"/>
-    <w:tmpl w:val="1BF62A26"/>
+    <w:tmpl w:val="89506ADA"/>
     <w:lvl w:ilvl="0">
       <w:start w:val="1"/>
       <w:numFmt w:val="bullet"/>
@@ -1926,166 +1362,14 @@
       </w:rPr>
     </w:lvl>
   </w:abstractNum>
-  <w:abstractNum w:abstractNumId="3" w15:restartNumberingAfterBreak="0">
-    <w:nsid w:val="7F984F52"/>
-    <w:multiLevelType w:val="multilevel"/>
-    <w:tmpl w:val="9322F36E"/>
-    <w:lvl w:ilvl="0">
-      <w:start w:val="1"/>
-      <w:numFmt w:val="bullet"/>
-      <w:lvlText w:val=""/>
-      <w:lvlJc w:val="left"/>
-      <w:pPr>
-        <w:tabs>
-          <w:tab w:val="num" w:pos="720"/>
-        </w:tabs>
-        <w:ind w:left="720" w:hanging="360"/>
-      </w:pPr>
-      <w:rPr>
-        <w:rFonts w:ascii="Symbol" w:hAnsi="Symbol" w:hint="default"/>
-        <w:sz w:val="20"/>
-      </w:rPr>
-    </w:lvl>
-    <w:lvl w:ilvl="1" w:tentative="1">
-      <w:start w:val="1"/>
-      <w:numFmt w:val="bullet"/>
-      <w:lvlText w:val="o"/>
-      <w:lvlJc w:val="left"/>
-      <w:pPr>
-        <w:tabs>
-          <w:tab w:val="num" w:pos="1440"/>
-        </w:tabs>
-        <w:ind w:left="1440" w:hanging="360"/>
-      </w:pPr>
-      <w:rPr>
-        <w:rFonts w:ascii="Courier New" w:hAnsi="Courier New" w:hint="default"/>
-        <w:sz w:val="20"/>
-      </w:rPr>
-    </w:lvl>
-    <w:lvl w:ilvl="2" w:tentative="1">
-      <w:start w:val="1"/>
-      <w:numFmt w:val="bullet"/>
-      <w:lvlText w:val=""/>
-      <w:lvlJc w:val="left"/>
-      <w:pPr>
-        <w:tabs>
-          <w:tab w:val="num" w:pos="2160"/>
-        </w:tabs>
-        <w:ind w:left="2160" w:hanging="360"/>
-      </w:pPr>
-      <w:rPr>
-        <w:rFonts w:ascii="Wingdings" w:hAnsi="Wingdings" w:hint="default"/>
-        <w:sz w:val="20"/>
-      </w:rPr>
-    </w:lvl>
-    <w:lvl w:ilvl="3" w:tentative="1">
-      <w:start w:val="1"/>
-      <w:numFmt w:val="bullet"/>
-      <w:lvlText w:val=""/>
-      <w:lvlJc w:val="left"/>
-      <w:pPr>
-        <w:tabs>
-          <w:tab w:val="num" w:pos="2880"/>
-        </w:tabs>
-        <w:ind w:left="2880" w:hanging="360"/>
-      </w:pPr>
-      <w:rPr>
-        <w:rFonts w:ascii="Wingdings" w:hAnsi="Wingdings" w:hint="default"/>
-        <w:sz w:val="20"/>
-      </w:rPr>
-    </w:lvl>
-    <w:lvl w:ilvl="4" w:tentative="1">
-      <w:start w:val="1"/>
-      <w:numFmt w:val="bullet"/>
-      <w:lvlText w:val=""/>
-      <w:lvlJc w:val="left"/>
-      <w:pPr>
-        <w:tabs>
-          <w:tab w:val="num" w:pos="3600"/>
-        </w:tabs>
-        <w:ind w:left="3600" w:hanging="360"/>
-      </w:pPr>
-      <w:rPr>
-        <w:rFonts w:ascii="Wingdings" w:hAnsi="Wingdings" w:hint="default"/>
-        <w:sz w:val="20"/>
-      </w:rPr>
-    </w:lvl>
-    <w:lvl w:ilvl="5" w:tentative="1">
-      <w:start w:val="1"/>
-      <w:numFmt w:val="bullet"/>
-      <w:lvlText w:val=""/>
-      <w:lvlJc w:val="left"/>
-      <w:pPr>
-        <w:tabs>
-          <w:tab w:val="num" w:pos="4320"/>
-        </w:tabs>
-        <w:ind w:left="4320" w:hanging="360"/>
-      </w:pPr>
-      <w:rPr>
-        <w:rFonts w:ascii="Wingdings" w:hAnsi="Wingdings" w:hint="default"/>
-        <w:sz w:val="20"/>
-      </w:rPr>
-    </w:lvl>
-    <w:lvl w:ilvl="6" w:tentative="1">
-      <w:start w:val="1"/>
-      <w:numFmt w:val="bullet"/>
-      <w:lvlText w:val=""/>
-      <w:lvlJc w:val="left"/>
-      <w:pPr>
-        <w:tabs>
-          <w:tab w:val="num" w:pos="5040"/>
-        </w:tabs>
-        <w:ind w:left="5040" w:hanging="360"/>
-      </w:pPr>
-      <w:rPr>
-        <w:rFonts w:ascii="Wingdings" w:hAnsi="Wingdings" w:hint="default"/>
-        <w:sz w:val="20"/>
-      </w:rPr>
-    </w:lvl>
-    <w:lvl w:ilvl="7" w:tentative="1">
-      <w:start w:val="1"/>
-      <w:numFmt w:val="bullet"/>
-      <w:lvlText w:val=""/>
-      <w:lvlJc w:val="left"/>
-      <w:pPr>
-        <w:tabs>
-          <w:tab w:val="num" w:pos="5760"/>
-        </w:tabs>
-        <w:ind w:left="5760" w:hanging="360"/>
-      </w:pPr>
-      <w:rPr>
-        <w:rFonts w:ascii="Wingdings" w:hAnsi="Wingdings" w:hint="default"/>
-        <w:sz w:val="20"/>
-      </w:rPr>
-    </w:lvl>
-    <w:lvl w:ilvl="8" w:tentative="1">
-      <w:start w:val="1"/>
-      <w:numFmt w:val="bullet"/>
-      <w:lvlText w:val=""/>
-      <w:lvlJc w:val="left"/>
-      <w:pPr>
-        <w:tabs>
-          <w:tab w:val="num" w:pos="6480"/>
-        </w:tabs>
-        <w:ind w:left="6480" w:hanging="360"/>
-      </w:pPr>
-      <w:rPr>
-        <w:rFonts w:ascii="Wingdings" w:hAnsi="Wingdings" w:hint="default"/>
-        <w:sz w:val="20"/>
-      </w:rPr>
-    </w:lvl>
-  </w:abstractNum>
-  <w:num w:numId="1" w16cid:durableId="1919825326">
-    <w:abstractNumId w:val="1"/>
+  <w:num w:numId="1" w16cid:durableId="1656958420">
+    <w:abstractNumId w:val="2"/>
   </w:num>
-  <w:num w:numId="2" w16cid:durableId="1989744598">
+  <w:num w:numId="2" w16cid:durableId="1081870431">
     <w:abstractNumId w:val="0"/>
   </w:num>
-  <w:num w:numId="3" w16cid:durableId="777257349">
-    <w:abstractNumId w:val="3"/>
-  </w:num>
-  <w:num w:numId="4" w16cid:durableId="797458623">
-    <w:abstractNumId w:val="2"/>
+  <w:num w:numId="3" w16cid:durableId="668408228">
+    <w:abstractNumId w:val="1"/>
   </w:num>
 </w:numbering>
 </file>

</xml_diff>

<commit_message>
docs: actualizacion final handover junio 2026
</commit_message>
<xml_diff>
--- a/05-Mayo-Junio/Entregables/2026-06/01-Reporte_Especificaciones_Vida_Saludable_2026-06.docx
+++ b/05-Mayo-Junio/Entregables/2026-06/01-Reporte_Especificaciones_Vida_Saludable_2026-06.docx
@@ -13,7 +13,7 @@
         <w:rPr>
           <w:rFonts w:ascii="Calibri" w:eastAsia="Times New Roman" w:hAnsi="Calibri" w:cs="Calibri"/>
         </w:rPr>
-        <w:t>Reporte Mensual de Especificaciones del Proyecto Vida Saludable</w:t>
+        <w:t>Reporte de Cierre: Especificaciones del Proyecto Vida Saludable</w:t>
       </w:r>
     </w:p>
     <w:p>
@@ -111,7 +111,7 @@
           <w:sz w:val="22"/>
           <w:szCs w:val="22"/>
         </w:rPr>
-        <w:pict w14:anchorId="2FC543CB">
+        <w:pict w14:anchorId="46085C52">
           <v:rect id="_x0000_i1025" style="width:0;height:1.5pt" o:hralign="center" o:hrstd="t" o:hr="t" fillcolor="#a0a0a0" stroked="f"/>
         </w:pict>
       </w:r>
@@ -145,7 +145,7 @@
           <w:sz w:val="22"/>
           <w:szCs w:val="22"/>
         </w:rPr>
-        <w:t xml:space="preserve">Este documento presenta el cierre trimestral de las actividades vinculadas al proyecto Vida Saludable, consolidando el estado alcanzado en el repositorio </w:t>
+        <w:t xml:space="preserve">Este documento presenta el acta final de estado y cierre trimestral de las actividades vinculadas al proyecto Vida Saludable, consolidando la herencia tecnológica depositada en el repositorio </w:t>
       </w:r>
       <w:r>
         <w:rPr>
@@ -159,7 +159,7 @@
           <w:sz w:val="22"/>
           <w:szCs w:val="22"/>
         </w:rPr>
-        <w:t>. A partir del 29 de abril de 2026, el proyecto fue colocado en un estado de pausa administrativa ("Migración Validada", "Documentación Completa", "Infraestructura Lista"). Por tanto, el mes de junio certifica la correcta conservación de esta línea base.</w:t>
+        <w:t>. Sirve como constancia de que la arquitectura diseñada y migrada se transfiere en óptimas condiciones operativas para su futura explotación.</w:t>
       </w:r>
     </w:p>
     <w:p>
@@ -173,7 +173,7 @@
         <w:rPr>
           <w:rFonts w:ascii="Calibri" w:eastAsia="Times New Roman" w:hAnsi="Calibri" w:cs="Calibri"/>
         </w:rPr>
-        <w:t>2. Estado Final del Trimestre</w:t>
+        <w:t>2. Herencia Arquitectónica y Estado Final</w:t>
       </w:r>
     </w:p>
     <w:p>
@@ -191,7 +191,7 @@
           <w:sz w:val="22"/>
           <w:szCs w:val="22"/>
         </w:rPr>
-        <w:t>Durante junio se validó que la arquitectura y la base de conocimiento se preservan inalteradas y listas para la reactivación:</w:t>
+        <w:t>A la fecha de corte, el proyecto conserva su estado de congelamiento administrativo (pausa técnica) con una línea base blindada y un código fuente completamente resiliente y refactorizado:</w:t>
       </w:r>
     </w:p>
     <w:p>
@@ -214,15 +214,15 @@
           <w:sz w:val="22"/>
           <w:szCs w:val="22"/>
         </w:rPr>
-        <w:t>Infraestructura:</w:t>
-      </w:r>
-      <w:r>
-        <w:rPr>
-          <w:rFonts w:ascii="Calibri" w:eastAsia="Times New Roman" w:hAnsi="Calibri" w:cs="Calibri"/>
-          <w:sz w:val="22"/>
-          <w:szCs w:val="22"/>
-        </w:rPr>
-        <w:t xml:space="preserve"> Backend modularizado (FastAPI, pg8000 puro, Strawberry) y Frontend (Angular 18, Apollo Client) preparados en sus entornos de desarrollo.</w:t>
+        <w:t>Core de Infraestructura:</w:t>
+      </w:r>
+      <w:r>
+        <w:rPr>
+          <w:rFonts w:ascii="Calibri" w:eastAsia="Times New Roman" w:hAnsi="Calibri" w:cs="Calibri"/>
+          <w:sz w:val="22"/>
+          <w:szCs w:val="22"/>
+        </w:rPr>
+        <w:t xml:space="preserve"> El backend asíncrono (FastAPI, pg8000 puro) y la integración UI (Angular 18) quedan formalmente segregados y documentados.</w:t>
       </w:r>
     </w:p>
     <w:p>
@@ -245,15 +245,15 @@
           <w:sz w:val="22"/>
           <w:szCs w:val="22"/>
         </w:rPr>
-        <w:t>Base de Datos:</w:t>
-      </w:r>
-      <w:r>
-        <w:rPr>
-          <w:rFonts w:ascii="Calibri" w:eastAsia="Times New Roman" w:hAnsi="Calibri" w:cs="Calibri"/>
-          <w:sz w:val="22"/>
-          <w:szCs w:val="22"/>
-        </w:rPr>
-        <w:t xml:space="preserve"> Estructura de tablas para PostgreSQL 14 segregada correctamente (IMSS vs IMSS-Bienestar).</w:t>
+        <w:t>Auditoría de Vulnerabilidades Previas:</w:t>
+      </w:r>
+      <w:r>
+        <w:rPr>
+          <w:rFonts w:ascii="Calibri" w:eastAsia="Times New Roman" w:hAnsi="Calibri" w:cs="Calibri"/>
+          <w:sz w:val="22"/>
+          <w:szCs w:val="22"/>
+        </w:rPr>
+        <w:t xml:space="preserve"> Las incidencias Críticas de inyección SQL (Issue 61), cifrado de cliente IMSS con GCM (Issue 60) y ofuscación de CURP en GraphQL (Issue 59) fueron resueltas por completo mediante implementaciones rigurosas, cubiertas por pruebas *End-to-End* en Cypress y certificadas con *Unit Tests*.</w:t>
       </w:r>
     </w:p>
     <w:p>
@@ -276,15 +276,43 @@
           <w:sz w:val="22"/>
           <w:szCs w:val="22"/>
         </w:rPr>
-        <w:t>Seguridad:</w:t>
-      </w:r>
-      <w:r>
-        <w:rPr>
-          <w:rFonts w:ascii="Calibri" w:eastAsia="Times New Roman" w:hAnsi="Calibri" w:cs="Calibri"/>
-          <w:sz w:val="22"/>
-          <w:szCs w:val="22"/>
-        </w:rPr>
-        <w:t xml:space="preserve"> Cierre del incidente de datos sensibles en historial (17 de abril) certificado como resuelto de manera permanente.</w:t>
+        <w:t>Cero Regresiones:</w:t>
+      </w:r>
+      <w:r>
+        <w:rPr>
+          <w:rFonts w:ascii="Calibri" w:eastAsia="Times New Roman" w:hAnsi="Calibri" w:cs="Calibri"/>
+          <w:sz w:val="22"/>
+          <w:szCs w:val="22"/>
+        </w:rPr>
+        <w:t xml:space="preserve"> El historial técnico de incidencias (</w:t>
+      </w:r>
+      <w:r>
+        <w:rPr>
+          <w:rStyle w:val="CdigoHTML"/>
+        </w:rPr>
+        <w:t>RESUMEN-PAUSA-PROYECTO.md</w:t>
+      </w:r>
+      <w:r>
+        <w:rPr>
+          <w:rFonts w:ascii="Calibri" w:eastAsia="Times New Roman" w:hAnsi="Calibri" w:cs="Calibri"/>
+          <w:sz w:val="22"/>
+          <w:szCs w:val="22"/>
+        </w:rPr>
+        <w:t xml:space="preserve"> y documentos </w:t>
+      </w:r>
+      <w:r>
+        <w:rPr>
+          <w:rStyle w:val="CdigoHTML"/>
+        </w:rPr>
+        <w:t>RCA_*</w:t>
+      </w:r>
+      <w:r>
+        <w:rPr>
+          <w:rFonts w:ascii="Calibri" w:eastAsia="Times New Roman" w:hAnsi="Calibri" w:cs="Calibri"/>
+          <w:sz w:val="22"/>
+          <w:szCs w:val="22"/>
+        </w:rPr>
+        <w:t>) se entrega al corriente para proveer contexto claro al equipo receptor.</w:t>
       </w:r>
     </w:p>
     <w:p>
@@ -298,7 +326,7 @@
         <w:rPr>
           <w:rFonts w:ascii="Calibri" w:eastAsia="Times New Roman" w:hAnsi="Calibri" w:cs="Calibri"/>
         </w:rPr>
-        <w:t>3. Evidencia Consolidada</w:t>
+        <w:t>3. Instructivo para la Reactivación</w:t>
       </w:r>
     </w:p>
     <w:p>
@@ -316,358 +344,107 @@
           <w:sz w:val="22"/>
           <w:szCs w:val="22"/>
         </w:rPr>
-        <w:t>Debido al estatus de pausa, no hubo procesamiento de lotes ni generación física de PDFs durante mayo y junio. La evidencia se documenta como el resguardo de la arquitectura aprobada:</w:t>
-      </w:r>
-    </w:p>
-    <w:tbl>
-      <w:tblPr>
-        <w:tblW w:w="5000" w:type="pct"/>
-        <w:tblCellMar>
-          <w:top w:w="15" w:type="dxa"/>
-          <w:left w:w="15" w:type="dxa"/>
-          <w:bottom w:w="15" w:type="dxa"/>
-          <w:right w:w="15" w:type="dxa"/>
-        </w:tblCellMar>
-        <w:tblLook w:val="04A0" w:firstRow="1" w:lastRow="0" w:firstColumn="1" w:lastColumn="0" w:noHBand="0" w:noVBand="1"/>
-      </w:tblPr>
-      <w:tblGrid>
-        <w:gridCol w:w="1654"/>
-        <w:gridCol w:w="7168"/>
-      </w:tblGrid>
-      <w:tr>
-        <w:trPr>
-          <w:tblHeader/>
-        </w:trPr>
-        <w:tc>
-          <w:tcPr>
-            <w:tcW w:w="0" w:type="auto"/>
-            <w:tcBorders>
-              <w:top w:val="single" w:sz="6" w:space="0" w:color="666666"/>
-              <w:left w:val="single" w:sz="6" w:space="0" w:color="666666"/>
-              <w:bottom w:val="single" w:sz="6" w:space="0" w:color="666666"/>
-              <w:right w:val="single" w:sz="6" w:space="0" w:color="666666"/>
-            </w:tcBorders>
-            <w:tcMar>
-              <w:top w:w="90" w:type="dxa"/>
-              <w:left w:w="90" w:type="dxa"/>
-              <w:bottom w:w="90" w:type="dxa"/>
-              <w:right w:w="90" w:type="dxa"/>
-            </w:tcMar>
-            <w:hideMark/>
-          </w:tcPr>
-          <w:p>
-            <w:pPr>
-              <w:spacing w:before="180" w:after="180"/>
-              <w:rPr>
-                <w:rFonts w:ascii="Calibri" w:eastAsia="Times New Roman" w:hAnsi="Calibri" w:cs="Calibri"/>
-                <w:b/>
-                <w:bCs/>
-                <w:sz w:val="22"/>
-                <w:szCs w:val="22"/>
-              </w:rPr>
-            </w:pPr>
-            <w:r>
-              <w:rPr>
-                <w:rFonts w:ascii="Calibri" w:eastAsia="Times New Roman" w:hAnsi="Calibri" w:cs="Calibri"/>
-                <w:b/>
-                <w:bCs/>
-                <w:sz w:val="22"/>
-                <w:szCs w:val="22"/>
-              </w:rPr>
-              <w:t>Rubro</w:t>
-            </w:r>
-          </w:p>
-        </w:tc>
-        <w:tc>
-          <w:tcPr>
-            <w:tcW w:w="0" w:type="auto"/>
-            <w:tcBorders>
-              <w:top w:val="single" w:sz="6" w:space="0" w:color="666666"/>
-              <w:left w:val="single" w:sz="6" w:space="0" w:color="666666"/>
-              <w:bottom w:val="single" w:sz="6" w:space="0" w:color="666666"/>
-              <w:right w:val="single" w:sz="6" w:space="0" w:color="666666"/>
-            </w:tcBorders>
-            <w:tcMar>
-              <w:top w:w="90" w:type="dxa"/>
-              <w:left w:w="90" w:type="dxa"/>
-              <w:bottom w:w="90" w:type="dxa"/>
-              <w:right w:w="90" w:type="dxa"/>
-            </w:tcMar>
-            <w:hideMark/>
-          </w:tcPr>
-          <w:p>
-            <w:pPr>
-              <w:spacing w:before="180" w:after="180"/>
-              <w:rPr>
-                <w:rFonts w:ascii="Calibri" w:eastAsia="Times New Roman" w:hAnsi="Calibri" w:cs="Calibri"/>
-                <w:b/>
-                <w:bCs/>
-                <w:sz w:val="22"/>
-                <w:szCs w:val="22"/>
-              </w:rPr>
-            </w:pPr>
-            <w:r>
-              <w:rPr>
-                <w:rFonts w:ascii="Calibri" w:eastAsia="Times New Roman" w:hAnsi="Calibri" w:cs="Calibri"/>
-                <w:b/>
-                <w:bCs/>
-                <w:sz w:val="22"/>
-                <w:szCs w:val="22"/>
-              </w:rPr>
-              <w:t>Evidencia observada al corte de junio</w:t>
-            </w:r>
-          </w:p>
-        </w:tc>
-      </w:tr>
-      <w:tr>
-        <w:tc>
-          <w:tcPr>
-            <w:tcW w:w="0" w:type="auto"/>
-            <w:tcBorders>
-              <w:top w:val="single" w:sz="6" w:space="0" w:color="666666"/>
-              <w:left w:val="single" w:sz="6" w:space="0" w:color="666666"/>
-              <w:bottom w:val="single" w:sz="6" w:space="0" w:color="666666"/>
-              <w:right w:val="single" w:sz="6" w:space="0" w:color="666666"/>
-            </w:tcBorders>
-            <w:tcMar>
-              <w:top w:w="90" w:type="dxa"/>
-              <w:left w:w="90" w:type="dxa"/>
-              <w:bottom w:w="90" w:type="dxa"/>
-              <w:right w:w="90" w:type="dxa"/>
-            </w:tcMar>
-            <w:hideMark/>
-          </w:tcPr>
-          <w:p>
-            <w:pPr>
-              <w:spacing w:before="180" w:after="180"/>
-              <w:rPr>
-                <w:rFonts w:ascii="Calibri" w:eastAsia="Times New Roman" w:hAnsi="Calibri" w:cs="Calibri"/>
-                <w:sz w:val="22"/>
-                <w:szCs w:val="22"/>
-              </w:rPr>
-            </w:pPr>
-            <w:r>
-              <w:rPr>
-                <w:rStyle w:val="Fuerte"/>
-                <w:rFonts w:ascii="Calibri" w:eastAsia="Times New Roman" w:hAnsi="Calibri" w:cs="Calibri"/>
-                <w:sz w:val="22"/>
-                <w:szCs w:val="22"/>
-              </w:rPr>
-              <w:t>Lotes ejecutados</w:t>
-            </w:r>
-          </w:p>
-        </w:tc>
-        <w:tc>
-          <w:tcPr>
-            <w:tcW w:w="0" w:type="auto"/>
-            <w:tcBorders>
-              <w:top w:val="single" w:sz="6" w:space="0" w:color="666666"/>
-              <w:left w:val="single" w:sz="6" w:space="0" w:color="666666"/>
-              <w:bottom w:val="single" w:sz="6" w:space="0" w:color="666666"/>
-              <w:right w:val="single" w:sz="6" w:space="0" w:color="666666"/>
-            </w:tcBorders>
-            <w:tcMar>
-              <w:top w:w="90" w:type="dxa"/>
-              <w:left w:w="90" w:type="dxa"/>
-              <w:bottom w:w="90" w:type="dxa"/>
-              <w:right w:w="90" w:type="dxa"/>
-            </w:tcMar>
-            <w:hideMark/>
-          </w:tcPr>
-          <w:p>
-            <w:pPr>
-              <w:spacing w:before="180" w:after="180"/>
-              <w:rPr>
-                <w:rFonts w:ascii="Calibri" w:eastAsia="Times New Roman" w:hAnsi="Calibri" w:cs="Calibri"/>
-                <w:sz w:val="22"/>
-                <w:szCs w:val="22"/>
-              </w:rPr>
-            </w:pPr>
-            <w:r>
-              <w:rPr>
-                <w:rFonts w:ascii="Calibri" w:eastAsia="Times New Roman" w:hAnsi="Calibri" w:cs="Calibri"/>
-                <w:sz w:val="22"/>
-                <w:szCs w:val="22"/>
-              </w:rPr>
-              <w:t>El sistema orquestador se encuentra pausado y estructurado para su primer *Sprint de Construcción*.</w:t>
-            </w:r>
-          </w:p>
-        </w:tc>
-      </w:tr>
-      <w:tr>
-        <w:tc>
-          <w:tcPr>
-            <w:tcW w:w="0" w:type="auto"/>
-            <w:tcBorders>
-              <w:top w:val="single" w:sz="6" w:space="0" w:color="666666"/>
-              <w:left w:val="single" w:sz="6" w:space="0" w:color="666666"/>
-              <w:bottom w:val="single" w:sz="6" w:space="0" w:color="666666"/>
-              <w:right w:val="single" w:sz="6" w:space="0" w:color="666666"/>
-            </w:tcBorders>
-            <w:tcMar>
-              <w:top w:w="90" w:type="dxa"/>
-              <w:left w:w="90" w:type="dxa"/>
-              <w:bottom w:w="90" w:type="dxa"/>
-              <w:right w:w="90" w:type="dxa"/>
-            </w:tcMar>
-            <w:hideMark/>
-          </w:tcPr>
-          <w:p>
-            <w:pPr>
-              <w:spacing w:before="180" w:after="180"/>
-              <w:rPr>
-                <w:rFonts w:ascii="Calibri" w:eastAsia="Times New Roman" w:hAnsi="Calibri" w:cs="Calibri"/>
-                <w:sz w:val="22"/>
-                <w:szCs w:val="22"/>
-              </w:rPr>
-            </w:pPr>
-            <w:r>
-              <w:rPr>
-                <w:rStyle w:val="Fuerte"/>
-                <w:rFonts w:ascii="Calibri" w:eastAsia="Times New Roman" w:hAnsi="Calibri" w:cs="Calibri"/>
-                <w:sz w:val="22"/>
-                <w:szCs w:val="22"/>
-              </w:rPr>
-              <w:lastRenderedPageBreak/>
-              <w:t>Procesamiento</w:t>
-            </w:r>
-          </w:p>
-        </w:tc>
-        <w:tc>
-          <w:tcPr>
-            <w:tcW w:w="0" w:type="auto"/>
-            <w:tcBorders>
-              <w:top w:val="single" w:sz="6" w:space="0" w:color="666666"/>
-              <w:left w:val="single" w:sz="6" w:space="0" w:color="666666"/>
-              <w:bottom w:val="single" w:sz="6" w:space="0" w:color="666666"/>
-              <w:right w:val="single" w:sz="6" w:space="0" w:color="666666"/>
-            </w:tcBorders>
-            <w:tcMar>
-              <w:top w:w="90" w:type="dxa"/>
-              <w:left w:w="90" w:type="dxa"/>
-              <w:bottom w:w="90" w:type="dxa"/>
-              <w:right w:w="90" w:type="dxa"/>
-            </w:tcMar>
-            <w:hideMark/>
-          </w:tcPr>
-          <w:p>
-            <w:pPr>
-              <w:spacing w:before="180" w:after="180"/>
-              <w:rPr>
-                <w:rFonts w:ascii="Calibri" w:eastAsia="Times New Roman" w:hAnsi="Calibri" w:cs="Calibri"/>
-                <w:sz w:val="22"/>
-                <w:szCs w:val="22"/>
-              </w:rPr>
-            </w:pPr>
-            <w:r>
-              <w:rPr>
-                <w:rFonts w:ascii="Calibri" w:eastAsia="Times New Roman" w:hAnsi="Calibri" w:cs="Calibri"/>
-                <w:sz w:val="22"/>
-                <w:szCs w:val="22"/>
-              </w:rPr>
-              <w:t>Core de Autenticació</w:t>
-            </w:r>
-            <w:r>
-              <w:rPr>
-                <w:rFonts w:ascii="Calibri" w:eastAsia="Times New Roman" w:hAnsi="Calibri" w:cs="Calibri"/>
-                <w:sz w:val="22"/>
-                <w:szCs w:val="22"/>
-              </w:rPr>
-              <w:t>n (JWT + SFTP Keys) completamente validado. SLA de descarga configurado (&lt; 10 segundos).</w:t>
-            </w:r>
-          </w:p>
-        </w:tc>
-      </w:tr>
-      <w:tr>
-        <w:tc>
-          <w:tcPr>
-            <w:tcW w:w="0" w:type="auto"/>
-            <w:tcBorders>
-              <w:top w:val="single" w:sz="6" w:space="0" w:color="666666"/>
-              <w:left w:val="single" w:sz="6" w:space="0" w:color="666666"/>
-              <w:bottom w:val="single" w:sz="6" w:space="0" w:color="666666"/>
-              <w:right w:val="single" w:sz="6" w:space="0" w:color="666666"/>
-            </w:tcBorders>
-            <w:tcMar>
-              <w:top w:w="90" w:type="dxa"/>
-              <w:left w:w="90" w:type="dxa"/>
-              <w:bottom w:w="90" w:type="dxa"/>
-              <w:right w:w="90" w:type="dxa"/>
-            </w:tcMar>
-            <w:hideMark/>
-          </w:tcPr>
-          <w:p>
-            <w:pPr>
-              <w:spacing w:before="180" w:after="180"/>
-              <w:rPr>
-                <w:rFonts w:ascii="Calibri" w:eastAsia="Times New Roman" w:hAnsi="Calibri" w:cs="Calibri"/>
-                <w:sz w:val="22"/>
-                <w:szCs w:val="22"/>
-              </w:rPr>
-            </w:pPr>
-            <w:r>
-              <w:rPr>
-                <w:rStyle w:val="Fuerte"/>
-                <w:rFonts w:ascii="Calibri" w:eastAsia="Times New Roman" w:hAnsi="Calibri" w:cs="Calibri"/>
-                <w:sz w:val="22"/>
-                <w:szCs w:val="22"/>
-              </w:rPr>
-              <w:t>Bitácora</w:t>
-            </w:r>
-          </w:p>
-        </w:tc>
-        <w:tc>
-          <w:tcPr>
-            <w:tcW w:w="0" w:type="auto"/>
-            <w:tcBorders>
-              <w:top w:val="single" w:sz="6" w:space="0" w:color="666666"/>
-              <w:left w:val="single" w:sz="6" w:space="0" w:color="666666"/>
-              <w:bottom w:val="single" w:sz="6" w:space="0" w:color="666666"/>
-              <w:right w:val="single" w:sz="6" w:space="0" w:color="666666"/>
-            </w:tcBorders>
-            <w:tcMar>
-              <w:top w:w="90" w:type="dxa"/>
-              <w:left w:w="90" w:type="dxa"/>
-              <w:bottom w:w="90" w:type="dxa"/>
-              <w:right w:w="90" w:type="dxa"/>
-            </w:tcMar>
-            <w:hideMark/>
-          </w:tcPr>
-          <w:p>
-            <w:pPr>
-              <w:spacing w:before="180" w:after="180"/>
-              <w:rPr>
-                <w:rFonts w:ascii="Calibri" w:eastAsia="Times New Roman" w:hAnsi="Calibri" w:cs="Calibri"/>
-                <w:sz w:val="22"/>
-                <w:szCs w:val="22"/>
-              </w:rPr>
-            </w:pPr>
-            <w:r>
-              <w:rPr>
-                <w:rFonts w:ascii="Calibri" w:eastAsia="Times New Roman" w:hAnsi="Calibri" w:cs="Calibri"/>
-                <w:sz w:val="22"/>
-                <w:szCs w:val="22"/>
-              </w:rPr>
-              <w:t xml:space="preserve">Archivo </w:t>
-            </w:r>
-            <w:r>
-              <w:rPr>
-                <w:rStyle w:val="CdigoHTML"/>
-              </w:rPr>
-              <w:t>RESUMEN-PAUSA-PROYECTO.md</w:t>
-            </w:r>
-            <w:r>
-              <w:rPr>
-                <w:rFonts w:ascii="Calibri" w:eastAsia="Times New Roman" w:hAnsi="Calibri" w:cs="Calibri"/>
-                <w:sz w:val="22"/>
-                <w:szCs w:val="22"/>
-              </w:rPr>
-              <w:t xml:space="preserve"> integrado como testigo histórico del avance hasta abril.</w:t>
-            </w:r>
-          </w:p>
-        </w:tc>
-      </w:tr>
-    </w:tbl>
+        <w:t>La reanudación operativa por parte del equipo sucesor es totalmente viable e inmediata a través de las siguientes etapas documentadas en la base de conocimiento:</w:t>
+      </w:r>
+    </w:p>
+    <w:p>
+      <w:pPr>
+        <w:pStyle w:val="NormalWeb"/>
+        <w:rPr>
+          <w:rFonts w:ascii="Calibri" w:hAnsi="Calibri" w:cs="Calibri"/>
+          <w:sz w:val="22"/>
+          <w:szCs w:val="22"/>
+        </w:rPr>
+      </w:pPr>
+      <w:r>
+        <w:rPr>
+          <w:rFonts w:ascii="Calibri" w:hAnsi="Calibri" w:cs="Calibri"/>
+          <w:sz w:val="22"/>
+          <w:szCs w:val="22"/>
+        </w:rPr>
+        <w:t xml:space="preserve">1. </w:t>
+      </w:r>
+      <w:r>
+        <w:rPr>
+          <w:rStyle w:val="Fuerte"/>
+          <w:rFonts w:ascii="Calibri" w:hAnsi="Calibri" w:cs="Calibri"/>
+          <w:sz w:val="22"/>
+          <w:szCs w:val="22"/>
+        </w:rPr>
+        <w:t>Migración de Ramas:</w:t>
+      </w:r>
+      <w:r>
+        <w:rPr>
+          <w:rFonts w:ascii="Calibri" w:hAnsi="Calibri" w:cs="Calibri"/>
+          <w:sz w:val="22"/>
+          <w:szCs w:val="22"/>
+        </w:rPr>
+        <w:t xml:space="preserve"> Aprobar el *Pull Request* de la rama </w:t>
+      </w:r>
+      <w:r>
+        <w:rPr>
+          <w:rStyle w:val="CdigoHTML"/>
+        </w:rPr>
+        <w:t>feature/vlarrea-fase-2</w:t>
+      </w:r>
+      <w:r>
+        <w:rPr>
+          <w:rFonts w:ascii="Calibri" w:hAnsi="Calibri" w:cs="Calibri"/>
+          <w:sz w:val="22"/>
+          <w:szCs w:val="22"/>
+        </w:rPr>
+        <w:t xml:space="preserve"> hacia la rama principal </w:t>
+      </w:r>
+      <w:r>
+        <w:rPr>
+          <w:rStyle w:val="CdigoHTML"/>
+        </w:rPr>
+        <w:t>master</w:t>
+      </w:r>
+      <w:r>
+        <w:rPr>
+          <w:rFonts w:ascii="Calibri" w:hAnsi="Calibri" w:cs="Calibri"/>
+          <w:sz w:val="22"/>
+          <w:szCs w:val="22"/>
+        </w:rPr>
+        <w:t>.</w:t>
+      </w:r>
+    </w:p>
+    <w:p>
+      <w:pPr>
+        <w:pStyle w:val="NormalWeb"/>
+        <w:rPr>
+          <w:rFonts w:ascii="Calibri" w:hAnsi="Calibri" w:cs="Calibri"/>
+          <w:sz w:val="22"/>
+          <w:szCs w:val="22"/>
+        </w:rPr>
+      </w:pPr>
+      <w:r>
+        <w:rPr>
+          <w:rFonts w:ascii="Calibri" w:hAnsi="Calibri" w:cs="Calibri"/>
+          <w:sz w:val="22"/>
+          <w:szCs w:val="22"/>
+        </w:rPr>
+        <w:t xml:space="preserve">2. </w:t>
+      </w:r>
+      <w:r>
+        <w:rPr>
+          <w:rStyle w:val="Fuerte"/>
+          <w:rFonts w:ascii="Calibri" w:hAnsi="Calibri" w:cs="Calibri"/>
+          <w:sz w:val="22"/>
+          <w:szCs w:val="22"/>
+        </w:rPr>
+        <w:t>Ejecución del Sprint 1:</w:t>
+      </w:r>
+      <w:r>
+        <w:rPr>
+          <w:rFonts w:ascii="Calibri" w:hAnsi="Calibri" w:cs="Calibri"/>
+          <w:sz w:val="22"/>
+          <w:szCs w:val="22"/>
+        </w:rPr>
+        <w:t xml:space="preserve"> Arrancar directamente con el desarrollo funcional de *Layouts* apoyándose en el motor orquestador asíncrono (Zero Persistence) que ya se entrega integrado.</w:t>
+      </w:r>
+    </w:p>
     <w:p>
       <w:pPr>
         <w:pStyle w:val="Ttulo2"/>
@@ -679,7 +456,26 @@
         <w:rPr>
           <w:rFonts w:ascii="Calibri" w:eastAsia="Times New Roman" w:hAnsi="Calibri" w:cs="Calibri"/>
         </w:rPr>
-        <w:t>4. Riesgos y Dependencias al Cierre de Junio</w:t>
+        <w:lastRenderedPageBreak/>
+        <w:t>4. Inventario de Entregables Finales (Handover Tecnológico)</w:t>
+      </w:r>
+    </w:p>
+    <w:p>
+      <w:pPr>
+        <w:pStyle w:val="NormalWeb"/>
+        <w:rPr>
+          <w:rFonts w:ascii="Calibri" w:hAnsi="Calibri" w:cs="Calibri"/>
+          <w:sz w:val="22"/>
+          <w:szCs w:val="22"/>
+        </w:rPr>
+      </w:pPr>
+      <w:r>
+        <w:rPr>
+          <w:rFonts w:ascii="Calibri" w:hAnsi="Calibri" w:cs="Calibri"/>
+          <w:sz w:val="22"/>
+          <w:szCs w:val="22"/>
+        </w:rPr>
+        <w:t>Como acta de cierre del componente Vida Saludable, se entregan los siguientes activos:</w:t>
       </w:r>
     </w:p>
     <w:p>
@@ -697,20 +493,11 @@
       </w:pPr>
       <w:r>
         <w:rPr>
-          <w:rStyle w:val="Fuerte"/>
-          <w:rFonts w:ascii="Calibri" w:eastAsia="Times New Roman" w:hAnsi="Calibri" w:cs="Calibri"/>
-          <w:sz w:val="22"/>
-          <w:szCs w:val="22"/>
-        </w:rPr>
-        <w:t>Dependencia:</w:t>
-      </w:r>
-      <w:r>
-        <w:rPr>
-          <w:rFonts w:ascii="Calibri" w:eastAsia="Times New Roman" w:hAnsi="Calibri" w:cs="Calibri"/>
-          <w:sz w:val="22"/>
-          <w:szCs w:val="22"/>
-        </w:rPr>
-        <w:t xml:space="preserve"> El reinicio de la operación de procesamiento masivo por CURP y descarga del IMSS depende de la validación final de *Layouts* con el área médica.</w:t>
+          <w:rFonts w:ascii="Calibri" w:eastAsia="Times New Roman" w:hAnsi="Calibri" w:cs="Calibri"/>
+          <w:sz w:val="22"/>
+          <w:szCs w:val="22"/>
+        </w:rPr>
+        <w:t>Repositorio completo con histórico de *commits* y refactorización estructural.</w:t>
       </w:r>
     </w:p>
     <w:p>
@@ -728,41 +515,18 @@
       </w:pPr>
       <w:r>
         <w:rPr>
-          <w:rStyle w:val="Fuerte"/>
-          <w:rFonts w:ascii="Calibri" w:eastAsia="Times New Roman" w:hAnsi="Calibri" w:cs="Calibri"/>
-          <w:sz w:val="22"/>
-          <w:szCs w:val="22"/>
-        </w:rPr>
-        <w:t>Riesgo:</w:t>
-      </w:r>
-      <w:r>
-        <w:rPr>
-          <w:rFonts w:ascii="Calibri" w:eastAsia="Times New Roman" w:hAnsi="Calibri" w:cs="Calibri"/>
-          <w:sz w:val="22"/>
-          <w:szCs w:val="22"/>
-        </w:rPr>
-        <w:t xml:space="preserve"> El tiempo de pausa prolongada podría implicar actualizaciones obligatorias en dependencias de Angular o Python al momento de retomarse.</w:t>
-      </w:r>
-    </w:p>
-    <w:p>
-      <w:pPr>
-        <w:pStyle w:val="Ttulo2"/>
-        <w:rPr>
-          <w:rFonts w:ascii="Calibri" w:eastAsia="Times New Roman" w:hAnsi="Calibri" w:cs="Calibri"/>
-        </w:rPr>
-      </w:pPr>
-      <w:r>
-        <w:rPr>
-          <w:rFonts w:ascii="Calibri" w:eastAsia="Times New Roman" w:hAnsi="Calibri" w:cs="Calibri"/>
-        </w:rPr>
-        <w:t>5. Próximos Pasos (Posteriores al Trimestre)</w:t>
+          <w:rFonts w:ascii="Calibri" w:eastAsia="Times New Roman" w:hAnsi="Calibri" w:cs="Calibri"/>
+          <w:sz w:val="22"/>
+          <w:szCs w:val="22"/>
+        </w:rPr>
+        <w:t>Conjunto de Pruebas Unitarias y *End-to-End* aprobadas y vinculadas a la canalización de Integración Continua (CI).</w:t>
       </w:r>
     </w:p>
     <w:p>
       <w:pPr>
         <w:numPr>
           <w:ilvl w:val="0"/>
-          <w:numId w:val="3"/>
+          <w:numId w:val="2"/>
         </w:numPr>
         <w:spacing w:before="100" w:beforeAutospacing="1" w:after="100" w:afterAutospacing="1"/>
         <w:rPr>
@@ -777,93 +541,21 @@
           <w:sz w:val="22"/>
           <w:szCs w:val="22"/>
         </w:rPr>
-        <w:t xml:space="preserve">Movilizar los artefactos y el código de la rama </w:t>
+        <w:t xml:space="preserve">Documentación técnica forense exhaustiva de la Fase 2 (Casos de Uso, Reportes Técnicos de Resolución de Issues y *Code Reviews* almacenados en </w:t>
       </w:r>
       <w:r>
         <w:rPr>
           <w:rStyle w:val="CdigoHTML"/>
         </w:rPr>
-        <w:t>feature/vlarrea-fase-2</w:t>
-      </w:r>
-      <w:r>
-        <w:rPr>
-          <w:rFonts w:ascii="Calibri" w:eastAsia="Times New Roman" w:hAnsi="Calibri" w:cs="Calibri"/>
-          <w:sz w:val="22"/>
-          <w:szCs w:val="22"/>
-        </w:rPr>
-        <w:t xml:space="preserve"> hacia la rama principal (</w:t>
-      </w:r>
-      <w:r>
-        <w:rPr>
-          <w:rStyle w:val="CdigoHTML"/>
-        </w:rPr>
-        <w:t>master</w:t>
-      </w:r>
-      <w:r>
-        <w:rPr>
-          <w:rFonts w:ascii="Calibri" w:eastAsia="Times New Roman" w:hAnsi="Calibri" w:cs="Calibri"/>
-          <w:sz w:val="22"/>
-          <w:szCs w:val="22"/>
-        </w:rPr>
-        <w:t>) tan pronto como se notifique la reanudación formal.</w:t>
-      </w:r>
-    </w:p>
-    <w:p>
-      <w:pPr>
-        <w:numPr>
-          <w:ilvl w:val="0"/>
-          <w:numId w:val="3"/>
-        </w:numPr>
-        <w:spacing w:before="100" w:beforeAutospacing="1" w:after="100" w:afterAutospacing="1"/>
-        <w:rPr>
-          <w:rFonts w:ascii="Calibri" w:eastAsia="Times New Roman" w:hAnsi="Calibri" w:cs="Calibri"/>
-          <w:sz w:val="22"/>
-          <w:szCs w:val="22"/>
-        </w:rPr>
-      </w:pPr>
-      <w:r>
-        <w:rPr>
-          <w:rFonts w:ascii="Calibri" w:eastAsia="Times New Roman" w:hAnsi="Calibri" w:cs="Calibri"/>
-          <w:sz w:val="22"/>
-          <w:szCs w:val="22"/>
-        </w:rPr>
-        <w:t xml:space="preserve">Iniciar el </w:t>
-      </w:r>
-      <w:r>
-        <w:rPr>
-          <w:rStyle w:val="Fuerte"/>
-          <w:rFonts w:ascii="Calibri" w:eastAsia="Times New Roman" w:hAnsi="Calibri" w:cs="Calibri"/>
-          <w:sz w:val="22"/>
-          <w:szCs w:val="22"/>
-        </w:rPr>
-        <w:t>Sprint 1 de Construcción</w:t>
-      </w:r>
-      <w:r>
-        <w:rPr>
-          <w:rFonts w:ascii="Calibri" w:eastAsia="Times New Roman" w:hAnsi="Calibri" w:cs="Calibri"/>
-          <w:sz w:val="22"/>
-          <w:szCs w:val="22"/>
-        </w:rPr>
-        <w:t xml:space="preserve"> enfocado al motor de orquestación de reportes PDF, apoyándose en la sólida infraestructura consolidada al cierre de este trimestre.</w:t>
-      </w:r>
-    </w:p>
-    <w:p>
-      <w:pPr>
-        <w:rPr>
-          <w:rFonts w:ascii="Calibri" w:eastAsia="Times New Roman" w:hAnsi="Calibri" w:cs="Calibri"/>
-          <w:sz w:val="22"/>
-          <w:szCs w:val="22"/>
-        </w:rPr>
-      </w:pPr>
-      <w:r>
-        <w:rPr>
-          <w:rFonts w:ascii="Calibri" w:eastAsia="Times New Roman" w:hAnsi="Calibri" w:cs="Calibri"/>
-          <w:sz w:val="22"/>
-          <w:szCs w:val="22"/>
-        </w:rPr>
-        <w:pict w14:anchorId="3DC6A068">
-          <v:rect id="_x0000_i1026" style="width:0;height:1.5pt" o:hralign="center" o:hrstd="t" o:hr="t" fillcolor="#a0a0a0" stroked="f"/>
-        </w:pict>
+        <w:t>/fase-2</w:t>
+      </w:r>
+      <w:r>
+        <w:rPr>
+          <w:rFonts w:ascii="Calibri" w:eastAsia="Times New Roman" w:hAnsi="Calibri" w:cs="Calibri"/>
+          <w:sz w:val="22"/>
+          <w:szCs w:val="22"/>
+        </w:rPr>
+        <w:t>).</w:t>
       </w:r>
     </w:p>
     <w:p>
@@ -877,30 +569,11 @@
       </w:pPr>
       <w:r>
         <w:rPr>
-          <w:rStyle w:val="Fuerte"/>
-          <w:rFonts w:ascii="Calibri" w:hAnsi="Calibri" w:cs="Calibri"/>
-          <w:sz w:val="22"/>
-          <w:szCs w:val="22"/>
-        </w:rPr>
-        <w:t>Comentarios adicionales:</w:t>
-      </w:r>
-    </w:p>
-    <w:p>
-      <w:pPr>
-        <w:pStyle w:val="NormalWeb"/>
-        <w:rPr>
-          <w:rFonts w:ascii="Calibri" w:hAnsi="Calibri" w:cs="Calibri"/>
-          <w:sz w:val="22"/>
-          <w:szCs w:val="22"/>
-        </w:rPr>
-      </w:pPr>
-      <w:r>
-        <w:rPr>
-          <w:rFonts w:ascii="Calibri" w:hAnsi="Calibri" w:cs="Calibri"/>
-          <w:sz w:val="22"/>
-          <w:szCs w:val="22"/>
-        </w:rPr>
-        <w:t>Este informe cierra satisfactoriamente la trazabilidad técnica del proyecto Vida Saludable para el trimestre, demostrando que no hubo regresiones técnicas durante su pausa y que el repositorio institucional preserva íntegramente su valor funcional y documental.</w:t>
+          <w:rFonts w:ascii="Calibri" w:hAnsi="Calibri" w:cs="Calibri"/>
+          <w:sz w:val="22"/>
+          <w:szCs w:val="22"/>
+        </w:rPr>
+        <w:t>Con la entrega de estos artefactos, el consultor certifica que el conocimiento, las metodologías de seguridad implementadas y la línea base del proyecto Vida Saludable quedan satisfactoriamente transferidos.</w:t>
       </w:r>
     </w:p>
     <w:sectPr>
@@ -916,9 +589,9 @@
 <file path=word/numbering.xml><?xml version="1.0" encoding="utf-8"?>
 <w:numbering xmlns:wpc="http://schemas.microsoft.com/office/word/2010/wordprocessingCanvas" xmlns:cx="http://schemas.microsoft.com/office/drawing/2014/chartex" xmlns:cx1="http://schemas.microsoft.com/office/drawing/2015/9/8/chartex" xmlns:cx2="http://schemas.microsoft.com/office/drawing/2015/10/21/chartex" xmlns:cx3="http://schemas.microsoft.com/office/drawing/2016/5/9/chartex" xmlns:cx4="http://schemas.microsoft.com/office/drawing/2016/5/10/chartex" xmlns:cx5="http://schemas.microsoft.com/office/drawing/2016/5/11/chartex" xmlns:cx6="http://schemas.microsoft.com/office/drawing/2016/5/12/chartex" xmlns:cx7="http://schemas.microsoft.com/office/drawing/2016/5/13/chartex" xmlns:cx8="http://schemas.microsoft.com/office/drawing/2016/5/14/chartex" xmlns:mc="http://schemas.openxmlformats.org/markup-compatibility/2006" xmlns:aink="http://schemas.microsoft.com/office/drawing/2016/ink" xmlns:am3d="http://schemas.microsoft.com/office/drawing/2017/model3d" xmlns:o="urn:schemas-microsoft-com:office:office" xmlns:oel="http://schemas.microsoft.com/office/2019/extlst" xmlns:r="http://schemas.openxmlformats.org/officeDocument/2006/relationships" xmlns:m="http://schemas.openxmlformats.org/officeDocument/2006/math" xmlns:v="urn:schemas-microsoft-com:vml" xmlns:wp14="http://schemas.microsoft.com/office/word/2010/wordprocessingDrawing" xmlns:wp="http://schemas.openxmlformats.org/drawingml/2006/wordprocessingDrawing" xmlns:w10="urn:schemas-microsoft-com:office:word" xmlns:w="http://schemas.openxmlformats.org/wordprocessingml/2006/main" xmlns:w14="http://schemas.microsoft.com/office/word/2010/wordml" xmlns:w15="http://schemas.microsoft.com/office/word/2012/wordml" xmlns:w16cex="http://schemas.microsoft.com/office/word/2018/wordml/cex" xmlns:w16cid="http://schemas.microsoft.com/office/word/2016/wordml/cid" xmlns:w16="http://schemas.microsoft.com/office/word/2018/wordml" xmlns:w16du="http://schemas.microsoft.com/office/word/2023/wordml/word16du" xmlns:w16sdtdh="http://schemas.microsoft.com/office/word/2020/wordml/sdtdatahash" xmlns:w16sdtfl="http://schemas.microsoft.com/office/word/2024/wordml/sdtformatlock" xmlns:w16se="http://schemas.microsoft.com/office/word/2015/wordml/symex" xmlns:wpg="http://schemas.microsoft.com/office/word/2010/wordprocessingGroup" xmlns:wpi="http://schemas.microsoft.com/office/word/2010/wordprocessingInk" xmlns:wne="http://schemas.microsoft.com/office/word/2006/wordml" xmlns:wps="http://schemas.microsoft.com/office/word/2010/wordprocessingShape" mc:Ignorable="w14 w15 w16se w16cid w16 w16cex w16sdtdh w16sdtfl w16du wp14">
   <w:abstractNum w:abstractNumId="0" w15:restartNumberingAfterBreak="0">
-    <w:nsid w:val="363C51F1"/>
+    <w:nsid w:val="2C3C3DE5"/>
     <w:multiLevelType w:val="multilevel"/>
-    <w:tmpl w:val="A532EEE6"/>
+    <w:tmpl w:val="5080CAD0"/>
     <w:lvl w:ilvl="0">
       <w:start w:val="1"/>
       <w:numFmt w:val="bullet"/>
@@ -1065,9 +738,9 @@
     </w:lvl>
   </w:abstractNum>
   <w:abstractNum w:abstractNumId="1" w15:restartNumberingAfterBreak="0">
-    <w:nsid w:val="65441CA7"/>
+    <w:nsid w:val="6FA0206E"/>
     <w:multiLevelType w:val="multilevel"/>
-    <w:tmpl w:val="D4A8A82C"/>
+    <w:tmpl w:val="3A1823EC"/>
     <w:lvl w:ilvl="0">
       <w:start w:val="1"/>
       <w:numFmt w:val="bullet"/>
@@ -1213,163 +886,11 @@
       </w:rPr>
     </w:lvl>
   </w:abstractNum>
-  <w:abstractNum w:abstractNumId="2" w15:restartNumberingAfterBreak="0">
-    <w:nsid w:val="69147DD6"/>
-    <w:multiLevelType w:val="multilevel"/>
-    <w:tmpl w:val="89506ADA"/>
-    <w:lvl w:ilvl="0">
-      <w:start w:val="1"/>
-      <w:numFmt w:val="bullet"/>
-      <w:lvlText w:val=""/>
-      <w:lvlJc w:val="left"/>
-      <w:pPr>
-        <w:tabs>
-          <w:tab w:val="num" w:pos="720"/>
-        </w:tabs>
-        <w:ind w:left="720" w:hanging="360"/>
-      </w:pPr>
-      <w:rPr>
-        <w:rFonts w:ascii="Symbol" w:hAnsi="Symbol" w:hint="default"/>
-        <w:sz w:val="20"/>
-      </w:rPr>
-    </w:lvl>
-    <w:lvl w:ilvl="1" w:tentative="1">
-      <w:start w:val="1"/>
-      <w:numFmt w:val="bullet"/>
-      <w:lvlText w:val="o"/>
-      <w:lvlJc w:val="left"/>
-      <w:pPr>
-        <w:tabs>
-          <w:tab w:val="num" w:pos="1440"/>
-        </w:tabs>
-        <w:ind w:left="1440" w:hanging="360"/>
-      </w:pPr>
-      <w:rPr>
-        <w:rFonts w:ascii="Courier New" w:hAnsi="Courier New" w:hint="default"/>
-        <w:sz w:val="20"/>
-      </w:rPr>
-    </w:lvl>
-    <w:lvl w:ilvl="2" w:tentative="1">
-      <w:start w:val="1"/>
-      <w:numFmt w:val="bullet"/>
-      <w:lvlText w:val=""/>
-      <w:lvlJc w:val="left"/>
-      <w:pPr>
-        <w:tabs>
-          <w:tab w:val="num" w:pos="2160"/>
-        </w:tabs>
-        <w:ind w:left="2160" w:hanging="360"/>
-      </w:pPr>
-      <w:rPr>
-        <w:rFonts w:ascii="Wingdings" w:hAnsi="Wingdings" w:hint="default"/>
-        <w:sz w:val="20"/>
-      </w:rPr>
-    </w:lvl>
-    <w:lvl w:ilvl="3" w:tentative="1">
-      <w:start w:val="1"/>
-      <w:numFmt w:val="bullet"/>
-      <w:lvlText w:val=""/>
-      <w:lvlJc w:val="left"/>
-      <w:pPr>
-        <w:tabs>
-          <w:tab w:val="num" w:pos="2880"/>
-        </w:tabs>
-        <w:ind w:left="2880" w:hanging="360"/>
-      </w:pPr>
-      <w:rPr>
-        <w:rFonts w:ascii="Wingdings" w:hAnsi="Wingdings" w:hint="default"/>
-        <w:sz w:val="20"/>
-      </w:rPr>
-    </w:lvl>
-    <w:lvl w:ilvl="4" w:tentative="1">
-      <w:start w:val="1"/>
-      <w:numFmt w:val="bullet"/>
-      <w:lvlText w:val=""/>
-      <w:lvlJc w:val="left"/>
-      <w:pPr>
-        <w:tabs>
-          <w:tab w:val="num" w:pos="3600"/>
-        </w:tabs>
-        <w:ind w:left="3600" w:hanging="360"/>
-      </w:pPr>
-      <w:rPr>
-        <w:rFonts w:ascii="Wingdings" w:hAnsi="Wingdings" w:hint="default"/>
-        <w:sz w:val="20"/>
-      </w:rPr>
-    </w:lvl>
-    <w:lvl w:ilvl="5" w:tentative="1">
-      <w:start w:val="1"/>
-      <w:numFmt w:val="bullet"/>
-      <w:lvlText w:val=""/>
-      <w:lvlJc w:val="left"/>
-      <w:pPr>
-        <w:tabs>
-          <w:tab w:val="num" w:pos="4320"/>
-        </w:tabs>
-        <w:ind w:left="4320" w:hanging="360"/>
-      </w:pPr>
-      <w:rPr>
-        <w:rFonts w:ascii="Wingdings" w:hAnsi="Wingdings" w:hint="default"/>
-        <w:sz w:val="20"/>
-      </w:rPr>
-    </w:lvl>
-    <w:lvl w:ilvl="6" w:tentative="1">
-      <w:start w:val="1"/>
-      <w:numFmt w:val="bullet"/>
-      <w:lvlText w:val=""/>
-      <w:lvlJc w:val="left"/>
-      <w:pPr>
-        <w:tabs>
-          <w:tab w:val="num" w:pos="5040"/>
-        </w:tabs>
-        <w:ind w:left="5040" w:hanging="360"/>
-      </w:pPr>
-      <w:rPr>
-        <w:rFonts w:ascii="Wingdings" w:hAnsi="Wingdings" w:hint="default"/>
-        <w:sz w:val="20"/>
-      </w:rPr>
-    </w:lvl>
-    <w:lvl w:ilvl="7" w:tentative="1">
-      <w:start w:val="1"/>
-      <w:numFmt w:val="bullet"/>
-      <w:lvlText w:val=""/>
-      <w:lvlJc w:val="left"/>
-      <w:pPr>
-        <w:tabs>
-          <w:tab w:val="num" w:pos="5760"/>
-        </w:tabs>
-        <w:ind w:left="5760" w:hanging="360"/>
-      </w:pPr>
-      <w:rPr>
-        <w:rFonts w:ascii="Wingdings" w:hAnsi="Wingdings" w:hint="default"/>
-        <w:sz w:val="20"/>
-      </w:rPr>
-    </w:lvl>
-    <w:lvl w:ilvl="8" w:tentative="1">
-      <w:start w:val="1"/>
-      <w:numFmt w:val="bullet"/>
-      <w:lvlText w:val=""/>
-      <w:lvlJc w:val="left"/>
-      <w:pPr>
-        <w:tabs>
-          <w:tab w:val="num" w:pos="6480"/>
-        </w:tabs>
-        <w:ind w:left="6480" w:hanging="360"/>
-      </w:pPr>
-      <w:rPr>
-        <w:rFonts w:ascii="Wingdings" w:hAnsi="Wingdings" w:hint="default"/>
-        <w:sz w:val="20"/>
-      </w:rPr>
-    </w:lvl>
-  </w:abstractNum>
-  <w:num w:numId="1" w16cid:durableId="1656958420">
-    <w:abstractNumId w:val="2"/>
+  <w:num w:numId="1" w16cid:durableId="1040931937">
+    <w:abstractNumId w:val="1"/>
   </w:num>
-  <w:num w:numId="2" w16cid:durableId="1081870431">
+  <w:num w:numId="2" w16cid:durableId="285552249">
     <w:abstractNumId w:val="0"/>
-  </w:num>
-  <w:num w:numId="3" w16cid:durableId="668408228">
-    <w:abstractNumId w:val="1"/>
   </w:num>
 </w:numbering>
 </file>

</xml_diff>

<commit_message>
docs: expansion masiva a master handover
</commit_message>
<xml_diff>
--- a/05-Mayo-Junio/Entregables/2026-06/01-Reporte_Especificaciones_Vida_Saludable_2026-06.docx
+++ b/05-Mayo-Junio/Entregables/2026-06/01-Reporte_Especificaciones_Vida_Saludable_2026-06.docx
@@ -13,7 +13,7 @@
         <w:rPr>
           <w:rFonts w:ascii="Calibri" w:eastAsia="Times New Roman" w:hAnsi="Calibri" w:cs="Calibri"/>
         </w:rPr>
-        <w:t>Reporte de Cierre: Especificaciones del Proyecto Vida Saludable</w:t>
+        <w:t>Acta de Entrega y Cierre: Especificaciones del Proyecto Vida Saludable (Fase 2)</w:t>
       </w:r>
     </w:p>
     <w:p>
@@ -32,7 +32,7 @@
           <w:sz w:val="22"/>
           <w:szCs w:val="22"/>
         </w:rPr>
-        <w:t>Mes:</w:t>
+        <w:t>Mes de Corte:</w:t>
       </w:r>
       <w:r>
         <w:rPr>
@@ -67,7 +67,7 @@
           <w:sz w:val="22"/>
           <w:szCs w:val="22"/>
         </w:rPr>
-        <w:t xml:space="preserve"> Victor Manuel Lelo de Larea Polanco </w:t>
+        <w:t xml:space="preserve"> Victor Manuel Lelo de Larrea Polanco </w:t>
       </w:r>
     </w:p>
     <w:p>
@@ -94,24 +94,51 @@
           <w:sz w:val="22"/>
           <w:szCs w:val="22"/>
         </w:rPr>
-        <w:t xml:space="preserve"> Coordinación de Proyectos de TI</w:t>
-      </w:r>
-    </w:p>
-    <w:p>
-      <w:pPr>
-        <w:rPr>
-          <w:rFonts w:ascii="Calibri" w:eastAsia="Times New Roman" w:hAnsi="Calibri" w:cs="Calibri"/>
-          <w:sz w:val="22"/>
-          <w:szCs w:val="22"/>
-        </w:rPr>
-      </w:pPr>
-      <w:r>
-        <w:rPr>
-          <w:rFonts w:ascii="Calibri" w:eastAsia="Times New Roman" w:hAnsi="Calibri" w:cs="Calibri"/>
-          <w:sz w:val="22"/>
-          <w:szCs w:val="22"/>
-        </w:rPr>
-        <w:pict w14:anchorId="46085C52">
+        <w:t xml:space="preserve"> Coordinación de Proyectos de TI </w:t>
+      </w:r>
+    </w:p>
+    <w:p>
+      <w:pPr>
+        <w:pStyle w:val="NormalWeb"/>
+        <w:rPr>
+          <w:rFonts w:ascii="Calibri" w:hAnsi="Calibri" w:cs="Calibri"/>
+          <w:sz w:val="22"/>
+          <w:szCs w:val="22"/>
+        </w:rPr>
+      </w:pPr>
+      <w:r>
+        <w:rPr>
+          <w:rStyle w:val="Fuerte"/>
+          <w:rFonts w:ascii="Calibri" w:hAnsi="Calibri" w:cs="Calibri"/>
+          <w:sz w:val="22"/>
+          <w:szCs w:val="22"/>
+        </w:rPr>
+        <w:t>Estado General del Repositorio:</w:t>
+      </w:r>
+      <w:r>
+        <w:rPr>
+          <w:rFonts w:ascii="Calibri" w:hAnsi="Calibri" w:cs="Calibri"/>
+          <w:sz w:val="22"/>
+          <w:szCs w:val="22"/>
+        </w:rPr>
+        <w:t xml:space="preserve"> Pausa Administrativa Congelada (Release-Ready)</w:t>
+      </w:r>
+    </w:p>
+    <w:p>
+      <w:pPr>
+        <w:rPr>
+          <w:rFonts w:ascii="Calibri" w:eastAsia="Times New Roman" w:hAnsi="Calibri" w:cs="Calibri"/>
+          <w:sz w:val="22"/>
+          <w:szCs w:val="22"/>
+        </w:rPr>
+      </w:pPr>
+      <w:r>
+        <w:rPr>
+          <w:rFonts w:ascii="Calibri" w:eastAsia="Times New Roman" w:hAnsi="Calibri" w:cs="Calibri"/>
+          <w:sz w:val="22"/>
+          <w:szCs w:val="22"/>
+        </w:rPr>
+        <w:pict w14:anchorId="015390AD">
           <v:rect id="_x0000_i1025" style="width:0;height:1.5pt" o:hralign="center" o:hrstd="t" o:hr="t" fillcolor="#a0a0a0" stroked="f"/>
         </w:pict>
       </w:r>
@@ -127,7 +154,7 @@
         <w:rPr>
           <w:rFonts w:ascii="Calibri" w:eastAsia="Times New Roman" w:hAnsi="Calibri" w:cs="Calibri"/>
         </w:rPr>
-        <w:t>1. Objeto del Entregable</w:t>
+        <w:t>1. Declaración Definitiva de Cierre del Proyecto</w:t>
       </w:r>
     </w:p>
     <w:p>
@@ -145,7 +172,24 @@
           <w:sz w:val="22"/>
           <w:szCs w:val="22"/>
         </w:rPr>
-        <w:t xml:space="preserve">Este documento presenta el acta final de estado y cierre trimestral de las actividades vinculadas al proyecto Vida Saludable, consolidando la herencia tecnológica depositada en el repositorio </w:t>
+        <w:t xml:space="preserve">El presente documento tiene el objetivo de servir como </w:t>
+      </w:r>
+      <w:r>
+        <w:rPr>
+          <w:rStyle w:val="Fuerte"/>
+          <w:rFonts w:ascii="Calibri" w:hAnsi="Calibri" w:cs="Calibri"/>
+          <w:sz w:val="22"/>
+          <w:szCs w:val="22"/>
+        </w:rPr>
+        <w:t>Acta Forense de Entrega Tecnológica</w:t>
+      </w:r>
+      <w:r>
+        <w:rPr>
+          <w:rFonts w:ascii="Calibri" w:hAnsi="Calibri" w:cs="Calibri"/>
+          <w:sz w:val="22"/>
+          <w:szCs w:val="22"/>
+        </w:rPr>
+        <w:t xml:space="preserve"> para el repositorio institucional </w:t>
       </w:r>
       <w:r>
         <w:rPr>
@@ -159,7 +203,61 @@
           <w:sz w:val="22"/>
           <w:szCs w:val="22"/>
         </w:rPr>
-        <w:t>. Sirve como constancia de que la arquitectura diseñada y migrada se transfiere en óptimas condiciones operativas para su futura explotación.</w:t>
+        <w:t xml:space="preserve">. Constituye un resguardo integral del esfuerzo técnico vertido a lo largo del segundo trimestre de 2026 (abril, mayo y junio) en el diseño, desarrollo, migración y blindaje cibernético de la denominada "Fase 2" del sistema orquestador. </w:t>
+      </w:r>
+    </w:p>
+    <w:p>
+      <w:pPr>
+        <w:pStyle w:val="NormalWeb"/>
+        <w:rPr>
+          <w:rFonts w:ascii="Calibri" w:hAnsi="Calibri" w:cs="Calibri"/>
+          <w:sz w:val="22"/>
+          <w:szCs w:val="22"/>
+        </w:rPr>
+      </w:pPr>
+      <w:r>
+        <w:rPr>
+          <w:rFonts w:ascii="Calibri" w:hAnsi="Calibri" w:cs="Calibri"/>
+          <w:sz w:val="22"/>
+          <w:szCs w:val="22"/>
+        </w:rPr>
+        <w:t xml:space="preserve">El proyecto se entrega al equipo sucesor en un estado de </w:t>
+      </w:r>
+      <w:r>
+        <w:rPr>
+          <w:rStyle w:val="Fuerte"/>
+          <w:rFonts w:ascii="Calibri" w:hAnsi="Calibri" w:cs="Calibri"/>
+          <w:sz w:val="22"/>
+          <w:szCs w:val="22"/>
+        </w:rPr>
+        <w:t>congelamiento funcional prístino</w:t>
+      </w:r>
+      <w:r>
+        <w:rPr>
+          <w:rFonts w:ascii="Calibri" w:hAnsi="Calibri" w:cs="Calibri"/>
+          <w:sz w:val="22"/>
+          <w:szCs w:val="22"/>
+        </w:rPr>
+        <w:t>, con una línea base inquebrantable aprobada mediante exhaustivas auditorías de seguridad y ciclos de validación E2E (*End-to-End*). La robustez arquitectónica depositada garantiza que, una vez que la Secretaría autorice el des-congelamiento del proyecto, el *Sprint 1* podrá arrancarse sin fricción tecnológica alguna, gozando de una plataforma resiliente y auditada.</w:t>
+      </w:r>
+    </w:p>
+    <w:p>
+      <w:pPr>
+        <w:rPr>
+          <w:rFonts w:ascii="Calibri" w:eastAsia="Times New Roman" w:hAnsi="Calibri" w:cs="Calibri"/>
+          <w:sz w:val="22"/>
+          <w:szCs w:val="22"/>
+        </w:rPr>
+      </w:pPr>
+      <w:r>
+        <w:rPr>
+          <w:rFonts w:ascii="Calibri" w:eastAsia="Times New Roman" w:hAnsi="Calibri" w:cs="Calibri"/>
+          <w:sz w:val="22"/>
+          <w:szCs w:val="22"/>
+        </w:rPr>
+        <w:pict w14:anchorId="7DE1E634">
+          <v:rect id="_x0000_i1026" style="width:0;height:1.5pt" o:hralign="center" o:hrstd="t" o:hr="t" fillcolor="#a0a0a0" stroked="f"/>
+        </w:pict>
       </w:r>
     </w:p>
     <w:p>
@@ -173,7 +271,7 @@
         <w:rPr>
           <w:rFonts w:ascii="Calibri" w:eastAsia="Times New Roman" w:hAnsi="Calibri" w:cs="Calibri"/>
         </w:rPr>
-        <w:t>2. Herencia Arquitectónica y Estado Final</w:t>
+        <w:t>2. Evolución Arquitectónica (De Monolito a "Zero Persistence")</w:t>
       </w:r>
     </w:p>
     <w:p>
@@ -191,7 +289,35 @@
           <w:sz w:val="22"/>
           <w:szCs w:val="22"/>
         </w:rPr>
-        <w:t>A la fecha de corte, el proyecto conserva su estado de congelamiento administrativo (pausa técnica) con una línea base blindada y un código fuente completamente resiliente y refactorizado:</w:t>
+        <w:t xml:space="preserve">La migración hacia la Fase 2 en la rama </w:t>
+      </w:r>
+      <w:r>
+        <w:rPr>
+          <w:rStyle w:val="CdigoHTML"/>
+        </w:rPr>
+        <w:t>feature/vlarrea-fase-2</w:t>
+      </w:r>
+      <w:r>
+        <w:rPr>
+          <w:rFonts w:ascii="Calibri" w:hAnsi="Calibri" w:cs="Calibri"/>
+          <w:sz w:val="22"/>
+          <w:szCs w:val="22"/>
+        </w:rPr>
+        <w:t xml:space="preserve"> eliminó progresivamente el código legado de la Fase 1 (caracterizada por procesamientos en consola inseguros y sin transaccionalidad). La nueva arquitectura que hoy se transfiere opera bajo los siguientes estandartes técnicos:</w:t>
+      </w:r>
+    </w:p>
+    <w:p>
+      <w:pPr>
+        <w:pStyle w:val="Ttulo3"/>
+        <w:rPr>
+          <w:rFonts w:ascii="Calibri" w:eastAsia="Times New Roman" w:hAnsi="Calibri" w:cs="Calibri"/>
+        </w:rPr>
+      </w:pPr>
+      <w:r>
+        <w:rPr>
+          <w:rFonts w:ascii="Calibri" w:eastAsia="Times New Roman" w:hAnsi="Calibri" w:cs="Calibri"/>
+        </w:rPr>
+        <w:t>2.1 Pila Tecnológica Entregada</w:t>
       </w:r>
     </w:p>
     <w:p>
@@ -214,15 +340,46 @@
           <w:sz w:val="22"/>
           <w:szCs w:val="22"/>
         </w:rPr>
-        <w:t>Core de Infraestructura:</w:t>
-      </w:r>
-      <w:r>
-        <w:rPr>
-          <w:rFonts w:ascii="Calibri" w:eastAsia="Times New Roman" w:hAnsi="Calibri" w:cs="Calibri"/>
-          <w:sz w:val="22"/>
-          <w:szCs w:val="22"/>
-        </w:rPr>
-        <w:t xml:space="preserve"> El backend asíncrono (FastAPI, pg8000 puro) y la integración UI (Angular 18) quedan formalmente segregados y documentados.</w:t>
+        <w:t>Backend Asíncrono de Orquestación:</w:t>
+      </w:r>
+      <w:r>
+        <w:rPr>
+          <w:rFonts w:ascii="Calibri" w:eastAsia="Times New Roman" w:hAnsi="Calibri" w:cs="Calibri"/>
+          <w:sz w:val="22"/>
+          <w:szCs w:val="22"/>
+        </w:rPr>
+        <w:t xml:space="preserve"> Orquestado sobre </w:t>
+      </w:r>
+      <w:r>
+        <w:rPr>
+          <w:rStyle w:val="Fuerte"/>
+          <w:rFonts w:ascii="Calibri" w:eastAsia="Times New Roman" w:hAnsi="Calibri" w:cs="Calibri"/>
+          <w:sz w:val="22"/>
+          <w:szCs w:val="22"/>
+        </w:rPr>
+        <w:t>Python 3.14 con FastAPI</w:t>
+      </w:r>
+      <w:r>
+        <w:rPr>
+          <w:rFonts w:ascii="Calibri" w:eastAsia="Times New Roman" w:hAnsi="Calibri" w:cs="Calibri"/>
+          <w:sz w:val="22"/>
+          <w:szCs w:val="22"/>
+        </w:rPr>
+        <w:t xml:space="preserve">, lo cual permite administrar la saturación de los servidores web del IMSS limitando la ráfaga de descargas mediante un riguroso </w:t>
+      </w:r>
+      <w:r>
+        <w:rPr>
+          <w:rStyle w:val="CdigoHTML"/>
+        </w:rPr>
+        <w:t>ThreadPoolExecutor</w:t>
+      </w:r>
+      <w:r>
+        <w:rPr>
+          <w:rFonts w:ascii="Calibri" w:eastAsia="Times New Roman" w:hAnsi="Calibri" w:cs="Calibri"/>
+          <w:sz w:val="22"/>
+          <w:szCs w:val="22"/>
+        </w:rPr>
+        <w:t>.</w:t>
       </w:r>
     </w:p>
     <w:p>
@@ -245,15 +402,33 @@
           <w:sz w:val="22"/>
           <w:szCs w:val="22"/>
         </w:rPr>
-        <w:t>Auditoría de Vulnerabilidades Previas:</w:t>
-      </w:r>
-      <w:r>
-        <w:rPr>
-          <w:rFonts w:ascii="Calibri" w:eastAsia="Times New Roman" w:hAnsi="Calibri" w:cs="Calibri"/>
-          <w:sz w:val="22"/>
-          <w:szCs w:val="22"/>
-        </w:rPr>
-        <w:t xml:space="preserve"> Las incidencias Críticas de inyección SQL (Issue 61), cifrado de cliente IMSS con GCM (Issue 60) y ofuscación de CURP en GraphQL (Issue 59) fueron resueltas por completo mediante implementaciones rigurosas, cubiertas por pruebas *End-to-End* en Cypress y certificadas con *Unit Tests*.</w:t>
+        <w:lastRenderedPageBreak/>
+        <w:t>Motor de Consultas Unificado (GraphQL):</w:t>
+      </w:r>
+      <w:r>
+        <w:rPr>
+          <w:rFonts w:ascii="Calibri" w:eastAsia="Times New Roman" w:hAnsi="Calibri" w:cs="Calibri"/>
+          <w:sz w:val="22"/>
+          <w:szCs w:val="22"/>
+        </w:rPr>
+        <w:t xml:space="preserve"> Despliegue del motor </w:t>
+      </w:r>
+      <w:r>
+        <w:rPr>
+          <w:rStyle w:val="Fuerte"/>
+          <w:rFonts w:ascii="Calibri" w:eastAsia="Times New Roman" w:hAnsi="Calibri" w:cs="Calibri"/>
+          <w:sz w:val="22"/>
+          <w:szCs w:val="22"/>
+        </w:rPr>
+        <w:t>Strawberry GraphQL</w:t>
+      </w:r>
+      <w:r>
+        <w:rPr>
+          <w:rFonts w:ascii="Calibri" w:eastAsia="Times New Roman" w:hAnsi="Calibri" w:cs="Calibri"/>
+          <w:sz w:val="22"/>
+          <w:szCs w:val="22"/>
+        </w:rPr>
+        <w:t>, eliminando las interfaces REST dispares y garantizando un control estricto sobre el *Over-fetching* de datos (solucionando las fugas de información masiva).</w:t>
       </w:r>
     </w:p>
     <w:p>
@@ -276,43 +451,173 @@
           <w:sz w:val="22"/>
           <w:szCs w:val="22"/>
         </w:rPr>
-        <w:t>Cero Regresiones:</w:t>
-      </w:r>
-      <w:r>
-        <w:rPr>
-          <w:rFonts w:ascii="Calibri" w:eastAsia="Times New Roman" w:hAnsi="Calibri" w:cs="Calibri"/>
-          <w:sz w:val="22"/>
-          <w:szCs w:val="22"/>
-        </w:rPr>
-        <w:t xml:space="preserve"> El historial técnico de incidencias (</w:t>
+        <w:t>Consistencia Transaccional (ACID):</w:t>
+      </w:r>
+      <w:r>
+        <w:rPr>
+          <w:rFonts w:ascii="Calibri" w:eastAsia="Times New Roman" w:hAnsi="Calibri" w:cs="Calibri"/>
+          <w:sz w:val="22"/>
+          <w:szCs w:val="22"/>
+        </w:rPr>
+        <w:t xml:space="preserve"> Migración del guardado en CSV plano a la infraestructura madura de </w:t>
+      </w:r>
+      <w:r>
+        <w:rPr>
+          <w:rStyle w:val="Fuerte"/>
+          <w:rFonts w:ascii="Calibri" w:eastAsia="Times New Roman" w:hAnsi="Calibri" w:cs="Calibri"/>
+          <w:sz w:val="22"/>
+          <w:szCs w:val="22"/>
+        </w:rPr>
+        <w:t>PostgreSQL 14</w:t>
+      </w:r>
+      <w:r>
+        <w:rPr>
+          <w:rFonts w:ascii="Calibri" w:eastAsia="Times New Roman" w:hAnsi="Calibri" w:cs="Calibri"/>
+          <w:sz w:val="22"/>
+          <w:szCs w:val="22"/>
+        </w:rPr>
+        <w:t xml:space="preserve">, orquestado vía </w:t>
       </w:r>
       <w:r>
         <w:rPr>
           <w:rStyle w:val="CdigoHTML"/>
         </w:rPr>
-        <w:t>RESUMEN-PAUSA-PROYECTO.md</w:t>
-      </w:r>
-      <w:r>
-        <w:rPr>
-          <w:rFonts w:ascii="Calibri" w:eastAsia="Times New Roman" w:hAnsi="Calibri" w:cs="Calibri"/>
-          <w:sz w:val="22"/>
-          <w:szCs w:val="22"/>
-        </w:rPr>
-        <w:t xml:space="preserve"> y documentos </w:t>
+        <w:t>pg8000</w:t>
+      </w:r>
+      <w:r>
+        <w:rPr>
+          <w:rFonts w:ascii="Calibri" w:eastAsia="Times New Roman" w:hAnsi="Calibri" w:cs="Calibri"/>
+          <w:sz w:val="22"/>
+          <w:szCs w:val="22"/>
+        </w:rPr>
+        <w:t xml:space="preserve"> (Driver puro de Python) para blindar la lectura y evitar bloqueos en tablas críticas como </w:t>
       </w:r>
       <w:r>
         <w:rPr>
           <w:rStyle w:val="CdigoHTML"/>
         </w:rPr>
-        <w:t>RCA_*</w:t>
-      </w:r>
-      <w:r>
-        <w:rPr>
-          <w:rFonts w:ascii="Calibri" w:eastAsia="Times New Roman" w:hAnsi="Calibri" w:cs="Calibri"/>
-          <w:sz w:val="22"/>
-          <w:szCs w:val="22"/>
-        </w:rPr>
-        <w:t>) se entrega al corriente para proveer contexto claro al equipo receptor.</w:t>
+        <w:t>CurpProcesada</w:t>
+      </w:r>
+      <w:r>
+        <w:rPr>
+          <w:rFonts w:ascii="Calibri" w:eastAsia="Times New Roman" w:hAnsi="Calibri" w:cs="Calibri"/>
+          <w:sz w:val="22"/>
+          <w:szCs w:val="22"/>
+        </w:rPr>
+        <w:t xml:space="preserve"> y </w:t>
+      </w:r>
+      <w:r>
+        <w:rPr>
+          <w:rStyle w:val="CdigoHTML"/>
+        </w:rPr>
+        <w:t>BitacoraEvento</w:t>
+      </w:r>
+      <w:r>
+        <w:rPr>
+          <w:rFonts w:ascii="Calibri" w:eastAsia="Times New Roman" w:hAnsi="Calibri" w:cs="Calibri"/>
+          <w:sz w:val="22"/>
+          <w:szCs w:val="22"/>
+        </w:rPr>
+        <w:t>.</w:t>
+      </w:r>
+    </w:p>
+    <w:p>
+      <w:pPr>
+        <w:pStyle w:val="Ttulo3"/>
+        <w:rPr>
+          <w:rFonts w:ascii="Calibri" w:eastAsia="Times New Roman" w:hAnsi="Calibri" w:cs="Calibri"/>
+        </w:rPr>
+      </w:pPr>
+      <w:r>
+        <w:rPr>
+          <w:rFonts w:ascii="Calibri" w:eastAsia="Times New Roman" w:hAnsi="Calibri" w:cs="Calibri"/>
+        </w:rPr>
+        <w:t>2.2 Diagrama Integral del Flujo Orquestador (Handover de Procesos)</w:t>
+      </w:r>
+    </w:p>
+    <w:p>
+      <w:pPr>
+        <w:rPr>
+          <w:rFonts w:ascii="Calibri" w:eastAsia="Times New Roman" w:hAnsi="Calibri" w:cs="Calibri"/>
+          <w:sz w:val="22"/>
+          <w:szCs w:val="22"/>
+        </w:rPr>
+      </w:pPr>
+      <w:r>
+        <w:rPr>
+          <w:rFonts w:ascii="Calibri" w:eastAsia="Times New Roman" w:hAnsi="Calibri" w:cs="Calibri"/>
+          <w:noProof/>
+          <w:sz w:val="22"/>
+          <w:szCs w:val="22"/>
+        </w:rPr>
+        <w:lastRenderedPageBreak/>
+        <w:drawing>
+          <wp:inline distT="0" distB="0" distL="0" distR="0" wp14:anchorId="5E496348" wp14:editId="4072B96B">
+            <wp:extent cx="7741920" cy="15910560"/>
+            <wp:effectExtent l="0" t="0" r="0" b="0"/>
+            <wp:docPr id="3" name="Imagen 3"/>
+            <wp:cNvGraphicFramePr>
+              <a:graphicFrameLocks xmlns:a="http://schemas.openxmlformats.org/drawingml/2006/main" noChangeAspect="1"/>
+            </wp:cNvGraphicFramePr>
+            <a:graphic xmlns:a="http://schemas.openxmlformats.org/drawingml/2006/main">
+              <a:graphicData uri="http://schemas.openxmlformats.org/drawingml/2006/picture">
+                <pic:pic xmlns:pic="http://schemas.openxmlformats.org/drawingml/2006/picture">
+                  <pic:nvPicPr>
+                    <pic:cNvPr id="0" name="Picture 3"/>
+                    <pic:cNvPicPr>
+                      <a:picLocks noChangeAspect="1" noChangeArrowheads="1"/>
+                    </pic:cNvPicPr>
+                  </pic:nvPicPr>
+                  <pic:blipFill>
+                    <a:blip r:embed="rId5">
+                      <a:extLst>
+                        <a:ext uri="{28A0092B-C50C-407E-A947-70E740481C1C}">
+                          <a14:useLocalDpi xmlns:a14="http://schemas.microsoft.com/office/drawing/2010/main" val="0"/>
+                        </a:ext>
+                      </a:extLst>
+                    </a:blip>
+                    <a:srcRect/>
+                    <a:stretch>
+                      <a:fillRect/>
+                    </a:stretch>
+                  </pic:blipFill>
+                  <pic:spPr bwMode="auto">
+                    <a:xfrm>
+                      <a:off x="0" y="0"/>
+                      <a:ext cx="7741920" cy="15910560"/>
+                    </a:xfrm>
+                    <a:prstGeom prst="rect">
+                      <a:avLst/>
+                    </a:prstGeom>
+                    <a:noFill/>
+                    <a:ln>
+                      <a:noFill/>
+                    </a:ln>
+                  </pic:spPr>
+                </pic:pic>
+              </a:graphicData>
+            </a:graphic>
+          </wp:inline>
+        </w:drawing>
+      </w:r>
+    </w:p>
+    <w:p>
+      <w:pPr>
+        <w:rPr>
+          <w:rFonts w:ascii="Calibri" w:eastAsia="Times New Roman" w:hAnsi="Calibri" w:cs="Calibri"/>
+          <w:sz w:val="22"/>
+          <w:szCs w:val="22"/>
+        </w:rPr>
+      </w:pPr>
+      <w:r>
+        <w:rPr>
+          <w:rFonts w:ascii="Calibri" w:eastAsia="Times New Roman" w:hAnsi="Calibri" w:cs="Calibri"/>
+          <w:sz w:val="22"/>
+          <w:szCs w:val="22"/>
+        </w:rPr>
+        <w:pict w14:anchorId="0C4005CE">
+          <v:rect id="_x0000_i1028" style="width:0;height:1.5pt" o:hralign="center" o:hrstd="t" o:hr="t" fillcolor="#a0a0a0" stroked="f"/>
+        </w:pict>
       </w:r>
     </w:p>
     <w:p>
@@ -326,7 +631,7 @@
         <w:rPr>
           <w:rFonts w:ascii="Calibri" w:eastAsia="Times New Roman" w:hAnsi="Calibri" w:cs="Calibri"/>
         </w:rPr>
-        <w:t>3. Instructivo para la Reactivación</w:t>
+        <w:t>3. Matriz de Layouts de Operación Transaccional</w:t>
       </w:r>
     </w:p>
     <w:p>
@@ -344,9 +649,670 @@
           <w:sz w:val="22"/>
           <w:szCs w:val="22"/>
         </w:rPr>
-        <w:t>La reanudación operativa por parte del equipo sucesor es totalmente viable e inmediata a través de las siguientes etapas documentadas en la base de conocimiento:</w:t>
-      </w:r>
-    </w:p>
+        <w:t>A lo largo del proyecto, la inyección y limpieza de datos fueron normalizadas estableciendo reglas de oro para la curación de información. Los documentos entregados para la alimentación masiva (*Layouts*) se dividen en tres universos mutuamente excluyentes, los cuales deben ser manejados por el equipo receptor:</w:t>
+      </w:r>
+    </w:p>
+    <w:tbl>
+      <w:tblPr>
+        <w:tblW w:w="5000" w:type="pct"/>
+        <w:tblCellMar>
+          <w:top w:w="15" w:type="dxa"/>
+          <w:left w:w="15" w:type="dxa"/>
+          <w:bottom w:w="15" w:type="dxa"/>
+          <w:right w:w="15" w:type="dxa"/>
+        </w:tblCellMar>
+        <w:tblLook w:val="04A0" w:firstRow="1" w:lastRow="0" w:firstColumn="1" w:lastColumn="0" w:noHBand="0" w:noVBand="1"/>
+      </w:tblPr>
+      <w:tblGrid>
+        <w:gridCol w:w="3541"/>
+        <w:gridCol w:w="1484"/>
+        <w:gridCol w:w="2006"/>
+        <w:gridCol w:w="1791"/>
+      </w:tblGrid>
+      <w:tr>
+        <w:trPr>
+          <w:tblHeader/>
+        </w:trPr>
+        <w:tc>
+          <w:tcPr>
+            <w:tcW w:w="0" w:type="auto"/>
+            <w:tcBorders>
+              <w:top w:val="single" w:sz="6" w:space="0" w:color="666666"/>
+              <w:left w:val="single" w:sz="6" w:space="0" w:color="666666"/>
+              <w:bottom w:val="single" w:sz="6" w:space="0" w:color="666666"/>
+              <w:right w:val="single" w:sz="6" w:space="0" w:color="666666"/>
+            </w:tcBorders>
+            <w:tcMar>
+              <w:top w:w="90" w:type="dxa"/>
+              <w:left w:w="90" w:type="dxa"/>
+              <w:bottom w:w="90" w:type="dxa"/>
+              <w:right w:w="90" w:type="dxa"/>
+            </w:tcMar>
+            <w:hideMark/>
+          </w:tcPr>
+          <w:p>
+            <w:pPr>
+              <w:spacing w:before="180" w:after="180"/>
+              <w:rPr>
+                <w:rFonts w:ascii="Calibri" w:eastAsia="Times New Roman" w:hAnsi="Calibri" w:cs="Calibri"/>
+                <w:b/>
+                <w:bCs/>
+                <w:sz w:val="22"/>
+                <w:szCs w:val="22"/>
+              </w:rPr>
+            </w:pPr>
+            <w:r>
+              <w:rPr>
+                <w:rFonts w:ascii="Calibri" w:eastAsia="Times New Roman" w:hAnsi="Calibri" w:cs="Calibri"/>
+                <w:b/>
+                <w:bCs/>
+                <w:sz w:val="22"/>
+                <w:szCs w:val="22"/>
+              </w:rPr>
+              <w:t>Formato</w:t>
+            </w:r>
+          </w:p>
+        </w:tc>
+        <w:tc>
+          <w:tcPr>
+            <w:tcW w:w="0" w:type="auto"/>
+            <w:tcBorders>
+              <w:top w:val="single" w:sz="6" w:space="0" w:color="666666"/>
+              <w:left w:val="single" w:sz="6" w:space="0" w:color="666666"/>
+              <w:bottom w:val="single" w:sz="6" w:space="0" w:color="666666"/>
+              <w:right w:val="single" w:sz="6" w:space="0" w:color="666666"/>
+            </w:tcBorders>
+            <w:tcMar>
+              <w:top w:w="90" w:type="dxa"/>
+              <w:left w:w="90" w:type="dxa"/>
+              <w:bottom w:w="90" w:type="dxa"/>
+              <w:right w:w="90" w:type="dxa"/>
+            </w:tcMar>
+            <w:hideMark/>
+          </w:tcPr>
+          <w:p>
+            <w:pPr>
+              <w:spacing w:before="180" w:after="180"/>
+              <w:rPr>
+                <w:rFonts w:ascii="Calibri" w:eastAsia="Times New Roman" w:hAnsi="Calibri" w:cs="Calibri"/>
+                <w:b/>
+                <w:bCs/>
+                <w:sz w:val="22"/>
+                <w:szCs w:val="22"/>
+              </w:rPr>
+            </w:pPr>
+            <w:r>
+              <w:rPr>
+                <w:rFonts w:ascii="Calibri" w:eastAsia="Times New Roman" w:hAnsi="Calibri" w:cs="Calibri"/>
+                <w:b/>
+                <w:bCs/>
+                <w:sz w:val="22"/>
+                <w:szCs w:val="22"/>
+              </w:rPr>
+              <w:t>Finalidad (Gobernanza)</w:t>
+            </w:r>
+          </w:p>
+        </w:tc>
+        <w:tc>
+          <w:tcPr>
+            <w:tcW w:w="0" w:type="auto"/>
+            <w:tcBorders>
+              <w:top w:val="single" w:sz="6" w:space="0" w:color="666666"/>
+              <w:left w:val="single" w:sz="6" w:space="0" w:color="666666"/>
+              <w:bottom w:val="single" w:sz="6" w:space="0" w:color="666666"/>
+              <w:right w:val="single" w:sz="6" w:space="0" w:color="666666"/>
+            </w:tcBorders>
+            <w:tcMar>
+              <w:top w:w="90" w:type="dxa"/>
+              <w:left w:w="90" w:type="dxa"/>
+              <w:bottom w:w="90" w:type="dxa"/>
+              <w:right w:w="90" w:type="dxa"/>
+            </w:tcMar>
+            <w:hideMark/>
+          </w:tcPr>
+          <w:p>
+            <w:pPr>
+              <w:spacing w:before="180" w:after="180"/>
+              <w:rPr>
+                <w:rFonts w:ascii="Calibri" w:eastAsia="Times New Roman" w:hAnsi="Calibri" w:cs="Calibri"/>
+                <w:b/>
+                <w:bCs/>
+                <w:sz w:val="22"/>
+                <w:szCs w:val="22"/>
+              </w:rPr>
+            </w:pPr>
+            <w:r>
+              <w:rPr>
+                <w:rFonts w:ascii="Calibri" w:eastAsia="Times New Roman" w:hAnsi="Calibri" w:cs="Calibri"/>
+                <w:b/>
+                <w:bCs/>
+                <w:sz w:val="22"/>
+                <w:szCs w:val="22"/>
+              </w:rPr>
+              <w:t>Condicionantes de Seguridad (Constraints SQL)</w:t>
+            </w:r>
+          </w:p>
+        </w:tc>
+        <w:tc>
+          <w:tcPr>
+            <w:tcW w:w="0" w:type="auto"/>
+            <w:tcBorders>
+              <w:top w:val="single" w:sz="6" w:space="0" w:color="666666"/>
+              <w:left w:val="single" w:sz="6" w:space="0" w:color="666666"/>
+              <w:bottom w:val="single" w:sz="6" w:space="0" w:color="666666"/>
+              <w:right w:val="single" w:sz="6" w:space="0" w:color="666666"/>
+            </w:tcBorders>
+            <w:tcMar>
+              <w:top w:w="90" w:type="dxa"/>
+              <w:left w:w="90" w:type="dxa"/>
+              <w:bottom w:w="90" w:type="dxa"/>
+              <w:right w:w="90" w:type="dxa"/>
+            </w:tcMar>
+            <w:hideMark/>
+          </w:tcPr>
+          <w:p>
+            <w:pPr>
+              <w:spacing w:before="180" w:after="180"/>
+              <w:rPr>
+                <w:rFonts w:ascii="Calibri" w:eastAsia="Times New Roman" w:hAnsi="Calibri" w:cs="Calibri"/>
+                <w:b/>
+                <w:bCs/>
+                <w:sz w:val="22"/>
+                <w:szCs w:val="22"/>
+              </w:rPr>
+            </w:pPr>
+            <w:r>
+              <w:rPr>
+                <w:rFonts w:ascii="Calibri" w:eastAsia="Times New Roman" w:hAnsi="Calibri" w:cs="Calibri"/>
+                <w:b/>
+                <w:bCs/>
+                <w:sz w:val="22"/>
+                <w:szCs w:val="22"/>
+              </w:rPr>
+              <w:t>Flujo Asignado</w:t>
+            </w:r>
+          </w:p>
+        </w:tc>
+      </w:tr>
+      <w:tr>
+        <w:tc>
+          <w:tcPr>
+            <w:tcW w:w="0" w:type="auto"/>
+            <w:tcBorders>
+              <w:top w:val="single" w:sz="6" w:space="0" w:color="666666"/>
+              <w:left w:val="single" w:sz="6" w:space="0" w:color="666666"/>
+              <w:bottom w:val="single" w:sz="6" w:space="0" w:color="666666"/>
+              <w:right w:val="single" w:sz="6" w:space="0" w:color="666666"/>
+            </w:tcBorders>
+            <w:tcMar>
+              <w:top w:w="90" w:type="dxa"/>
+              <w:left w:w="90" w:type="dxa"/>
+              <w:bottom w:w="90" w:type="dxa"/>
+              <w:right w:w="90" w:type="dxa"/>
+            </w:tcMar>
+            <w:hideMark/>
+          </w:tcPr>
+          <w:p>
+            <w:pPr>
+              <w:spacing w:before="180" w:after="180"/>
+              <w:rPr>
+                <w:rFonts w:ascii="Calibri" w:eastAsia="Times New Roman" w:hAnsi="Calibri" w:cs="Calibri"/>
+                <w:sz w:val="22"/>
+                <w:szCs w:val="22"/>
+              </w:rPr>
+            </w:pPr>
+            <w:r>
+              <w:rPr>
+                <w:rStyle w:val="CdigoHTML"/>
+              </w:rPr>
+              <w:t>LayMenorEvaluado.csv</w:t>
+            </w:r>
+          </w:p>
+        </w:tc>
+        <w:tc>
+          <w:tcPr>
+            <w:tcW w:w="0" w:type="auto"/>
+            <w:tcBorders>
+              <w:top w:val="single" w:sz="6" w:space="0" w:color="666666"/>
+              <w:left w:val="single" w:sz="6" w:space="0" w:color="666666"/>
+              <w:bottom w:val="single" w:sz="6" w:space="0" w:color="666666"/>
+              <w:right w:val="single" w:sz="6" w:space="0" w:color="666666"/>
+            </w:tcBorders>
+            <w:tcMar>
+              <w:top w:w="90" w:type="dxa"/>
+              <w:left w:w="90" w:type="dxa"/>
+              <w:bottom w:w="90" w:type="dxa"/>
+              <w:right w:w="90" w:type="dxa"/>
+            </w:tcMar>
+            <w:hideMark/>
+          </w:tcPr>
+          <w:p>
+            <w:pPr>
+              <w:spacing w:before="180" w:after="180"/>
+              <w:rPr>
+                <w:rFonts w:ascii="Calibri" w:eastAsia="Times New Roman" w:hAnsi="Calibri" w:cs="Calibri"/>
+                <w:sz w:val="22"/>
+                <w:szCs w:val="22"/>
+              </w:rPr>
+            </w:pPr>
+            <w:r>
+              <w:rPr>
+                <w:rFonts w:ascii="Calibri" w:eastAsia="Times New Roman" w:hAnsi="Calibri" w:cs="Calibri"/>
+                <w:sz w:val="22"/>
+                <w:szCs w:val="22"/>
+              </w:rPr>
+              <w:t>Poblar Universo Base de Alumnos.</w:t>
+            </w:r>
+          </w:p>
+        </w:tc>
+        <w:tc>
+          <w:tcPr>
+            <w:tcW w:w="0" w:type="auto"/>
+            <w:tcBorders>
+              <w:top w:val="single" w:sz="6" w:space="0" w:color="666666"/>
+              <w:left w:val="single" w:sz="6" w:space="0" w:color="666666"/>
+              <w:bottom w:val="single" w:sz="6" w:space="0" w:color="666666"/>
+              <w:right w:val="single" w:sz="6" w:space="0" w:color="666666"/>
+            </w:tcBorders>
+            <w:tcMar>
+              <w:top w:w="90" w:type="dxa"/>
+              <w:left w:w="90" w:type="dxa"/>
+              <w:bottom w:w="90" w:type="dxa"/>
+              <w:right w:w="90" w:type="dxa"/>
+            </w:tcMar>
+            <w:hideMark/>
+          </w:tcPr>
+          <w:p>
+            <w:pPr>
+              <w:spacing w:before="180" w:after="180"/>
+              <w:rPr>
+                <w:rFonts w:ascii="Calibri" w:eastAsia="Times New Roman" w:hAnsi="Calibri" w:cs="Calibri"/>
+                <w:sz w:val="22"/>
+                <w:szCs w:val="22"/>
+              </w:rPr>
+            </w:pPr>
+            <w:r>
+              <w:rPr>
+                <w:rStyle w:val="CdigoHTML"/>
+              </w:rPr>
+              <w:t>curp</w:t>
+            </w:r>
+            <w:r>
+              <w:rPr>
+                <w:rFonts w:ascii="Calibri" w:eastAsia="Times New Roman" w:hAnsi="Calibri" w:cs="Calibri"/>
+                <w:sz w:val="22"/>
+                <w:szCs w:val="22"/>
+              </w:rPr>
+              <w:t xml:space="preserve"> (Único 18 Chars), </w:t>
+            </w:r>
+            <w:r>
+              <w:rPr>
+                <w:rStyle w:val="CdigoHTML"/>
+              </w:rPr>
+              <w:t>cct</w:t>
+            </w:r>
+            <w:r>
+              <w:rPr>
+                <w:rFonts w:ascii="Calibri" w:eastAsia="Times New Roman" w:hAnsi="Calibri" w:cs="Calibri"/>
+                <w:sz w:val="22"/>
+                <w:szCs w:val="22"/>
+              </w:rPr>
+              <w:t xml:space="preserve"> (Obligatorio 10 Chars).</w:t>
+            </w:r>
+          </w:p>
+        </w:tc>
+        <w:tc>
+          <w:tcPr>
+            <w:tcW w:w="0" w:type="auto"/>
+            <w:tcBorders>
+              <w:top w:val="single" w:sz="6" w:space="0" w:color="666666"/>
+              <w:left w:val="single" w:sz="6" w:space="0" w:color="666666"/>
+              <w:bottom w:val="single" w:sz="6" w:space="0" w:color="666666"/>
+              <w:right w:val="single" w:sz="6" w:space="0" w:color="666666"/>
+            </w:tcBorders>
+            <w:tcMar>
+              <w:top w:w="90" w:type="dxa"/>
+              <w:left w:w="90" w:type="dxa"/>
+              <w:bottom w:w="90" w:type="dxa"/>
+              <w:right w:w="90" w:type="dxa"/>
+            </w:tcMar>
+            <w:hideMark/>
+          </w:tcPr>
+          <w:p>
+            <w:pPr>
+              <w:spacing w:before="180" w:after="180"/>
+              <w:rPr>
+                <w:rFonts w:ascii="Calibri" w:eastAsia="Times New Roman" w:hAnsi="Calibri" w:cs="Calibri"/>
+                <w:sz w:val="22"/>
+                <w:szCs w:val="22"/>
+              </w:rPr>
+            </w:pPr>
+            <w:r>
+              <w:rPr>
+                <w:rFonts w:ascii="Calibri" w:eastAsia="Times New Roman" w:hAnsi="Calibri" w:cs="Calibri"/>
+                <w:sz w:val="22"/>
+                <w:szCs w:val="22"/>
+              </w:rPr>
+              <w:t>El orquestador toma a todos estos sujetos e inicia el *Thread pool* iterativo para las descargas de dictamen IMSS.</w:t>
+            </w:r>
+          </w:p>
+        </w:tc>
+      </w:tr>
+      <w:tr>
+        <w:tc>
+          <w:tcPr>
+            <w:tcW w:w="0" w:type="auto"/>
+            <w:tcBorders>
+              <w:top w:val="single" w:sz="6" w:space="0" w:color="666666"/>
+              <w:left w:val="single" w:sz="6" w:space="0" w:color="666666"/>
+              <w:bottom w:val="single" w:sz="6" w:space="0" w:color="666666"/>
+              <w:right w:val="single" w:sz="6" w:space="0" w:color="666666"/>
+            </w:tcBorders>
+            <w:tcMar>
+              <w:top w:w="90" w:type="dxa"/>
+              <w:left w:w="90" w:type="dxa"/>
+              <w:bottom w:w="90" w:type="dxa"/>
+              <w:right w:w="90" w:type="dxa"/>
+            </w:tcMar>
+            <w:hideMark/>
+          </w:tcPr>
+          <w:p>
+            <w:pPr>
+              <w:spacing w:before="180" w:after="180"/>
+              <w:rPr>
+                <w:rFonts w:ascii="Calibri" w:eastAsia="Times New Roman" w:hAnsi="Calibri" w:cs="Calibri"/>
+                <w:sz w:val="22"/>
+                <w:szCs w:val="22"/>
+              </w:rPr>
+            </w:pPr>
+            <w:r>
+              <w:rPr>
+                <w:rStyle w:val="CdigoHTML"/>
+              </w:rPr>
+              <w:t>MENORES_SIN_PADECIMIENTO.csv</w:t>
+            </w:r>
+          </w:p>
+        </w:tc>
+        <w:tc>
+          <w:tcPr>
+            <w:tcW w:w="0" w:type="auto"/>
+            <w:tcBorders>
+              <w:top w:val="single" w:sz="6" w:space="0" w:color="666666"/>
+              <w:left w:val="single" w:sz="6" w:space="0" w:color="666666"/>
+              <w:bottom w:val="single" w:sz="6" w:space="0" w:color="666666"/>
+              <w:right w:val="single" w:sz="6" w:space="0" w:color="666666"/>
+            </w:tcBorders>
+            <w:tcMar>
+              <w:top w:w="90" w:type="dxa"/>
+              <w:left w:w="90" w:type="dxa"/>
+              <w:bottom w:w="90" w:type="dxa"/>
+              <w:right w:w="90" w:type="dxa"/>
+            </w:tcMar>
+            <w:hideMark/>
+          </w:tcPr>
+          <w:p>
+            <w:pPr>
+              <w:spacing w:before="180" w:after="180"/>
+              <w:rPr>
+                <w:rFonts w:ascii="Calibri" w:eastAsia="Times New Roman" w:hAnsi="Calibri" w:cs="Calibri"/>
+                <w:sz w:val="22"/>
+                <w:szCs w:val="22"/>
+              </w:rPr>
+            </w:pPr>
+            <w:r>
+              <w:rPr>
+                <w:rFonts w:ascii="Calibri" w:eastAsia="Times New Roman" w:hAnsi="Calibri" w:cs="Calibri"/>
+                <w:sz w:val="22"/>
+                <w:szCs w:val="22"/>
+              </w:rPr>
+              <w:t>Filtro de Exclusión Positiva.</w:t>
+            </w:r>
+          </w:p>
+        </w:tc>
+        <w:tc>
+          <w:tcPr>
+            <w:tcW w:w="0" w:type="auto"/>
+            <w:tcBorders>
+              <w:top w:val="single" w:sz="6" w:space="0" w:color="666666"/>
+              <w:left w:val="single" w:sz="6" w:space="0" w:color="666666"/>
+              <w:bottom w:val="single" w:sz="6" w:space="0" w:color="666666"/>
+              <w:right w:val="single" w:sz="6" w:space="0" w:color="666666"/>
+            </w:tcBorders>
+            <w:tcMar>
+              <w:top w:w="90" w:type="dxa"/>
+              <w:left w:w="90" w:type="dxa"/>
+              <w:bottom w:w="90" w:type="dxa"/>
+              <w:right w:w="90" w:type="dxa"/>
+            </w:tcMar>
+            <w:hideMark/>
+          </w:tcPr>
+          <w:p>
+            <w:pPr>
+              <w:spacing w:before="180" w:after="180"/>
+              <w:rPr>
+                <w:rFonts w:ascii="Calibri" w:eastAsia="Times New Roman" w:hAnsi="Calibri" w:cs="Calibri"/>
+                <w:sz w:val="22"/>
+                <w:szCs w:val="22"/>
+              </w:rPr>
+            </w:pPr>
+            <w:r>
+              <w:rPr>
+                <w:rStyle w:val="CdigoHTML"/>
+              </w:rPr>
+              <w:t>curp_hash</w:t>
+            </w:r>
+            <w:r>
+              <w:rPr>
+                <w:rFonts w:ascii="Calibri" w:eastAsia="Times New Roman" w:hAnsi="Calibri" w:cs="Calibri"/>
+                <w:sz w:val="22"/>
+                <w:szCs w:val="22"/>
+              </w:rPr>
+              <w:t>. Solo se almacenan los hashes.</w:t>
+            </w:r>
+          </w:p>
+        </w:tc>
+        <w:tc>
+          <w:tcPr>
+            <w:tcW w:w="0" w:type="auto"/>
+            <w:tcBorders>
+              <w:top w:val="single" w:sz="6" w:space="0" w:color="666666"/>
+              <w:left w:val="single" w:sz="6" w:space="0" w:color="666666"/>
+              <w:bottom w:val="single" w:sz="6" w:space="0" w:color="666666"/>
+              <w:right w:val="single" w:sz="6" w:space="0" w:color="666666"/>
+            </w:tcBorders>
+            <w:tcMar>
+              <w:top w:w="90" w:type="dxa"/>
+              <w:left w:w="90" w:type="dxa"/>
+              <w:bottom w:w="90" w:type="dxa"/>
+              <w:right w:w="90" w:type="dxa"/>
+            </w:tcMar>
+            <w:hideMark/>
+          </w:tcPr>
+          <w:p>
+            <w:pPr>
+              <w:spacing w:before="180" w:after="180"/>
+              <w:rPr>
+                <w:rFonts w:ascii="Calibri" w:eastAsia="Times New Roman" w:hAnsi="Calibri" w:cs="Calibri"/>
+                <w:sz w:val="22"/>
+                <w:szCs w:val="22"/>
+              </w:rPr>
+            </w:pPr>
+            <w:r>
+              <w:rPr>
+                <w:rFonts w:ascii="Calibri" w:eastAsia="Times New Roman" w:hAnsi="Calibri" w:cs="Calibri"/>
+                <w:sz w:val="22"/>
+                <w:szCs w:val="22"/>
+              </w:rPr>
+              <w:t>Al cruzarse con el padrón, los excluye de la generación de la carta invitación. (No requieren ir a clínica).</w:t>
+            </w:r>
+          </w:p>
+        </w:tc>
+      </w:tr>
+      <w:tr>
+        <w:tc>
+          <w:tcPr>
+            <w:tcW w:w="0" w:type="auto"/>
+            <w:tcBorders>
+              <w:top w:val="single" w:sz="6" w:space="0" w:color="666666"/>
+              <w:left w:val="single" w:sz="6" w:space="0" w:color="666666"/>
+              <w:bottom w:val="single" w:sz="6" w:space="0" w:color="666666"/>
+              <w:right w:val="single" w:sz="6" w:space="0" w:color="666666"/>
+            </w:tcBorders>
+            <w:tcMar>
+              <w:top w:w="90" w:type="dxa"/>
+              <w:left w:w="90" w:type="dxa"/>
+              <w:bottom w:w="90" w:type="dxa"/>
+              <w:right w:w="90" w:type="dxa"/>
+            </w:tcMar>
+            <w:hideMark/>
+          </w:tcPr>
+          <w:p>
+            <w:pPr>
+              <w:spacing w:before="180" w:after="180"/>
+              <w:rPr>
+                <w:rFonts w:ascii="Calibri" w:eastAsia="Times New Roman" w:hAnsi="Calibri" w:cs="Calibri"/>
+                <w:sz w:val="22"/>
+                <w:szCs w:val="22"/>
+              </w:rPr>
+            </w:pPr>
+            <w:r>
+              <w:rPr>
+                <w:rStyle w:val="CdigoHTML"/>
+              </w:rPr>
+              <w:t>IMSS_Diagnostico.json</w:t>
+            </w:r>
+          </w:p>
+        </w:tc>
+        <w:tc>
+          <w:tcPr>
+            <w:tcW w:w="0" w:type="auto"/>
+            <w:tcBorders>
+              <w:top w:val="single" w:sz="6" w:space="0" w:color="666666"/>
+              <w:left w:val="single" w:sz="6" w:space="0" w:color="666666"/>
+              <w:bottom w:val="single" w:sz="6" w:space="0" w:color="666666"/>
+              <w:right w:val="single" w:sz="6" w:space="0" w:color="666666"/>
+            </w:tcBorders>
+            <w:tcMar>
+              <w:top w:w="90" w:type="dxa"/>
+              <w:left w:w="90" w:type="dxa"/>
+              <w:bottom w:w="90" w:type="dxa"/>
+              <w:right w:w="90" w:type="dxa"/>
+            </w:tcMar>
+            <w:hideMark/>
+          </w:tcPr>
+          <w:p>
+            <w:pPr>
+              <w:spacing w:before="180" w:after="180"/>
+              <w:rPr>
+                <w:rFonts w:ascii="Calibri" w:eastAsia="Times New Roman" w:hAnsi="Calibri" w:cs="Calibri"/>
+                <w:sz w:val="22"/>
+                <w:szCs w:val="22"/>
+              </w:rPr>
+            </w:pPr>
+            <w:r>
+              <w:rPr>
+                <w:rFonts w:ascii="Calibri" w:eastAsia="Times New Roman" w:hAnsi="Calibri" w:cs="Calibri"/>
+                <w:sz w:val="22"/>
+                <w:szCs w:val="22"/>
+              </w:rPr>
+              <w:t>Filtro de Exclusión de Seguimiento.</w:t>
+            </w:r>
+          </w:p>
+        </w:tc>
+        <w:tc>
+          <w:tcPr>
+            <w:tcW w:w="0" w:type="auto"/>
+            <w:tcBorders>
+              <w:top w:val="single" w:sz="6" w:space="0" w:color="666666"/>
+              <w:left w:val="single" w:sz="6" w:space="0" w:color="666666"/>
+              <w:bottom w:val="single" w:sz="6" w:space="0" w:color="666666"/>
+              <w:right w:val="single" w:sz="6" w:space="0" w:color="666666"/>
+            </w:tcBorders>
+            <w:tcMar>
+              <w:top w:w="90" w:type="dxa"/>
+              <w:left w:w="90" w:type="dxa"/>
+              <w:bottom w:w="90" w:type="dxa"/>
+              <w:right w:w="90" w:type="dxa"/>
+            </w:tcMar>
+            <w:hideMark/>
+          </w:tcPr>
+          <w:p>
+            <w:pPr>
+              <w:spacing w:before="180" w:after="180"/>
+              <w:rPr>
+                <w:rFonts w:ascii="Calibri" w:eastAsia="Times New Roman" w:hAnsi="Calibri" w:cs="Calibri"/>
+                <w:sz w:val="22"/>
+                <w:szCs w:val="22"/>
+              </w:rPr>
+            </w:pPr>
+            <w:r>
+              <w:rPr>
+                <w:rStyle w:val="CdigoHTML"/>
+              </w:rPr>
+              <w:t>nss</w:t>
+            </w:r>
+            <w:r>
+              <w:rPr>
+                <w:rFonts w:ascii="Calibri" w:eastAsia="Times New Roman" w:hAnsi="Calibri" w:cs="Calibri"/>
+                <w:sz w:val="22"/>
+                <w:szCs w:val="22"/>
+              </w:rPr>
+              <w:t xml:space="preserve">, </w:t>
+            </w:r>
+            <w:r>
+              <w:rPr>
+                <w:rStyle w:val="CdigoHTML"/>
+              </w:rPr>
+              <w:t>folio_atencion</w:t>
+            </w:r>
+            <w:r>
+              <w:rPr>
+                <w:rFonts w:ascii="Calibri" w:eastAsia="Times New Roman" w:hAnsi="Calibri" w:cs="Calibri"/>
+                <w:sz w:val="22"/>
+                <w:szCs w:val="22"/>
+              </w:rPr>
+              <w:t>.</w:t>
+            </w:r>
+          </w:p>
+        </w:tc>
+        <w:tc>
+          <w:tcPr>
+            <w:tcW w:w="0" w:type="auto"/>
+            <w:tcBorders>
+              <w:top w:val="single" w:sz="6" w:space="0" w:color="666666"/>
+              <w:left w:val="single" w:sz="6" w:space="0" w:color="666666"/>
+              <w:bottom w:val="single" w:sz="6" w:space="0" w:color="666666"/>
+              <w:right w:val="single" w:sz="6" w:space="0" w:color="666666"/>
+            </w:tcBorders>
+            <w:tcMar>
+              <w:top w:w="90" w:type="dxa"/>
+              <w:left w:w="90" w:type="dxa"/>
+              <w:bottom w:w="90" w:type="dxa"/>
+              <w:right w:w="90" w:type="dxa"/>
+            </w:tcMar>
+            <w:hideMark/>
+          </w:tcPr>
+          <w:p>
+            <w:pPr>
+              <w:spacing w:before="180" w:after="180"/>
+              <w:rPr>
+                <w:rFonts w:ascii="Calibri" w:eastAsia="Times New Roman" w:hAnsi="Calibri" w:cs="Calibri"/>
+                <w:sz w:val="22"/>
+                <w:szCs w:val="22"/>
+              </w:rPr>
+            </w:pPr>
+            <w:r>
+              <w:rPr>
+                <w:rFonts w:ascii="Calibri" w:eastAsia="Times New Roman" w:hAnsi="Calibri" w:cs="Calibri"/>
+                <w:sz w:val="22"/>
+                <w:szCs w:val="22"/>
+              </w:rPr>
+              <w:t>Menores que, aunque tenían padecimiento, ya generaron historia clínica en el IMSS. Son excluidos para evitar re-enviar la carta.</w:t>
+            </w:r>
+          </w:p>
+        </w:tc>
+      </w:tr>
+    </w:tbl>
     <w:p>
       <w:pPr>
         <w:pStyle w:val="NormalWeb"/>
@@ -362,7 +1328,25 @@
           <w:sz w:val="22"/>
           <w:szCs w:val="22"/>
         </w:rPr>
-        <w:t xml:space="preserve">1. </w:t>
+        <w:t>&gt; [!WARNING]</w:t>
+      </w:r>
+    </w:p>
+    <w:p>
+      <w:pPr>
+        <w:pStyle w:val="NormalWeb"/>
+        <w:rPr>
+          <w:rFonts w:ascii="Calibri" w:hAnsi="Calibri" w:cs="Calibri"/>
+          <w:sz w:val="22"/>
+          <w:szCs w:val="22"/>
+        </w:rPr>
+      </w:pPr>
+      <w:r>
+        <w:rPr>
+          <w:rFonts w:ascii="Calibri" w:hAnsi="Calibri" w:cs="Calibri"/>
+          <w:sz w:val="22"/>
+          <w:szCs w:val="22"/>
+        </w:rPr>
+        <w:t xml:space="preserve">&gt; </w:t>
       </w:r>
       <w:r>
         <w:rPr>
@@ -371,43 +1355,62 @@
           <w:sz w:val="22"/>
           <w:szCs w:val="22"/>
         </w:rPr>
-        <w:t>Migración de Ramas:</w:t>
-      </w:r>
-      <w:r>
-        <w:rPr>
-          <w:rFonts w:ascii="Calibri" w:hAnsi="Calibri" w:cs="Calibri"/>
-          <w:sz w:val="22"/>
-          <w:szCs w:val="22"/>
-        </w:rPr>
-        <w:t xml:space="preserve"> Aprobar el *Pull Request* de la rama </w:t>
+        <w:t>Aviso Crítico a Operaciones:</w:t>
+      </w:r>
+      <w:r>
+        <w:rPr>
+          <w:rFonts w:ascii="Calibri" w:hAnsi="Calibri" w:cs="Calibri"/>
+          <w:sz w:val="22"/>
+          <w:szCs w:val="22"/>
+        </w:rPr>
+        <w:t xml:space="preserve"> Se debe purgar periódicamente el historial de </w:t>
       </w:r>
       <w:r>
         <w:rPr>
           <w:rStyle w:val="CdigoHTML"/>
         </w:rPr>
-        <w:t>feature/vlarrea-fase-2</w:t>
-      </w:r>
-      <w:r>
-        <w:rPr>
-          <w:rFonts w:ascii="Calibri" w:hAnsi="Calibri" w:cs="Calibri"/>
-          <w:sz w:val="22"/>
-          <w:szCs w:val="22"/>
-        </w:rPr>
-        <w:t xml:space="preserve"> hacia la rama principal </w:t>
-      </w:r>
-      <w:r>
-        <w:rPr>
-          <w:rStyle w:val="CdigoHTML"/>
-        </w:rPr>
-        <w:t>master</w:t>
-      </w:r>
-      <w:r>
-        <w:rPr>
-          <w:rFonts w:ascii="Calibri" w:hAnsi="Calibri" w:cs="Calibri"/>
-          <w:sz w:val="22"/>
-          <w:szCs w:val="22"/>
-        </w:rPr>
-        <w:t>.</w:t>
+        <w:t>LayMenorEvaluado.csv</w:t>
+      </w:r>
+      <w:r>
+        <w:rPr>
+          <w:rFonts w:ascii="Calibri" w:hAnsi="Calibri" w:cs="Calibri"/>
+          <w:sz w:val="22"/>
+          <w:szCs w:val="22"/>
+        </w:rPr>
+        <w:t xml:space="preserve"> en el entorno productivo post-procesamiento. Su permanencia indefinida transgrede normativas de PII al almacenar archivos planos no encriptados.</w:t>
+      </w:r>
+    </w:p>
+    <w:p>
+      <w:pPr>
+        <w:rPr>
+          <w:rFonts w:ascii="Calibri" w:eastAsia="Times New Roman" w:hAnsi="Calibri" w:cs="Calibri"/>
+          <w:sz w:val="22"/>
+          <w:szCs w:val="22"/>
+        </w:rPr>
+      </w:pPr>
+      <w:r>
+        <w:rPr>
+          <w:rFonts w:ascii="Calibri" w:eastAsia="Times New Roman" w:hAnsi="Calibri" w:cs="Calibri"/>
+          <w:sz w:val="22"/>
+          <w:szCs w:val="22"/>
+        </w:rPr>
+        <w:pict w14:anchorId="0F2B71B4">
+          <v:rect id="_x0000_i1029" style="width:0;height:1.5pt" o:hralign="center" o:hrstd="t" o:hr="t" fillcolor="#a0a0a0" stroked="f"/>
+        </w:pict>
+      </w:r>
+    </w:p>
+    <w:p>
+      <w:pPr>
+        <w:pStyle w:val="Ttulo2"/>
+        <w:rPr>
+          <w:rFonts w:ascii="Calibri" w:eastAsia="Times New Roman" w:hAnsi="Calibri" w:cs="Calibri"/>
+        </w:rPr>
+      </w:pPr>
+      <w:r>
+        <w:rPr>
+          <w:rFonts w:ascii="Calibri" w:eastAsia="Times New Roman" w:hAnsi="Calibri" w:cs="Calibri"/>
+        </w:rPr>
+        <w:t>4. Resolución de Vulnerabilidades y Mitigaciones Críticas (RCA)</w:t>
       </w:r>
     </w:p>
     <w:p>
@@ -425,57 +1428,29 @@
           <w:sz w:val="22"/>
           <w:szCs w:val="22"/>
         </w:rPr>
-        <w:t xml:space="preserve">2. </w:t>
-      </w:r>
-      <w:r>
-        <w:rPr>
-          <w:rStyle w:val="Fuerte"/>
-          <w:rFonts w:ascii="Calibri" w:hAnsi="Calibri" w:cs="Calibri"/>
-          <w:sz w:val="22"/>
-          <w:szCs w:val="22"/>
-        </w:rPr>
-        <w:t>Ejecución del Sprint 1:</w:t>
-      </w:r>
-      <w:r>
-        <w:rPr>
-          <w:rFonts w:ascii="Calibri" w:hAnsi="Calibri" w:cs="Calibri"/>
-          <w:sz w:val="22"/>
-          <w:szCs w:val="22"/>
-        </w:rPr>
-        <w:t xml:space="preserve"> Arrancar directamente con el desarrollo funcional de *Layouts* apoyándose en el motor orquestador asíncrono (Zero Persistence) que ya se entrega integrado.</w:t>
-      </w:r>
-    </w:p>
-    <w:p>
-      <w:pPr>
-        <w:pStyle w:val="Ttulo2"/>
-        <w:rPr>
-          <w:rFonts w:ascii="Calibri" w:eastAsia="Times New Roman" w:hAnsi="Calibri" w:cs="Calibri"/>
-        </w:rPr>
-      </w:pPr>
-      <w:r>
-        <w:rPr>
-          <w:rFonts w:ascii="Calibri" w:eastAsia="Times New Roman" w:hAnsi="Calibri" w:cs="Calibri"/>
-        </w:rPr>
-        <w:lastRenderedPageBreak/>
-        <w:t>4. Inventario de Entregables Finales (Handover Tecnológico)</w:t>
-      </w:r>
-    </w:p>
-    <w:p>
-      <w:pPr>
-        <w:pStyle w:val="NormalWeb"/>
-        <w:rPr>
-          <w:rFonts w:ascii="Calibri" w:hAnsi="Calibri" w:cs="Calibri"/>
-          <w:sz w:val="22"/>
-          <w:szCs w:val="22"/>
-        </w:rPr>
-      </w:pPr>
-      <w:r>
-        <w:rPr>
-          <w:rFonts w:ascii="Calibri" w:hAnsi="Calibri" w:cs="Calibri"/>
-          <w:sz w:val="22"/>
-          <w:szCs w:val="22"/>
-        </w:rPr>
-        <w:t>Como acta de cierre del componente Vida Saludable, se entregan los siguientes activos:</w:t>
+        <w:t>El patrimonio má</w:t>
+      </w:r>
+      <w:r>
+        <w:rPr>
+          <w:rFonts w:ascii="Calibri" w:hAnsi="Calibri" w:cs="Calibri"/>
+          <w:sz w:val="22"/>
+          <w:szCs w:val="22"/>
+        </w:rPr>
+        <w:t>s valioso que se entrega radica en la resolución forense de 3 enormes brechas de seguridad identificadas en mayo y corregidas a lo largo de junio. A continuación, el acta de remediación:</w:t>
+      </w:r>
+    </w:p>
+    <w:p>
+      <w:pPr>
+        <w:pStyle w:val="Ttulo3"/>
+        <w:rPr>
+          <w:rFonts w:ascii="Calibri" w:eastAsia="Times New Roman" w:hAnsi="Calibri" w:cs="Calibri"/>
+        </w:rPr>
+      </w:pPr>
+      <w:r>
+        <w:rPr>
+          <w:rFonts w:ascii="Calibri" w:eastAsia="Times New Roman" w:hAnsi="Calibri" w:cs="Calibri"/>
+        </w:rPr>
+        <w:t>4.1 Resolución Issue #61: Prevención Inyecciones SQL (SQLi)</w:t>
       </w:r>
     </w:p>
     <w:p>
@@ -493,11 +1468,34 @@
       </w:pPr>
       <w:r>
         <w:rPr>
-          <w:rFonts w:ascii="Calibri" w:eastAsia="Times New Roman" w:hAnsi="Calibri" w:cs="Calibri"/>
-          <w:sz w:val="22"/>
-          <w:szCs w:val="22"/>
-        </w:rPr>
-        <w:t>Repositorio completo con histórico de *commits* y refactorización estructural.</w:t>
+          <w:rStyle w:val="Fuerte"/>
+          <w:rFonts w:ascii="Calibri" w:eastAsia="Times New Roman" w:hAnsi="Calibri" w:cs="Calibri"/>
+          <w:sz w:val="22"/>
+          <w:szCs w:val="22"/>
+        </w:rPr>
+        <w:t>Problema de Origen:</w:t>
+      </w:r>
+      <w:r>
+        <w:rPr>
+          <w:rFonts w:ascii="Calibri" w:eastAsia="Times New Roman" w:hAnsi="Calibri" w:cs="Calibri"/>
+          <w:sz w:val="22"/>
+          <w:szCs w:val="22"/>
+        </w:rPr>
+        <w:t xml:space="preserve"> El código base inicial heredado utilizaba constructores dinámicos f-strings (Ej. </w:t>
+      </w:r>
+      <w:r>
+        <w:rPr>
+          <w:rStyle w:val="CdigoHTML"/>
+        </w:rPr>
+        <w:t>f"SELECT * FROM menor_evaluado WHERE entidad = '{entidad}'"</w:t>
+      </w:r>
+      <w:r>
+        <w:rPr>
+          <w:rFonts w:ascii="Calibri" w:eastAsia="Times New Roman" w:hAnsi="Calibri" w:cs="Calibri"/>
+          <w:sz w:val="22"/>
+          <w:szCs w:val="22"/>
+        </w:rPr>
+        <w:t>) lo que ponía en inmenso riesgo la base de datos PostgreSQL ante inyecciones estructuradas por lotes.</w:t>
       </w:r>
     </w:p>
     <w:p>
@@ -515,11 +1513,48 @@
       </w:pPr>
       <w:r>
         <w:rPr>
-          <w:rFonts w:ascii="Calibri" w:eastAsia="Times New Roman" w:hAnsi="Calibri" w:cs="Calibri"/>
-          <w:sz w:val="22"/>
-          <w:szCs w:val="22"/>
-        </w:rPr>
-        <w:t>Conjunto de Pruebas Unitarias y *End-to-End* aprobadas y vinculadas a la canalización de Integración Continua (CI).</w:t>
+          <w:rStyle w:val="Fuerte"/>
+          <w:rFonts w:ascii="Calibri" w:eastAsia="Times New Roman" w:hAnsi="Calibri" w:cs="Calibri"/>
+          <w:sz w:val="22"/>
+          <w:szCs w:val="22"/>
+        </w:rPr>
+        <w:t>Remediación Entregada:</w:t>
+      </w:r>
+      <w:r>
+        <w:rPr>
+          <w:rFonts w:ascii="Calibri" w:eastAsia="Times New Roman" w:hAnsi="Calibri" w:cs="Calibri"/>
+          <w:sz w:val="22"/>
+          <w:szCs w:val="22"/>
+        </w:rPr>
+        <w:t xml:space="preserve"> El módulo </w:t>
+      </w:r>
+      <w:r>
+        <w:rPr>
+          <w:rStyle w:val="CdigoHTML"/>
+        </w:rPr>
+        <w:t>download_service.py</w:t>
+      </w:r>
+      <w:r>
+        <w:rPr>
+          <w:rFonts w:ascii="Calibri" w:eastAsia="Times New Roman" w:hAnsi="Calibri" w:cs="Calibri"/>
+          <w:sz w:val="22"/>
+          <w:szCs w:val="22"/>
+        </w:rPr>
+        <w:t xml:space="preserve"> fue refactorizado, erradicando todas las consultas crudas e instrumentando un *binding* estricto de parámetros posicionales usando la API segura del conector </w:t>
+      </w:r>
+      <w:r>
+        <w:rPr>
+          <w:rStyle w:val="CdigoHTML"/>
+        </w:rPr>
+        <w:t>pg8000</w:t>
+      </w:r>
+      <w:r>
+        <w:rPr>
+          <w:rFonts w:ascii="Calibri" w:eastAsia="Times New Roman" w:hAnsi="Calibri" w:cs="Calibri"/>
+          <w:sz w:val="22"/>
+          <w:szCs w:val="22"/>
+        </w:rPr>
+        <w:t xml:space="preserve">. </w:t>
       </w:r>
     </w:p>
     <w:p>
@@ -537,21 +1572,580 @@
       </w:pPr>
       <w:r>
         <w:rPr>
-          <w:rFonts w:ascii="Calibri" w:eastAsia="Times New Roman" w:hAnsi="Calibri" w:cs="Calibri"/>
-          <w:sz w:val="22"/>
-          <w:szCs w:val="22"/>
-        </w:rPr>
-        <w:t xml:space="preserve">Documentación técnica forense exhaustiva de la Fase 2 (Casos de Uso, Reportes Técnicos de Resolución de Issues y *Code Reviews* almacenados en </w:t>
+          <w:rStyle w:val="Fuerte"/>
+          <w:rFonts w:ascii="Calibri" w:eastAsia="Times New Roman" w:hAnsi="Calibri" w:cs="Calibri"/>
+          <w:sz w:val="22"/>
+          <w:szCs w:val="22"/>
+        </w:rPr>
+        <w:t>Validación Final:</w:t>
+      </w:r>
+      <w:r>
+        <w:rPr>
+          <w:rFonts w:ascii="Calibri" w:eastAsia="Times New Roman" w:hAnsi="Calibri" w:cs="Calibri"/>
+          <w:sz w:val="22"/>
+          <w:szCs w:val="22"/>
+        </w:rPr>
+        <w:t xml:space="preserve"> Certificado y probado contra inyecciones estándar mediante Pytest.</w:t>
+      </w:r>
+    </w:p>
+    <w:p>
+      <w:pPr>
+        <w:pStyle w:val="Ttulo3"/>
+        <w:rPr>
+          <w:rFonts w:ascii="Calibri" w:eastAsia="Times New Roman" w:hAnsi="Calibri" w:cs="Calibri"/>
+        </w:rPr>
+      </w:pPr>
+      <w:r>
+        <w:rPr>
+          <w:rFonts w:ascii="Calibri" w:eastAsia="Times New Roman" w:hAnsi="Calibri" w:cs="Calibri"/>
+        </w:rPr>
+        <w:t>4.2 Resolución Issue #60: Migración Criptográfica a AES-256-GCM</w:t>
+      </w:r>
+    </w:p>
+    <w:p>
+      <w:pPr>
+        <w:numPr>
+          <w:ilvl w:val="0"/>
+          <w:numId w:val="3"/>
+        </w:numPr>
+        <w:spacing w:before="100" w:beforeAutospacing="1" w:after="100" w:afterAutospacing="1"/>
+        <w:rPr>
+          <w:rFonts w:ascii="Calibri" w:eastAsia="Times New Roman" w:hAnsi="Calibri" w:cs="Calibri"/>
+          <w:sz w:val="22"/>
+          <w:szCs w:val="22"/>
+        </w:rPr>
+      </w:pPr>
+      <w:r>
+        <w:rPr>
+          <w:rStyle w:val="Fuerte"/>
+          <w:rFonts w:ascii="Calibri" w:eastAsia="Times New Roman" w:hAnsi="Calibri" w:cs="Calibri"/>
+          <w:sz w:val="22"/>
+          <w:szCs w:val="22"/>
+        </w:rPr>
+        <w:t>Problema de Origen:</w:t>
+      </w:r>
+      <w:r>
+        <w:rPr>
+          <w:rFonts w:ascii="Calibri" w:eastAsia="Times New Roman" w:hAnsi="Calibri" w:cs="Calibri"/>
+          <w:sz w:val="22"/>
+          <w:szCs w:val="22"/>
+        </w:rPr>
+        <w:t xml:space="preserve"> Las llaves temporales de paso creadas para interactuar con los Web Services del IMSS se cifraban utilizando el vetusto estándar </w:t>
       </w:r>
       <w:r>
         <w:rPr>
           <w:rStyle w:val="CdigoHTML"/>
         </w:rPr>
+        <w:t>AES-ECB</w:t>
+      </w:r>
+      <w:r>
+        <w:rPr>
+          <w:rFonts w:ascii="Calibri" w:eastAsia="Times New Roman" w:hAnsi="Calibri" w:cs="Calibri"/>
+          <w:sz w:val="22"/>
+          <w:szCs w:val="22"/>
+        </w:rPr>
+        <w:t xml:space="preserve"> (Electronic Codebook), altamente susceptible a detección de patrones dado que el mismo texto plano siempre genera el mismo hash.</w:t>
+      </w:r>
+    </w:p>
+    <w:p>
+      <w:pPr>
+        <w:numPr>
+          <w:ilvl w:val="0"/>
+          <w:numId w:val="3"/>
+        </w:numPr>
+        <w:spacing w:before="100" w:beforeAutospacing="1" w:after="100" w:afterAutospacing="1"/>
+        <w:rPr>
+          <w:rFonts w:ascii="Calibri" w:eastAsia="Times New Roman" w:hAnsi="Calibri" w:cs="Calibri"/>
+          <w:sz w:val="22"/>
+          <w:szCs w:val="22"/>
+        </w:rPr>
+      </w:pPr>
+      <w:r>
+        <w:rPr>
+          <w:rStyle w:val="Fuerte"/>
+          <w:rFonts w:ascii="Calibri" w:eastAsia="Times New Roman" w:hAnsi="Calibri" w:cs="Calibri"/>
+          <w:sz w:val="22"/>
+          <w:szCs w:val="22"/>
+        </w:rPr>
+        <w:t>Remediación Entregada:</w:t>
+      </w:r>
+      <w:r>
+        <w:rPr>
+          <w:rFonts w:ascii="Calibri" w:eastAsia="Times New Roman" w:hAnsi="Calibri" w:cs="Calibri"/>
+          <w:sz w:val="22"/>
+          <w:szCs w:val="22"/>
+        </w:rPr>
+        <w:t xml:space="preserve"> Implementación del estándar de nivel militar </w:t>
+      </w:r>
+      <w:r>
+        <w:rPr>
+          <w:rStyle w:val="Fuerte"/>
+          <w:rFonts w:ascii="Calibri" w:eastAsia="Times New Roman" w:hAnsi="Calibri" w:cs="Calibri"/>
+          <w:sz w:val="22"/>
+          <w:szCs w:val="22"/>
+        </w:rPr>
+        <w:t>AES-256-GCM</w:t>
+      </w:r>
+      <w:r>
+        <w:rPr>
+          <w:rFonts w:ascii="Calibri" w:eastAsia="Times New Roman" w:hAnsi="Calibri" w:cs="Calibri"/>
+          <w:sz w:val="22"/>
+          <w:szCs w:val="22"/>
+        </w:rPr>
+        <w:t xml:space="preserve"> (Galois/Counter Mode). Este protocolo no solo cifra el texto, sino que incluye un vector de inicialización único (IV) y un Tag de Autenticación (MAC), asegurando que cualquier manipulación en tránsito (*Man-in-the-Middle*) sea detectada y descartada antes de procesar.</w:t>
+      </w:r>
+    </w:p>
+    <w:p>
+      <w:pPr>
+        <w:numPr>
+          <w:ilvl w:val="0"/>
+          <w:numId w:val="3"/>
+        </w:numPr>
+        <w:spacing w:before="100" w:beforeAutospacing="1" w:after="100" w:afterAutospacing="1"/>
+        <w:rPr>
+          <w:rFonts w:ascii="Calibri" w:eastAsia="Times New Roman" w:hAnsi="Calibri" w:cs="Calibri"/>
+          <w:sz w:val="22"/>
+          <w:szCs w:val="22"/>
+        </w:rPr>
+      </w:pPr>
+      <w:r>
+        <w:rPr>
+          <w:rStyle w:val="Fuerte"/>
+          <w:rFonts w:ascii="Calibri" w:eastAsia="Times New Roman" w:hAnsi="Calibri" w:cs="Calibri"/>
+          <w:sz w:val="22"/>
+          <w:szCs w:val="22"/>
+        </w:rPr>
+        <w:t>Validación Final:</w:t>
+      </w:r>
+      <w:r>
+        <w:rPr>
+          <w:rFonts w:ascii="Calibri" w:eastAsia="Times New Roman" w:hAnsi="Calibri" w:cs="Calibri"/>
+          <w:sz w:val="22"/>
+          <w:szCs w:val="22"/>
+        </w:rPr>
+        <w:t xml:space="preserve"> Se entregan pruebas Cypress End-to-End validando la respuesta HTTPS del IMSS.</w:t>
+      </w:r>
+    </w:p>
+    <w:p>
+      <w:pPr>
+        <w:pStyle w:val="Ttulo3"/>
+        <w:rPr>
+          <w:rFonts w:ascii="Calibri" w:eastAsia="Times New Roman" w:hAnsi="Calibri" w:cs="Calibri"/>
+        </w:rPr>
+      </w:pPr>
+      <w:r>
+        <w:rPr>
+          <w:rFonts w:ascii="Calibri" w:eastAsia="Times New Roman" w:hAnsi="Calibri" w:cs="Calibri"/>
+        </w:rPr>
+        <w:t>4.3 Resolución Issue #59: Ofuscación PII en Consultas GraphQL</w:t>
+      </w:r>
+    </w:p>
+    <w:p>
+      <w:pPr>
+        <w:numPr>
+          <w:ilvl w:val="0"/>
+          <w:numId w:val="4"/>
+        </w:numPr>
+        <w:spacing w:before="100" w:beforeAutospacing="1" w:after="100" w:afterAutospacing="1"/>
+        <w:rPr>
+          <w:rFonts w:ascii="Calibri" w:eastAsia="Times New Roman" w:hAnsi="Calibri" w:cs="Calibri"/>
+          <w:sz w:val="22"/>
+          <w:szCs w:val="22"/>
+        </w:rPr>
+      </w:pPr>
+      <w:r>
+        <w:rPr>
+          <w:rStyle w:val="Fuerte"/>
+          <w:rFonts w:ascii="Calibri" w:eastAsia="Times New Roman" w:hAnsi="Calibri" w:cs="Calibri"/>
+          <w:sz w:val="22"/>
+          <w:szCs w:val="22"/>
+        </w:rPr>
+        <w:t>Problema de Origen:</w:t>
+      </w:r>
+      <w:r>
+        <w:rPr>
+          <w:rFonts w:ascii="Calibri" w:eastAsia="Times New Roman" w:hAnsi="Calibri" w:cs="Calibri"/>
+          <w:sz w:val="22"/>
+          <w:szCs w:val="22"/>
+        </w:rPr>
+        <w:t xml:space="preserve"> Al realizar *queries* sobre el estado de un lote, el servidor Strawberry devolvía la CURP de los alumnos en texto plano (</w:t>
+      </w:r>
+      <w:r>
+        <w:rPr>
+          <w:rStyle w:val="CdigoHTML"/>
+        </w:rPr>
+        <w:t>CurpProcesada</w:t>
+      </w:r>
+      <w:r>
+        <w:rPr>
+          <w:rFonts w:ascii="Calibri" w:eastAsia="Times New Roman" w:hAnsi="Calibri" w:cs="Calibri"/>
+          <w:sz w:val="22"/>
+          <w:szCs w:val="22"/>
+        </w:rPr>
+        <w:t>), exponiendo Información Identificable Personal (PII) por defecto hacia las consolas de desarrollador de los navegadores web.</w:t>
+      </w:r>
+    </w:p>
+    <w:p>
+      <w:pPr>
+        <w:numPr>
+          <w:ilvl w:val="0"/>
+          <w:numId w:val="4"/>
+        </w:numPr>
+        <w:spacing w:before="100" w:beforeAutospacing="1" w:after="100" w:afterAutospacing="1"/>
+        <w:rPr>
+          <w:rFonts w:ascii="Calibri" w:eastAsia="Times New Roman" w:hAnsi="Calibri" w:cs="Calibri"/>
+          <w:sz w:val="22"/>
+          <w:szCs w:val="22"/>
+        </w:rPr>
+      </w:pPr>
+      <w:r>
+        <w:rPr>
+          <w:rStyle w:val="Fuerte"/>
+          <w:rFonts w:ascii="Calibri" w:eastAsia="Times New Roman" w:hAnsi="Calibri" w:cs="Calibri"/>
+          <w:sz w:val="22"/>
+          <w:szCs w:val="22"/>
+        </w:rPr>
+        <w:t>Remediación Entregada:</w:t>
+      </w:r>
+      <w:r>
+        <w:rPr>
+          <w:rFonts w:ascii="Calibri" w:eastAsia="Times New Roman" w:hAnsi="Calibri" w:cs="Calibri"/>
+          <w:sz w:val="22"/>
+          <w:szCs w:val="22"/>
+        </w:rPr>
+        <w:t xml:space="preserve"> Se desarrolló un inyector (directive / scalar modifier) en </w:t>
+      </w:r>
+      <w:r>
+        <w:rPr>
+          <w:rStyle w:val="CdigoHTML"/>
+        </w:rPr>
+        <w:t>api/schema.py</w:t>
+      </w:r>
+      <w:r>
+        <w:rPr>
+          <w:rFonts w:ascii="Calibri" w:eastAsia="Times New Roman" w:hAnsi="Calibri" w:cs="Calibri"/>
+          <w:sz w:val="22"/>
+          <w:szCs w:val="22"/>
+        </w:rPr>
+        <w:t xml:space="preserve"> que asegura que todo string detectado como CURP sea despachado truncado al cliente (Ej. </w:t>
+      </w:r>
+      <w:r>
+        <w:rPr>
+          <w:rStyle w:val="CdigoHTML"/>
+        </w:rPr>
+        <w:t>XXXX</w:t>
+      </w:r>
+      <w:r>
+        <w:rPr>
+          <w:rStyle w:val="Fuerte"/>
+          <w:rFonts w:ascii="Courier New" w:hAnsi="Courier New" w:cs="Courier New"/>
+          <w:sz w:val="20"/>
+          <w:szCs w:val="20"/>
+        </w:rPr>
+        <w:t>*</w:t>
+      </w:r>
+      <w:r>
+        <w:rPr>
+          <w:rStyle w:val="CdigoHTML"/>
+        </w:rPr>
+        <w:t>*XXXX**0</w:t>
+      </w:r>
+      <w:r>
+        <w:rPr>
+          <w:rFonts w:ascii="Calibri" w:eastAsia="Times New Roman" w:hAnsi="Calibri" w:cs="Calibri"/>
+          <w:sz w:val="22"/>
+          <w:szCs w:val="22"/>
+        </w:rPr>
+        <w:t>).</w:t>
+      </w:r>
+    </w:p>
+    <w:p>
+      <w:pPr>
+        <w:numPr>
+          <w:ilvl w:val="0"/>
+          <w:numId w:val="4"/>
+        </w:numPr>
+        <w:spacing w:before="100" w:beforeAutospacing="1" w:after="100" w:afterAutospacing="1"/>
+        <w:rPr>
+          <w:rFonts w:ascii="Calibri" w:eastAsia="Times New Roman" w:hAnsi="Calibri" w:cs="Calibri"/>
+          <w:sz w:val="22"/>
+          <w:szCs w:val="22"/>
+        </w:rPr>
+      </w:pPr>
+      <w:r>
+        <w:rPr>
+          <w:rStyle w:val="Fuerte"/>
+          <w:rFonts w:ascii="Calibri" w:eastAsia="Times New Roman" w:hAnsi="Calibri" w:cs="Calibri"/>
+          <w:sz w:val="22"/>
+          <w:szCs w:val="22"/>
+        </w:rPr>
+        <w:t>Validación Final:</w:t>
+      </w:r>
+      <w:r>
+        <w:rPr>
+          <w:rFonts w:ascii="Calibri" w:eastAsia="Times New Roman" w:hAnsi="Calibri" w:cs="Calibri"/>
+          <w:sz w:val="22"/>
+          <w:szCs w:val="22"/>
+        </w:rPr>
+        <w:t xml:space="preserve"> </w:t>
+      </w:r>
+      <w:r>
+        <w:rPr>
+          <w:rFonts w:ascii="Calibri" w:eastAsia="Times New Roman" w:hAnsi="Calibri" w:cs="Calibri"/>
+          <w:sz w:val="22"/>
+          <w:szCs w:val="22"/>
+        </w:rPr>
+        <w:t>Verificado en pruebas locales E2E donde el *Over-fetching* de identidad queda totalmente imposibilitado.</w:t>
+      </w:r>
+    </w:p>
+    <w:p>
+      <w:pPr>
+        <w:rPr>
+          <w:rFonts w:ascii="Calibri" w:eastAsia="Times New Roman" w:hAnsi="Calibri" w:cs="Calibri"/>
+          <w:sz w:val="22"/>
+          <w:szCs w:val="22"/>
+        </w:rPr>
+      </w:pPr>
+      <w:r>
+        <w:rPr>
+          <w:rFonts w:ascii="Calibri" w:eastAsia="Times New Roman" w:hAnsi="Calibri" w:cs="Calibri"/>
+          <w:sz w:val="22"/>
+          <w:szCs w:val="22"/>
+        </w:rPr>
+        <w:pict w14:anchorId="10B5ACE8">
+          <v:rect id="_x0000_i1030" style="width:0;height:1.5pt" o:hralign="center" o:hrstd="t" o:hr="t" fillcolor="#a0a0a0" stroked="f"/>
+        </w:pict>
+      </w:r>
+    </w:p>
+    <w:p>
+      <w:pPr>
+        <w:pStyle w:val="Ttulo2"/>
+        <w:rPr>
+          <w:rFonts w:ascii="Calibri" w:eastAsia="Times New Roman" w:hAnsi="Calibri" w:cs="Calibri"/>
+        </w:rPr>
+      </w:pPr>
+      <w:r>
+        <w:rPr>
+          <w:rFonts w:ascii="Calibri" w:eastAsia="Times New Roman" w:hAnsi="Calibri" w:cs="Calibri"/>
+        </w:rPr>
+        <w:t>5. Inventario de Componentes y Transferencia de Activos</w:t>
+      </w:r>
+    </w:p>
+    <w:p>
+      <w:pPr>
+        <w:pStyle w:val="NormalWeb"/>
+        <w:rPr>
+          <w:rFonts w:ascii="Calibri" w:hAnsi="Calibri" w:cs="Calibri"/>
+          <w:sz w:val="22"/>
+          <w:szCs w:val="22"/>
+        </w:rPr>
+      </w:pPr>
+      <w:r>
+        <w:rPr>
+          <w:rFonts w:ascii="Calibri" w:hAnsi="Calibri" w:cs="Calibri"/>
+          <w:sz w:val="22"/>
+          <w:szCs w:val="22"/>
+        </w:rPr>
+        <w:t xml:space="preserve">Como cierre de este reporte, se certifica que se transfiere íntegramente a la dependencia la siguiente base documental contenida en el repositorio </w:t>
+      </w:r>
+      <w:r>
+        <w:rPr>
+          <w:rStyle w:val="CdigoHTML"/>
+        </w:rPr>
+        <w:t>py-sep-descarga-vida-saludable</w:t>
+      </w:r>
+      <w:r>
+        <w:rPr>
+          <w:rFonts w:ascii="Calibri" w:hAnsi="Calibri" w:cs="Calibri"/>
+          <w:sz w:val="22"/>
+          <w:szCs w:val="22"/>
+        </w:rPr>
+        <w:t xml:space="preserve"> (Directorio </w:t>
+      </w:r>
+      <w:r>
+        <w:rPr>
+          <w:rStyle w:val="CdigoHTML"/>
+        </w:rPr>
         <w:t>/fase-2</w:t>
       </w:r>
       <w:r>
         <w:rPr>
-          <w:rFonts w:ascii="Calibri" w:eastAsia="Times New Roman" w:hAnsi="Calibri" w:cs="Calibri"/>
+          <w:rFonts w:ascii="Calibri" w:hAnsi="Calibri" w:cs="Calibri"/>
+          <w:sz w:val="22"/>
+          <w:szCs w:val="22"/>
+        </w:rPr>
+        <w:t xml:space="preserve"> y raíz):</w:t>
+      </w:r>
+    </w:p>
+    <w:p>
+      <w:pPr>
+        <w:pStyle w:val="NormalWeb"/>
+        <w:rPr>
+          <w:rFonts w:ascii="Calibri" w:hAnsi="Calibri" w:cs="Calibri"/>
+          <w:sz w:val="22"/>
+          <w:szCs w:val="22"/>
+        </w:rPr>
+      </w:pPr>
+      <w:r>
+        <w:rPr>
+          <w:rFonts w:ascii="Calibri" w:hAnsi="Calibri" w:cs="Calibri"/>
+          <w:sz w:val="22"/>
+          <w:szCs w:val="22"/>
+        </w:rPr>
+        <w:t xml:space="preserve">1. </w:t>
+      </w:r>
+      <w:r>
+        <w:rPr>
+          <w:rStyle w:val="Fuerte"/>
+          <w:rFonts w:ascii="Calibri" w:hAnsi="Calibri" w:cs="Calibri"/>
+          <w:sz w:val="22"/>
+          <w:szCs w:val="22"/>
+        </w:rPr>
+        <w:t>Código y Orquestador de Lotes:</w:t>
+      </w:r>
+      <w:r>
+        <w:rPr>
+          <w:rFonts w:ascii="Calibri" w:hAnsi="Calibri" w:cs="Calibri"/>
+          <w:sz w:val="22"/>
+          <w:szCs w:val="22"/>
+        </w:rPr>
+        <w:t xml:space="preserve"> Backend en FastAPI y UI Angular 18 empaquetados y configurables.</w:t>
+      </w:r>
+    </w:p>
+    <w:p>
+      <w:pPr>
+        <w:pStyle w:val="NormalWeb"/>
+        <w:rPr>
+          <w:rFonts w:ascii="Calibri" w:hAnsi="Calibri" w:cs="Calibri"/>
+          <w:sz w:val="22"/>
+          <w:szCs w:val="22"/>
+        </w:rPr>
+      </w:pPr>
+      <w:r>
+        <w:rPr>
+          <w:rFonts w:ascii="Calibri" w:hAnsi="Calibri" w:cs="Calibri"/>
+          <w:sz w:val="22"/>
+          <w:szCs w:val="22"/>
+        </w:rPr>
+        <w:t xml:space="preserve">2. </w:t>
+      </w:r>
+      <w:r>
+        <w:rPr>
+          <w:rStyle w:val="Fuerte"/>
+          <w:rFonts w:ascii="Calibri" w:hAnsi="Calibri" w:cs="Calibri"/>
+          <w:sz w:val="22"/>
+          <w:szCs w:val="22"/>
+        </w:rPr>
+        <w:t>Archivos de Auditoría Forense:</w:t>
+      </w:r>
+      <w:r>
+        <w:rPr>
+          <w:rFonts w:ascii="Calibri" w:hAnsi="Calibri" w:cs="Calibri"/>
+          <w:sz w:val="22"/>
+          <w:szCs w:val="22"/>
+        </w:rPr>
+        <w:t xml:space="preserve"> Colección exhaustiva de Reportes Técnicos (</w:t>
+      </w:r>
+      <w:r>
+        <w:rPr>
+          <w:rStyle w:val="CdigoHTML"/>
+        </w:rPr>
+        <w:t>REPORTE_TECNICO_ISSUE_59/60/61</w:t>
+      </w:r>
+      <w:r>
+        <w:rPr>
+          <w:rFonts w:ascii="Calibri" w:hAnsi="Calibri" w:cs="Calibri"/>
+          <w:sz w:val="22"/>
+          <w:szCs w:val="22"/>
+        </w:rPr>
+        <w:t>), *Root Cause Analysis* (</w:t>
+      </w:r>
+      <w:r>
+        <w:rPr>
+          <w:rStyle w:val="CdigoHTML"/>
+        </w:rPr>
+        <w:t>RCA_ISSUE_61</w:t>
+      </w:r>
+      <w:r>
+        <w:rPr>
+          <w:rFonts w:ascii="Calibri" w:hAnsi="Calibri" w:cs="Calibri"/>
+          <w:sz w:val="22"/>
+          <w:szCs w:val="22"/>
+        </w:rPr>
+        <w:t>, etc.), Planes de Implementación y Archivos de Cierre alojados inmutablemente en el directorio de documentación.</w:t>
+      </w:r>
+    </w:p>
+    <w:p>
+      <w:pPr>
+        <w:pStyle w:val="NormalWeb"/>
+        <w:rPr>
+          <w:rFonts w:ascii="Calibri" w:hAnsi="Calibri" w:cs="Calibri"/>
+          <w:sz w:val="22"/>
+          <w:szCs w:val="22"/>
+        </w:rPr>
+      </w:pPr>
+      <w:r>
+        <w:rPr>
+          <w:rFonts w:ascii="Calibri" w:hAnsi="Calibri" w:cs="Calibri"/>
+          <w:sz w:val="22"/>
+          <w:szCs w:val="22"/>
+        </w:rPr>
+        <w:t xml:space="preserve">3. </w:t>
+      </w:r>
+      <w:r>
+        <w:rPr>
+          <w:rStyle w:val="Fuerte"/>
+          <w:rFonts w:ascii="Calibri" w:hAnsi="Calibri" w:cs="Calibri"/>
+          <w:sz w:val="22"/>
+          <w:szCs w:val="22"/>
+        </w:rPr>
+        <w:t>Casos de Pruebas Automatizadas:</w:t>
+      </w:r>
+      <w:r>
+        <w:rPr>
+          <w:rFonts w:ascii="Calibri" w:hAnsi="Calibri" w:cs="Calibri"/>
+          <w:sz w:val="22"/>
+          <w:szCs w:val="22"/>
+        </w:rPr>
+        <w:t xml:space="preserve"> 100% de cobertura en flujos críticos (</w:t>
+      </w:r>
+      <w:r>
+        <w:rPr>
+          <w:rStyle w:val="CdigoHTML"/>
+        </w:rPr>
+        <w:t>test_imss_client.py</w:t>
+      </w:r>
+      <w:r>
+        <w:rPr>
+          <w:rFonts w:ascii="Calibri" w:hAnsi="Calibri" w:cs="Calibri"/>
+          <w:sz w:val="22"/>
+          <w:szCs w:val="22"/>
+        </w:rPr>
+        <w:t xml:space="preserve">, </w:t>
+      </w:r>
+      <w:r>
+        <w:rPr>
+          <w:rStyle w:val="CdigoHTML"/>
+        </w:rPr>
+        <w:t>test_schema.py</w:t>
+      </w:r>
+      <w:r>
+        <w:rPr>
+          <w:rFonts w:ascii="Calibri" w:hAnsi="Calibri" w:cs="Calibri"/>
+          <w:sz w:val="22"/>
+          <w:szCs w:val="22"/>
+        </w:rPr>
+        <w:t>) e integraciones Cypress funcionales (</w:t>
+      </w:r>
+      <w:r>
+        <w:rPr>
+          <w:rStyle w:val="CdigoHTML"/>
+        </w:rPr>
+        <w:t>imss-integration.cy.ts</w:t>
+      </w:r>
+      <w:r>
+        <w:rPr>
+          <w:rFonts w:ascii="Calibri" w:hAnsi="Calibri" w:cs="Calibri"/>
           <w:sz w:val="22"/>
           <w:szCs w:val="22"/>
         </w:rPr>
@@ -573,7 +2167,42 @@
           <w:sz w:val="22"/>
           <w:szCs w:val="22"/>
         </w:rPr>
-        <w:t>Con la entrega de estos artefactos, el consultor certifica que el conocimiento, las metodologías de seguridad implementadas y la línea base del proyecto Vida Saludable quedan satisfactoriamente transferidos.</w:t>
+        <w:t xml:space="preserve">4. </w:t>
+      </w:r>
+      <w:r>
+        <w:rPr>
+          <w:rStyle w:val="Fuerte"/>
+          <w:rFonts w:ascii="Calibri" w:hAnsi="Calibri" w:cs="Calibri"/>
+          <w:sz w:val="22"/>
+          <w:szCs w:val="22"/>
+        </w:rPr>
+        <w:t>Histórico y Matrices Institucionales:</w:t>
+      </w:r>
+      <w:r>
+        <w:rPr>
+          <w:rFonts w:ascii="Calibri" w:hAnsi="Calibri" w:cs="Calibri"/>
+          <w:sz w:val="22"/>
+          <w:szCs w:val="22"/>
+        </w:rPr>
+        <w:t xml:space="preserve"> Se anexan el *Inventario Técnico del Repositorio* (2026-04-17), *Bitácora del Proyecto* y *Checklist de Auditoría* validando el apego gubernamental normativo.</w:t>
+      </w:r>
+    </w:p>
+    <w:p>
+      <w:pPr>
+        <w:pStyle w:val="NormalWeb"/>
+        <w:rPr>
+          <w:rFonts w:ascii="Calibri" w:hAnsi="Calibri" w:cs="Calibri"/>
+          <w:sz w:val="22"/>
+          <w:szCs w:val="22"/>
+        </w:rPr>
+      </w:pPr>
+      <w:r>
+        <w:rPr>
+          <w:rFonts w:ascii="Calibri" w:hAnsi="Calibri" w:cs="Calibri"/>
+          <w:sz w:val="22"/>
+          <w:szCs w:val="22"/>
+        </w:rPr>
+        <w:t>Con esta declaratoria final, se hace oficial la conclusión operativa y el traspaso exitoso de responsabilidades sobre el ecosistema Vida Saludable (Fase 2).</w:t>
       </w:r>
     </w:p>
     <w:sectPr>
@@ -589,9 +2218,9 @@
 <file path=word/numbering.xml><?xml version="1.0" encoding="utf-8"?>
 <w:numbering xmlns:wpc="http://schemas.microsoft.com/office/word/2010/wordprocessingCanvas" xmlns:cx="http://schemas.microsoft.com/office/drawing/2014/chartex" xmlns:cx1="http://schemas.microsoft.com/office/drawing/2015/9/8/chartex" xmlns:cx2="http://schemas.microsoft.com/office/drawing/2015/10/21/chartex" xmlns:cx3="http://schemas.microsoft.com/office/drawing/2016/5/9/chartex" xmlns:cx4="http://schemas.microsoft.com/office/drawing/2016/5/10/chartex" xmlns:cx5="http://schemas.microsoft.com/office/drawing/2016/5/11/chartex" xmlns:cx6="http://schemas.microsoft.com/office/drawing/2016/5/12/chartex" xmlns:cx7="http://schemas.microsoft.com/office/drawing/2016/5/13/chartex" xmlns:cx8="http://schemas.microsoft.com/office/drawing/2016/5/14/chartex" xmlns:mc="http://schemas.openxmlformats.org/markup-compatibility/2006" xmlns:aink="http://schemas.microsoft.com/office/drawing/2016/ink" xmlns:am3d="http://schemas.microsoft.com/office/drawing/2017/model3d" xmlns:o="urn:schemas-microsoft-com:office:office" xmlns:oel="http://schemas.microsoft.com/office/2019/extlst" xmlns:r="http://schemas.openxmlformats.org/officeDocument/2006/relationships" xmlns:m="http://schemas.openxmlformats.org/officeDocument/2006/math" xmlns:v="urn:schemas-microsoft-com:vml" xmlns:wp14="http://schemas.microsoft.com/office/word/2010/wordprocessingDrawing" xmlns:wp="http://schemas.openxmlformats.org/drawingml/2006/wordprocessingDrawing" xmlns:w10="urn:schemas-microsoft-com:office:word" xmlns:w="http://schemas.openxmlformats.org/wordprocessingml/2006/main" xmlns:w14="http://schemas.microsoft.com/office/word/2010/wordml" xmlns:w15="http://schemas.microsoft.com/office/word/2012/wordml" xmlns:w16cex="http://schemas.microsoft.com/office/word/2018/wordml/cex" xmlns:w16cid="http://schemas.microsoft.com/office/word/2016/wordml/cid" xmlns:w16="http://schemas.microsoft.com/office/word/2018/wordml" xmlns:w16du="http://schemas.microsoft.com/office/word/2023/wordml/word16du" xmlns:w16sdtdh="http://schemas.microsoft.com/office/word/2020/wordml/sdtdatahash" xmlns:w16sdtfl="http://schemas.microsoft.com/office/word/2024/wordml/sdtformatlock" xmlns:w16se="http://schemas.microsoft.com/office/word/2015/wordml/symex" xmlns:wpg="http://schemas.microsoft.com/office/word/2010/wordprocessingGroup" xmlns:wpi="http://schemas.microsoft.com/office/word/2010/wordprocessingInk" xmlns:wne="http://schemas.microsoft.com/office/word/2006/wordml" xmlns:wps="http://schemas.microsoft.com/office/word/2010/wordprocessingShape" mc:Ignorable="w14 w15 w16se w16cid w16 w16cex w16sdtdh w16sdtfl w16du wp14">
   <w:abstractNum w:abstractNumId="0" w15:restartNumberingAfterBreak="0">
-    <w:nsid w:val="2C3C3DE5"/>
+    <w:nsid w:val="4A7C30EF"/>
     <w:multiLevelType w:val="multilevel"/>
-    <w:tmpl w:val="5080CAD0"/>
+    <w:tmpl w:val="E0328330"/>
     <w:lvl w:ilvl="0">
       <w:start w:val="1"/>
       <w:numFmt w:val="bullet"/>
@@ -738,9 +2367,9 @@
     </w:lvl>
   </w:abstractNum>
   <w:abstractNum w:abstractNumId="1" w15:restartNumberingAfterBreak="0">
-    <w:nsid w:val="6FA0206E"/>
+    <w:nsid w:val="5CA43E40"/>
     <w:multiLevelType w:val="multilevel"/>
-    <w:tmpl w:val="3A1823EC"/>
+    <w:tmpl w:val="C7488984"/>
     <w:lvl w:ilvl="0">
       <w:start w:val="1"/>
       <w:numFmt w:val="bullet"/>
@@ -886,11 +2515,315 @@
       </w:rPr>
     </w:lvl>
   </w:abstractNum>
-  <w:num w:numId="1" w16cid:durableId="1040931937">
+  <w:abstractNum w:abstractNumId="2" w15:restartNumberingAfterBreak="0">
+    <w:nsid w:val="6AA45369"/>
+    <w:multiLevelType w:val="multilevel"/>
+    <w:tmpl w:val="4A3C6C64"/>
+    <w:lvl w:ilvl="0">
+      <w:start w:val="1"/>
+      <w:numFmt w:val="bullet"/>
+      <w:lvlText w:val=""/>
+      <w:lvlJc w:val="left"/>
+      <w:pPr>
+        <w:tabs>
+          <w:tab w:val="num" w:pos="720"/>
+        </w:tabs>
+        <w:ind w:left="720" w:hanging="360"/>
+      </w:pPr>
+      <w:rPr>
+        <w:rFonts w:ascii="Symbol" w:hAnsi="Symbol" w:hint="default"/>
+        <w:sz w:val="20"/>
+      </w:rPr>
+    </w:lvl>
+    <w:lvl w:ilvl="1" w:tentative="1">
+      <w:start w:val="1"/>
+      <w:numFmt w:val="bullet"/>
+      <w:lvlText w:val="o"/>
+      <w:lvlJc w:val="left"/>
+      <w:pPr>
+        <w:tabs>
+          <w:tab w:val="num" w:pos="1440"/>
+        </w:tabs>
+        <w:ind w:left="1440" w:hanging="360"/>
+      </w:pPr>
+      <w:rPr>
+        <w:rFonts w:ascii="Courier New" w:hAnsi="Courier New" w:hint="default"/>
+        <w:sz w:val="20"/>
+      </w:rPr>
+    </w:lvl>
+    <w:lvl w:ilvl="2" w:tentative="1">
+      <w:start w:val="1"/>
+      <w:numFmt w:val="bullet"/>
+      <w:lvlText w:val=""/>
+      <w:lvlJc w:val="left"/>
+      <w:pPr>
+        <w:tabs>
+          <w:tab w:val="num" w:pos="2160"/>
+        </w:tabs>
+        <w:ind w:left="2160" w:hanging="360"/>
+      </w:pPr>
+      <w:rPr>
+        <w:rFonts w:ascii="Wingdings" w:hAnsi="Wingdings" w:hint="default"/>
+        <w:sz w:val="20"/>
+      </w:rPr>
+    </w:lvl>
+    <w:lvl w:ilvl="3" w:tentative="1">
+      <w:start w:val="1"/>
+      <w:numFmt w:val="bullet"/>
+      <w:lvlText w:val=""/>
+      <w:lvlJc w:val="left"/>
+      <w:pPr>
+        <w:tabs>
+          <w:tab w:val="num" w:pos="2880"/>
+        </w:tabs>
+        <w:ind w:left="2880" w:hanging="360"/>
+      </w:pPr>
+      <w:rPr>
+        <w:rFonts w:ascii="Wingdings" w:hAnsi="Wingdings" w:hint="default"/>
+        <w:sz w:val="20"/>
+      </w:rPr>
+    </w:lvl>
+    <w:lvl w:ilvl="4" w:tentative="1">
+      <w:start w:val="1"/>
+      <w:numFmt w:val="bullet"/>
+      <w:lvlText w:val=""/>
+      <w:lvlJc w:val="left"/>
+      <w:pPr>
+        <w:tabs>
+          <w:tab w:val="num" w:pos="3600"/>
+        </w:tabs>
+        <w:ind w:left="3600" w:hanging="360"/>
+      </w:pPr>
+      <w:rPr>
+        <w:rFonts w:ascii="Wingdings" w:hAnsi="Wingdings" w:hint="default"/>
+        <w:sz w:val="20"/>
+      </w:rPr>
+    </w:lvl>
+    <w:lvl w:ilvl="5" w:tentative="1">
+      <w:start w:val="1"/>
+      <w:numFmt w:val="bullet"/>
+      <w:lvlText w:val=""/>
+      <w:lvlJc w:val="left"/>
+      <w:pPr>
+        <w:tabs>
+          <w:tab w:val="num" w:pos="4320"/>
+        </w:tabs>
+        <w:ind w:left="4320" w:hanging="360"/>
+      </w:pPr>
+      <w:rPr>
+        <w:rFonts w:ascii="Wingdings" w:hAnsi="Wingdings" w:hint="default"/>
+        <w:sz w:val="20"/>
+      </w:rPr>
+    </w:lvl>
+    <w:lvl w:ilvl="6" w:tentative="1">
+      <w:start w:val="1"/>
+      <w:numFmt w:val="bullet"/>
+      <w:lvlText w:val=""/>
+      <w:lvlJc w:val="left"/>
+      <w:pPr>
+        <w:tabs>
+          <w:tab w:val="num" w:pos="5040"/>
+        </w:tabs>
+        <w:ind w:left="5040" w:hanging="360"/>
+      </w:pPr>
+      <w:rPr>
+        <w:rFonts w:ascii="Wingdings" w:hAnsi="Wingdings" w:hint="default"/>
+        <w:sz w:val="20"/>
+      </w:rPr>
+    </w:lvl>
+    <w:lvl w:ilvl="7" w:tentative="1">
+      <w:start w:val="1"/>
+      <w:numFmt w:val="bullet"/>
+      <w:lvlText w:val=""/>
+      <w:lvlJc w:val="left"/>
+      <w:pPr>
+        <w:tabs>
+          <w:tab w:val="num" w:pos="5760"/>
+        </w:tabs>
+        <w:ind w:left="5760" w:hanging="360"/>
+      </w:pPr>
+      <w:rPr>
+        <w:rFonts w:ascii="Wingdings" w:hAnsi="Wingdings" w:hint="default"/>
+        <w:sz w:val="20"/>
+      </w:rPr>
+    </w:lvl>
+    <w:lvl w:ilvl="8" w:tentative="1">
+      <w:start w:val="1"/>
+      <w:numFmt w:val="bullet"/>
+      <w:lvlText w:val=""/>
+      <w:lvlJc w:val="left"/>
+      <w:pPr>
+        <w:tabs>
+          <w:tab w:val="num" w:pos="6480"/>
+        </w:tabs>
+        <w:ind w:left="6480" w:hanging="360"/>
+      </w:pPr>
+      <w:rPr>
+        <w:rFonts w:ascii="Wingdings" w:hAnsi="Wingdings" w:hint="default"/>
+        <w:sz w:val="20"/>
+      </w:rPr>
+    </w:lvl>
+  </w:abstractNum>
+  <w:abstractNum w:abstractNumId="3" w15:restartNumberingAfterBreak="0">
+    <w:nsid w:val="71190F2B"/>
+    <w:multiLevelType w:val="multilevel"/>
+    <w:tmpl w:val="43382D48"/>
+    <w:lvl w:ilvl="0">
+      <w:start w:val="1"/>
+      <w:numFmt w:val="bullet"/>
+      <w:lvlText w:val=""/>
+      <w:lvlJc w:val="left"/>
+      <w:pPr>
+        <w:tabs>
+          <w:tab w:val="num" w:pos="720"/>
+        </w:tabs>
+        <w:ind w:left="720" w:hanging="360"/>
+      </w:pPr>
+      <w:rPr>
+        <w:rFonts w:ascii="Symbol" w:hAnsi="Symbol" w:hint="default"/>
+        <w:sz w:val="20"/>
+      </w:rPr>
+    </w:lvl>
+    <w:lvl w:ilvl="1" w:tentative="1">
+      <w:start w:val="1"/>
+      <w:numFmt w:val="bullet"/>
+      <w:lvlText w:val="o"/>
+      <w:lvlJc w:val="left"/>
+      <w:pPr>
+        <w:tabs>
+          <w:tab w:val="num" w:pos="1440"/>
+        </w:tabs>
+        <w:ind w:left="1440" w:hanging="360"/>
+      </w:pPr>
+      <w:rPr>
+        <w:rFonts w:ascii="Courier New" w:hAnsi="Courier New" w:hint="default"/>
+        <w:sz w:val="20"/>
+      </w:rPr>
+    </w:lvl>
+    <w:lvl w:ilvl="2" w:tentative="1">
+      <w:start w:val="1"/>
+      <w:numFmt w:val="bullet"/>
+      <w:lvlText w:val=""/>
+      <w:lvlJc w:val="left"/>
+      <w:pPr>
+        <w:tabs>
+          <w:tab w:val="num" w:pos="2160"/>
+        </w:tabs>
+        <w:ind w:left="2160" w:hanging="360"/>
+      </w:pPr>
+      <w:rPr>
+        <w:rFonts w:ascii="Wingdings" w:hAnsi="Wingdings" w:hint="default"/>
+        <w:sz w:val="20"/>
+      </w:rPr>
+    </w:lvl>
+    <w:lvl w:ilvl="3" w:tentative="1">
+      <w:start w:val="1"/>
+      <w:numFmt w:val="bullet"/>
+      <w:lvlText w:val=""/>
+      <w:lvlJc w:val="left"/>
+      <w:pPr>
+        <w:tabs>
+          <w:tab w:val="num" w:pos="2880"/>
+        </w:tabs>
+        <w:ind w:left="2880" w:hanging="360"/>
+      </w:pPr>
+      <w:rPr>
+        <w:rFonts w:ascii="Wingdings" w:hAnsi="Wingdings" w:hint="default"/>
+        <w:sz w:val="20"/>
+      </w:rPr>
+    </w:lvl>
+    <w:lvl w:ilvl="4" w:tentative="1">
+      <w:start w:val="1"/>
+      <w:numFmt w:val="bullet"/>
+      <w:lvlText w:val=""/>
+      <w:lvlJc w:val="left"/>
+      <w:pPr>
+        <w:tabs>
+          <w:tab w:val="num" w:pos="3600"/>
+        </w:tabs>
+        <w:ind w:left="3600" w:hanging="360"/>
+      </w:pPr>
+      <w:rPr>
+        <w:rFonts w:ascii="Wingdings" w:hAnsi="Wingdings" w:hint="default"/>
+        <w:sz w:val="20"/>
+      </w:rPr>
+    </w:lvl>
+    <w:lvl w:ilvl="5" w:tentative="1">
+      <w:start w:val="1"/>
+      <w:numFmt w:val="bullet"/>
+      <w:lvlText w:val=""/>
+      <w:lvlJc w:val="left"/>
+      <w:pPr>
+        <w:tabs>
+          <w:tab w:val="num" w:pos="4320"/>
+        </w:tabs>
+        <w:ind w:left="4320" w:hanging="360"/>
+      </w:pPr>
+      <w:rPr>
+        <w:rFonts w:ascii="Wingdings" w:hAnsi="Wingdings" w:hint="default"/>
+        <w:sz w:val="20"/>
+      </w:rPr>
+    </w:lvl>
+    <w:lvl w:ilvl="6" w:tentative="1">
+      <w:start w:val="1"/>
+      <w:numFmt w:val="bullet"/>
+      <w:lvlText w:val=""/>
+      <w:lvlJc w:val="left"/>
+      <w:pPr>
+        <w:tabs>
+          <w:tab w:val="num" w:pos="5040"/>
+        </w:tabs>
+        <w:ind w:left="5040" w:hanging="360"/>
+      </w:pPr>
+      <w:rPr>
+        <w:rFonts w:ascii="Wingdings" w:hAnsi="Wingdings" w:hint="default"/>
+        <w:sz w:val="20"/>
+      </w:rPr>
+    </w:lvl>
+    <w:lvl w:ilvl="7" w:tentative="1">
+      <w:start w:val="1"/>
+      <w:numFmt w:val="bullet"/>
+      <w:lvlText w:val=""/>
+      <w:lvlJc w:val="left"/>
+      <w:pPr>
+        <w:tabs>
+          <w:tab w:val="num" w:pos="5760"/>
+        </w:tabs>
+        <w:ind w:left="5760" w:hanging="360"/>
+      </w:pPr>
+      <w:rPr>
+        <w:rFonts w:ascii="Wingdings" w:hAnsi="Wingdings" w:hint="default"/>
+        <w:sz w:val="20"/>
+      </w:rPr>
+    </w:lvl>
+    <w:lvl w:ilvl="8" w:tentative="1">
+      <w:start w:val="1"/>
+      <w:numFmt w:val="bullet"/>
+      <w:lvlText w:val=""/>
+      <w:lvlJc w:val="left"/>
+      <w:pPr>
+        <w:tabs>
+          <w:tab w:val="num" w:pos="6480"/>
+        </w:tabs>
+        <w:ind w:left="6480" w:hanging="360"/>
+      </w:pPr>
+      <w:rPr>
+        <w:rFonts w:ascii="Wingdings" w:hAnsi="Wingdings" w:hint="default"/>
+        <w:sz w:val="20"/>
+      </w:rPr>
+    </w:lvl>
+  </w:abstractNum>
+  <w:num w:numId="1" w16cid:durableId="1641837673">
+    <w:abstractNumId w:val="2"/>
+  </w:num>
+  <w:num w:numId="2" w16cid:durableId="402071165">
     <w:abstractNumId w:val="1"/>
   </w:num>
-  <w:num w:numId="2" w16cid:durableId="285552249">
+  <w:num w:numId="3" w16cid:durableId="640811343">
     <w:abstractNumId w:val="0"/>
+  </w:num>
+  <w:num w:numId="4" w16cid:durableId="1436945428">
+    <w:abstractNumId w:val="3"/>
   </w:num>
 </w:numbering>
 </file>

</xml_diff>